<commit_message>
Initialize relief supply project
This commit adds the initial C++ project scaffold for the Relief Supply Distribution System, including the main source file, Visual Studio project/solution metadata, and filters for the new file. It also updates the algorithm document and registers the project in the solution so the app can be opened and built in Visual Studio.
</commit_message>
<xml_diff>
--- a/Algorithm.docx
+++ b/Algorithm.docx
@@ -6,12 +6,14 @@
       <w:pPr>
         <w:jc w:val="center"/>
         <w:rPr>
+          <w:color w:val="auto"/>
           <w:sz w:val="48"/>
           <w:szCs w:val="48"/>
         </w:rPr>
       </w:pPr>
       <w:r>
         <w:rPr>
+          <w:color w:val="auto"/>
           <w:sz w:val="48"/>
           <w:szCs w:val="48"/>
         </w:rPr>
@@ -19,200 +21,394 @@
       </w:r>
     </w:p>
     <w:p>
+      <w:pPr>
+        <w:pStyle w:val="ListParagraph"/>
+        <w:numPr>
+          <w:ilvl w:val="0"/>
+          <w:numId w:val="1"/>
+        </w:numPr>
+        <w:rPr>
+          <w:rFonts w:ascii="system-ui" w:hAnsi="system-ui" w:eastAsia="system-ui" w:cs="system-ui"/>
+          <w:b w:val="0"/>
+          <w:bCs w:val="0"/>
+          <w:i w:val="0"/>
+          <w:iCs w:val="0"/>
+          <w:caps w:val="0"/>
+          <w:smallCaps w:val="0"/>
+          <w:noProof w:val="0"/>
+          <w:color w:val="auto"/>
+          <w:sz w:val="22"/>
+          <w:szCs w:val="22"/>
+          <w:lang w:val="en-US"/>
+        </w:rPr>
+      </w:pPr>
       <w:r>
-        <w:t xml:space="preserve">1. Trucks = 5, </w:t>
-      </w:r>
-      <w:proofErr w:type="spellStart"/>
-      <w:r>
-        <w:t>Supply_packs</w:t>
-      </w:r>
-      <w:proofErr w:type="spellEnd"/>
-      <w:r>
-        <w:t xml:space="preserve"> = 120</w:t>
+        <w:rPr>
+          <w:color w:val="auto"/>
+        </w:rPr>
+        <w:t>Start with 5 trucks and 120 supply packs as the resources available that can be used to provide relief.</w:t>
       </w:r>
     </w:p>
     <w:p>
+      <w:pPr>
+        <w:pStyle w:val="ListParagraph"/>
+        <w:numPr>
+          <w:ilvl w:val="0"/>
+          <w:numId w:val="1"/>
+        </w:numPr>
+        <w:rPr>
+          <w:rFonts w:ascii="system-ui" w:hAnsi="system-ui" w:eastAsia="system-ui" w:cs="system-ui"/>
+          <w:b w:val="0"/>
+          <w:bCs w:val="0"/>
+          <w:i w:val="0"/>
+          <w:iCs w:val="0"/>
+          <w:caps w:val="0"/>
+          <w:smallCaps w:val="0"/>
+          <w:noProof w:val="0"/>
+          <w:color w:val="auto"/>
+          <w:sz w:val="22"/>
+          <w:szCs w:val="22"/>
+          <w:lang w:val="en-US"/>
+        </w:rPr>
+      </w:pPr>
       <w:r>
-        <w:t>2. Output" Welcome to Relief Supply Distribution System. Would you like to update the inventory items available? (Default: 5 Trucks, 120 Supply Packs)?"</w:t>
+        <w:rPr>
+          <w:color w:val="auto"/>
+        </w:rPr>
+        <w:t xml:space="preserve">Output welcome </w:t>
+      </w:r>
+      <w:r>
+        <w:rPr>
+          <w:color w:val="auto"/>
+        </w:rPr>
+        <w:t xml:space="preserve">message </w:t>
+      </w:r>
+      <w:r>
+        <w:rPr>
+          <w:rFonts w:ascii="system-ui" w:hAnsi="system-ui" w:eastAsia="system-ui" w:cs="system-ui"/>
+          <w:b w:val="0"/>
+          <w:bCs w:val="0"/>
+          <w:i w:val="0"/>
+          <w:iCs w:val="0"/>
+          <w:caps w:val="0"/>
+          <w:smallCaps w:val="0"/>
+          <w:noProof w:val="0"/>
+          <w:color w:val="auto"/>
+          <w:sz w:val="22"/>
+          <w:szCs w:val="22"/>
+          <w:lang w:val="en-US"/>
+        </w:rPr>
+        <w:t xml:space="preserve"> “</w:t>
+      </w:r>
+      <w:r>
+        <w:rPr>
+          <w:rFonts w:ascii="system-ui" w:hAnsi="system-ui" w:eastAsia="system-ui" w:cs="system-ui"/>
+          <w:b w:val="0"/>
+          <w:bCs w:val="0"/>
+          <w:i w:val="0"/>
+          <w:iCs w:val="0"/>
+          <w:caps w:val="0"/>
+          <w:smallCaps w:val="0"/>
+          <w:noProof w:val="0"/>
+          <w:color w:val="auto"/>
+          <w:sz w:val="22"/>
+          <w:szCs w:val="22"/>
+          <w:lang w:val="en-US"/>
+        </w:rPr>
+        <w:t xml:space="preserve">Welcome to Relief Supply Distribution </w:t>
+      </w:r>
+      <w:r>
+        <w:rPr>
+          <w:rFonts w:ascii="system-ui" w:hAnsi="system-ui" w:eastAsia="system-ui" w:cs="system-ui"/>
+          <w:b w:val="0"/>
+          <w:bCs w:val="0"/>
+          <w:i w:val="0"/>
+          <w:iCs w:val="0"/>
+          <w:caps w:val="0"/>
+          <w:smallCaps w:val="0"/>
+          <w:noProof w:val="0"/>
+          <w:color w:val="auto"/>
+          <w:sz w:val="22"/>
+          <w:szCs w:val="22"/>
+          <w:lang w:val="en-US"/>
+        </w:rPr>
+        <w:t>System”</w:t>
       </w:r>
     </w:p>
     <w:p>
-      <w:r>
-        <w:t xml:space="preserve">3. input </w:t>
-      </w:r>
-      <w:proofErr w:type="spellStart"/>
-      <w:r>
-        <w:t>inventory_update</w:t>
-      </w:r>
-      <w:proofErr w:type="spellEnd"/>
-      <w:r>
-        <w:t xml:space="preserve"> y/n</w:t>
-      </w:r>
-    </w:p>
-    <w:p>
-      <w:r>
-        <w:t xml:space="preserve">4. if </w:t>
-      </w:r>
-      <w:proofErr w:type="spellStart"/>
-      <w:r>
-        <w:t>inventory_update</w:t>
-      </w:r>
-      <w:proofErr w:type="spellEnd"/>
-      <w:r>
-        <w:t xml:space="preserve"> = y or Y:</w:t>
-      </w:r>
-    </w:p>
-    <w:p>
-      <w:r>
-        <w:tab/>
-        <w:t xml:space="preserve">Input </w:t>
-      </w:r>
-      <w:proofErr w:type="gramStart"/>
-      <w:r>
-        <w:t>trucks ,</w:t>
-      </w:r>
-      <w:proofErr w:type="gramEnd"/>
-      <w:r>
-        <w:t xml:space="preserve"> </w:t>
-      </w:r>
-      <w:proofErr w:type="spellStart"/>
-      <w:r>
-        <w:t>supply_packs</w:t>
-      </w:r>
-      <w:proofErr w:type="spellEnd"/>
-    </w:p>
-    <w:p>
-      <w:r>
-        <w:t xml:space="preserve">5. </w:t>
-      </w:r>
-      <w:proofErr w:type="spellStart"/>
-      <w:r>
-        <w:t>Output:"Is</w:t>
-      </w:r>
-      <w:proofErr w:type="spellEnd"/>
-      <w:r>
-        <w:t xml:space="preserve"> there any new Natural Disaster (y/n)?"</w:t>
-      </w:r>
-    </w:p>
-    <w:p>
-      <w:r>
-        <w:t xml:space="preserve">6. input </w:t>
-      </w:r>
-      <w:proofErr w:type="spellStart"/>
-      <w:r>
-        <w:t>new_disaster</w:t>
-      </w:r>
-      <w:proofErr w:type="spellEnd"/>
-      <w:r>
-        <w:t xml:space="preserve"> y/n</w:t>
-      </w:r>
-    </w:p>
-    <w:p>
-      <w:r>
-        <w:t>7.</w:t>
-      </w:r>
-      <w:r>
-        <w:t xml:space="preserve"> </w:t>
-      </w:r>
-      <w:r>
-        <w:t xml:space="preserve">If </w:t>
-      </w:r>
-      <w:proofErr w:type="spellStart"/>
-      <w:r>
-        <w:t>new_disaster</w:t>
-      </w:r>
-      <w:proofErr w:type="spellEnd"/>
-      <w:r>
-        <w:t xml:space="preserve"> = y:</w:t>
-      </w:r>
-    </w:p>
-    <w:p>
-      <w:r>
-        <w:tab/>
-        <w:t>Get the details of the disaster: place,</w:t>
-      </w:r>
-      <w:r>
-        <w:t xml:space="preserve"> </w:t>
-      </w:r>
-      <w:r>
-        <w:t>radius or diameter of affected region,</w:t>
-      </w:r>
-      <w:r>
-        <w:t xml:space="preserve"> damage level, families affected, </w:t>
-      </w:r>
-      <w:r>
-        <w:t>access route,</w:t>
-      </w:r>
-      <w:r>
-        <w:t xml:space="preserve"> Medical Need, </w:t>
-      </w:r>
-      <w:proofErr w:type="spellStart"/>
-      <w:proofErr w:type="gramStart"/>
-      <w:r>
-        <w:t>After</w:t>
-      </w:r>
-      <w:proofErr w:type="gramEnd"/>
-      <w:r>
-        <w:t xml:space="preserve"> shocks</w:t>
-      </w:r>
-      <w:proofErr w:type="spellEnd"/>
-      <w:r>
-        <w:t xml:space="preserve"> (in case of earthquake), </w:t>
-      </w:r>
-      <w:r>
-        <w:t xml:space="preserve">Previous Aid Received, </w:t>
-      </w:r>
-    </w:p>
-    <w:p>
-      <w:r>
-        <w:tab/>
-        <w:t>Else: End Program.</w:t>
-      </w:r>
-    </w:p>
-    <w:p>
-      <w:r>
-        <w:t xml:space="preserve">8. </w:t>
-      </w:r>
-      <w:r>
-        <w:t xml:space="preserve"> </w:t>
-      </w:r>
-      <w:r>
-        <w:t xml:space="preserve">Calculate the </w:t>
-      </w:r>
-      <w:r>
-        <w:t xml:space="preserve">priority of sending aid, severity of situation and the </w:t>
-      </w:r>
-      <w:r>
-        <w:t>amount of aid</w:t>
-      </w:r>
-      <w:r>
-        <w:t xml:space="preserve"> </w:t>
-      </w:r>
-      <w:r>
-        <w:t>(trucks / supply packs to be sent.)</w:t>
-      </w:r>
-    </w:p>
-    <w:p>
-      <w:r>
-        <w:t>9. Give the best solution with minimum deaths.</w:t>
-      </w:r>
+      <w:pPr>
+        <w:pStyle w:val="ListParagraph"/>
+        <w:numPr>
+          <w:ilvl w:val="0"/>
+          <w:numId w:val="1"/>
+        </w:numPr>
+        <w:rPr>
+          <w:rFonts w:ascii="system-ui" w:hAnsi="system-ui" w:eastAsia="system-ui" w:cs="system-ui"/>
+          <w:b w:val="0"/>
+          <w:bCs w:val="0"/>
+          <w:i w:val="0"/>
+          <w:iCs w:val="0"/>
+          <w:caps w:val="0"/>
+          <w:smallCaps w:val="0"/>
+          <w:noProof w:val="0"/>
+          <w:color w:val="auto"/>
+          <w:sz w:val="22"/>
+          <w:szCs w:val="22"/>
+          <w:lang w:val="en-US"/>
+        </w:rPr>
+      </w:pPr>
     </w:p>
     <w:sectPr>
-      <w:pgSz w:w="12240" w:h="15840"/>
+      <w:pgSz w:w="12240" w:h="15840" w:orient="portrait"/>
       <w:pgMar w:top="1440" w:right="1440" w:bottom="1440" w:left="1440" w:header="720" w:footer="720" w:gutter="0"/>
       <w:cols w:space="720"/>
       <w:docGrid w:linePitch="360"/>
+      <w:headerReference w:type="default" r:id="R59eb02f8f85b4052"/>
+      <w:footerReference w:type="default" r:id="R78e87118ea3244d3"/>
     </w:sectPr>
   </w:body>
 </w:document>
 </file>
 
+<file path=word/footer.xml><?xml version="1.0" encoding="utf-8"?>
+<w:ftr xmlns:w14="http://schemas.microsoft.com/office/word/2010/wordml" xmlns:w="http://schemas.openxmlformats.org/wordprocessingml/2006/main">
+  <w:tbl>
+    <w:tblPr>
+      <w:tblStyle w:val="TableNormal"/>
+      <w:bidiVisual w:val="0"/>
+      <w:tblW w:w="0" w:type="auto"/>
+      <w:tblLook w:val="06A0" w:firstRow="1" w:lastRow="0" w:firstColumn="1" w:lastColumn="0" w:noHBand="1" w:noVBand="1"/>
+    </w:tblPr>
+    <w:tblGrid>
+      <w:gridCol w:w="3120"/>
+      <w:gridCol w:w="3120"/>
+      <w:gridCol w:w="3120"/>
+    </w:tblGrid>
+    <w:tr>
+      <w:trPr>
+        <w:trHeight w:val="300"/>
+      </w:trPr>
+      <w:tc>
+        <w:tcPr>
+          <w:tcW w:w="3120" w:type="dxa"/>
+          <w:tcMar/>
+        </w:tcPr>
+        <w:p>
+          <w:pPr>
+            <w:pStyle w:val="Header"/>
+            <w:bidi w:val="0"/>
+            <w:ind w:left="-115"/>
+            <w:jc w:val="left"/>
+          </w:pPr>
+        </w:p>
+      </w:tc>
+      <w:tc>
+        <w:tcPr>
+          <w:tcW w:w="3120" w:type="dxa"/>
+          <w:tcMar/>
+        </w:tcPr>
+        <w:p>
+          <w:pPr>
+            <w:pStyle w:val="Header"/>
+            <w:bidi w:val="0"/>
+            <w:jc w:val="center"/>
+          </w:pPr>
+        </w:p>
+      </w:tc>
+      <w:tc>
+        <w:tcPr>
+          <w:tcW w:w="3120" w:type="dxa"/>
+          <w:tcMar/>
+        </w:tcPr>
+        <w:p>
+          <w:pPr>
+            <w:pStyle w:val="Header"/>
+            <w:bidi w:val="0"/>
+            <w:ind w:right="-115"/>
+            <w:jc w:val="right"/>
+          </w:pPr>
+        </w:p>
+      </w:tc>
+    </w:tr>
+  </w:tbl>
+  <w:p>
+    <w:pPr>
+      <w:pStyle w:val="Footer"/>
+      <w:bidi w:val="0"/>
+    </w:pPr>
+  </w:p>
+</w:ftr>
+</file>
+
+<file path=word/header.xml><?xml version="1.0" encoding="utf-8"?>
+<w:hdr xmlns:w14="http://schemas.microsoft.com/office/word/2010/wordml" xmlns:w="http://schemas.openxmlformats.org/wordprocessingml/2006/main">
+  <w:tbl>
+    <w:tblPr>
+      <w:tblStyle w:val="TableNormal"/>
+      <w:bidiVisual w:val="0"/>
+      <w:tblW w:w="0" w:type="auto"/>
+      <w:tblLook w:val="06A0" w:firstRow="1" w:lastRow="0" w:firstColumn="1" w:lastColumn="0" w:noHBand="1" w:noVBand="1"/>
+    </w:tblPr>
+    <w:tblGrid>
+      <w:gridCol w:w="3120"/>
+      <w:gridCol w:w="3120"/>
+      <w:gridCol w:w="3120"/>
+    </w:tblGrid>
+    <w:tr>
+      <w:trPr>
+        <w:trHeight w:val="300"/>
+      </w:trPr>
+      <w:tc>
+        <w:tcPr>
+          <w:tcW w:w="3120" w:type="dxa"/>
+          <w:tcMar/>
+        </w:tcPr>
+        <w:p>
+          <w:pPr>
+            <w:pStyle w:val="Header"/>
+            <w:bidi w:val="0"/>
+            <w:ind w:left="-115"/>
+            <w:jc w:val="left"/>
+          </w:pPr>
+        </w:p>
+      </w:tc>
+      <w:tc>
+        <w:tcPr>
+          <w:tcW w:w="3120" w:type="dxa"/>
+          <w:tcMar/>
+        </w:tcPr>
+        <w:p>
+          <w:pPr>
+            <w:pStyle w:val="Header"/>
+            <w:bidi w:val="0"/>
+            <w:jc w:val="center"/>
+          </w:pPr>
+        </w:p>
+      </w:tc>
+      <w:tc>
+        <w:tcPr>
+          <w:tcW w:w="3120" w:type="dxa"/>
+          <w:tcMar/>
+        </w:tcPr>
+        <w:p>
+          <w:pPr>
+            <w:pStyle w:val="Header"/>
+            <w:bidi w:val="0"/>
+            <w:ind w:right="-115"/>
+            <w:jc w:val="right"/>
+          </w:pPr>
+        </w:p>
+      </w:tc>
+    </w:tr>
+  </w:tbl>
+  <w:p>
+    <w:pPr>
+      <w:pStyle w:val="Header"/>
+      <w:bidi w:val="0"/>
+    </w:pPr>
+  </w:p>
+</w:hdr>
+</file>
+
+<file path=word/numbering.xml><?xml version="1.0" encoding="utf-8"?>
+<w:numbering xmlns:w="http://schemas.openxmlformats.org/wordprocessingml/2006/main">
+  <w:abstractNum xmlns:w="http://schemas.openxmlformats.org/wordprocessingml/2006/main" w:abstractNumId="1">
+    <w:nsid w:val="6defc954"/>
+    <w:multiLevelType xmlns:w="http://schemas.openxmlformats.org/wordprocessingml/2006/main" w:val="hybridMultilevel"/>
+    <w:lvl xmlns:w="http://schemas.openxmlformats.org/wordprocessingml/2006/main" w:ilvl="0">
+      <w:start w:val="1"/>
+      <w:numFmt w:val="decimal"/>
+      <w:lvlText w:val="%1."/>
+      <w:lvlJc w:val="left"/>
+      <w:pPr>
+        <w:ind w:left="720" w:hanging="360"/>
+      </w:pPr>
+    </w:lvl>
+    <w:lvl xmlns:w="http://schemas.openxmlformats.org/wordprocessingml/2006/main" w:ilvl="1">
+      <w:start w:val="1"/>
+      <w:numFmt w:val="lowerLetter"/>
+      <w:lvlText w:val="%2."/>
+      <w:lvlJc w:val="left"/>
+      <w:pPr>
+        <w:ind w:left="1440" w:hanging="360"/>
+      </w:pPr>
+    </w:lvl>
+    <w:lvl xmlns:w="http://schemas.openxmlformats.org/wordprocessingml/2006/main" w:ilvl="2">
+      <w:start w:val="1"/>
+      <w:numFmt w:val="lowerRoman"/>
+      <w:lvlText w:val="%3."/>
+      <w:lvlJc w:val="right"/>
+      <w:pPr>
+        <w:ind w:left="2160" w:hanging="180"/>
+      </w:pPr>
+    </w:lvl>
+    <w:lvl xmlns:w="http://schemas.openxmlformats.org/wordprocessingml/2006/main" w:ilvl="3">
+      <w:start w:val="1"/>
+      <w:numFmt w:val="decimal"/>
+      <w:lvlText w:val="%4."/>
+      <w:lvlJc w:val="left"/>
+      <w:pPr>
+        <w:ind w:left="2880" w:hanging="360"/>
+      </w:pPr>
+    </w:lvl>
+    <w:lvl xmlns:w="http://schemas.openxmlformats.org/wordprocessingml/2006/main" w:ilvl="4">
+      <w:start w:val="1"/>
+      <w:numFmt w:val="lowerLetter"/>
+      <w:lvlText w:val="%5."/>
+      <w:lvlJc w:val="left"/>
+      <w:pPr>
+        <w:ind w:left="3600" w:hanging="360"/>
+      </w:pPr>
+    </w:lvl>
+    <w:lvl xmlns:w="http://schemas.openxmlformats.org/wordprocessingml/2006/main" w:ilvl="5">
+      <w:start w:val="1"/>
+      <w:numFmt w:val="lowerRoman"/>
+      <w:lvlText w:val="%6."/>
+      <w:lvlJc w:val="right"/>
+      <w:pPr>
+        <w:ind w:left="4320" w:hanging="180"/>
+      </w:pPr>
+    </w:lvl>
+    <w:lvl xmlns:w="http://schemas.openxmlformats.org/wordprocessingml/2006/main" w:ilvl="6">
+      <w:start w:val="1"/>
+      <w:numFmt w:val="decimal"/>
+      <w:lvlText w:val="%7."/>
+      <w:lvlJc w:val="left"/>
+      <w:pPr>
+        <w:ind w:left="5040" w:hanging="360"/>
+      </w:pPr>
+    </w:lvl>
+    <w:lvl xmlns:w="http://schemas.openxmlformats.org/wordprocessingml/2006/main" w:ilvl="7">
+      <w:start w:val="1"/>
+      <w:numFmt w:val="lowerLetter"/>
+      <w:lvlText w:val="%8."/>
+      <w:lvlJc w:val="left"/>
+      <w:pPr>
+        <w:ind w:left="5760" w:hanging="360"/>
+      </w:pPr>
+    </w:lvl>
+    <w:lvl xmlns:w="http://schemas.openxmlformats.org/wordprocessingml/2006/main" w:ilvl="8">
+      <w:start w:val="1"/>
+      <w:numFmt w:val="lowerRoman"/>
+      <w:lvlText w:val="%9."/>
+      <w:lvlJc w:val="right"/>
+      <w:pPr>
+        <w:ind w:left="6480" w:hanging="180"/>
+      </w:pPr>
+    </w:lvl>
+  </w:abstractNum>
+  <w:num w:numId="1">
+    <w:abstractNumId w:val="1"/>
+  </w:num>
+</w:numbering>
+</file>
+
 <file path=word/styles.xml><?xml version="1.0" encoding="utf-8"?>
-<w:styles xmlns:mc="http://schemas.openxmlformats.org/markup-compatibility/2006" xmlns:r="http://schemas.openxmlformats.org/officeDocument/2006/relationships" xmlns:w="http://schemas.openxmlformats.org/wordprocessingml/2006/main" xmlns:w14="http://schemas.microsoft.com/office/word/2010/wordml" xmlns:w15="http://schemas.microsoft.com/office/word/2012/wordml" xmlns:w16cex="http://schemas.microsoft.com/office/word/2018/wordml/cex" xmlns:w16cid="http://schemas.microsoft.com/office/word/2016/wordml/cid" xmlns:w16="http://schemas.microsoft.com/office/word/2018/wordml" xmlns:w16sdtdh="http://schemas.microsoft.com/office/word/2020/wordml/sdtdatahash" xmlns:w16se="http://schemas.microsoft.com/office/word/2015/wordml/symex" mc:Ignorable="w14 w15 w16se w16cid w16 w16cex w16sdtdh">
+<w:styles xmlns:wp14="http://schemas.microsoft.com/office/word/2010/wordprocessingDrawing" xmlns:mc="http://schemas.openxmlformats.org/markup-compatibility/2006" xmlns:r="http://schemas.openxmlformats.org/officeDocument/2006/relationships" xmlns:w="http://schemas.openxmlformats.org/wordprocessingml/2006/main" xmlns:w14="http://schemas.microsoft.com/office/word/2010/wordml" xmlns:w15="http://schemas.microsoft.com/office/word/2012/wordml" xmlns:w16cex="http://schemas.microsoft.com/office/word/2018/wordml/cex" xmlns:w16cid="http://schemas.microsoft.com/office/word/2016/wordml/cid" xmlns:w16="http://schemas.microsoft.com/office/word/2018/wordml" xmlns:w16sdtdh="http://schemas.microsoft.com/office/word/2020/wordml/sdtdatahash" xmlns:w16se="http://schemas.microsoft.com/office/word/2015/wordml/symex" mc:Ignorable="w14 w15 w16se w16cid w16 w16cex w16sdtdh wp14">
   <w:docDefaults>
     <w:rPrDefault>
       <w:rPr>
-        <w:rFonts w:asciiTheme="minorHAnsi" w:eastAsiaTheme="minorHAnsi" w:hAnsiTheme="minorHAnsi" w:cstheme="minorBidi"/>
+        <w:rFonts w:asciiTheme="minorHAnsi" w:hAnsiTheme="minorHAnsi" w:eastAsiaTheme="minorHAnsi" w:cstheme="minorBidi"/>
         <w:sz w:val="22"/>
         <w:szCs w:val="22"/>
         <w:lang w:val="en-US" w:eastAsia="en-US" w:bidi="ar-SA"/>
@@ -227,14 +423,14 @@
   <w:latentStyles w:defLockedState="0" w:defUIPriority="99" w:defSemiHidden="0" w:defUnhideWhenUsed="0" w:defQFormat="0" w:count="376">
     <w:lsdException w:name="Normal" w:uiPriority="0" w:qFormat="1"/>
     <w:lsdException w:name="heading 1" w:uiPriority="9" w:qFormat="1"/>
-    <w:lsdException w:name="heading 2" w:semiHidden="1" w:uiPriority="9" w:unhideWhenUsed="1" w:qFormat="1"/>
-    <w:lsdException w:name="heading 3" w:semiHidden="1" w:uiPriority="9" w:unhideWhenUsed="1" w:qFormat="1"/>
-    <w:lsdException w:name="heading 4" w:semiHidden="1" w:uiPriority="9" w:unhideWhenUsed="1" w:qFormat="1"/>
-    <w:lsdException w:name="heading 5" w:semiHidden="1" w:uiPriority="9" w:unhideWhenUsed="1" w:qFormat="1"/>
-    <w:lsdException w:name="heading 6" w:semiHidden="1" w:uiPriority="9" w:unhideWhenUsed="1" w:qFormat="1"/>
-    <w:lsdException w:name="heading 7" w:semiHidden="1" w:uiPriority="9" w:unhideWhenUsed="1" w:qFormat="1"/>
-    <w:lsdException w:name="heading 8" w:semiHidden="1" w:uiPriority="9" w:unhideWhenUsed="1" w:qFormat="1"/>
-    <w:lsdException w:name="heading 9" w:semiHidden="1" w:uiPriority="9" w:unhideWhenUsed="1" w:qFormat="1"/>
+    <w:lsdException w:name="heading 2" w:uiPriority="9" w:semiHidden="1" w:unhideWhenUsed="1" w:qFormat="1"/>
+    <w:lsdException w:name="heading 3" w:uiPriority="9" w:semiHidden="1" w:unhideWhenUsed="1" w:qFormat="1"/>
+    <w:lsdException w:name="heading 4" w:uiPriority="9" w:semiHidden="1" w:unhideWhenUsed="1" w:qFormat="1"/>
+    <w:lsdException w:name="heading 5" w:uiPriority="9" w:semiHidden="1" w:unhideWhenUsed="1" w:qFormat="1"/>
+    <w:lsdException w:name="heading 6" w:uiPriority="9" w:semiHidden="1" w:unhideWhenUsed="1" w:qFormat="1"/>
+    <w:lsdException w:name="heading 7" w:uiPriority="9" w:semiHidden="1" w:unhideWhenUsed="1" w:qFormat="1"/>
+    <w:lsdException w:name="heading 8" w:uiPriority="9" w:semiHidden="1" w:unhideWhenUsed="1" w:qFormat="1"/>
+    <w:lsdException w:name="heading 9" w:uiPriority="9" w:semiHidden="1" w:unhideWhenUsed="1" w:qFormat="1"/>
     <w:lsdException w:name="index 1" w:semiHidden="1" w:unhideWhenUsed="1"/>
     <w:lsdException w:name="index 2" w:semiHidden="1" w:unhideWhenUsed="1"/>
     <w:lsdException w:name="index 3" w:semiHidden="1" w:unhideWhenUsed="1"/>
@@ -244,22 +440,22 @@
     <w:lsdException w:name="index 7" w:semiHidden="1" w:unhideWhenUsed="1"/>
     <w:lsdException w:name="index 8" w:semiHidden="1" w:unhideWhenUsed="1"/>
     <w:lsdException w:name="index 9" w:semiHidden="1" w:unhideWhenUsed="1"/>
-    <w:lsdException w:name="toc 1" w:semiHidden="1" w:uiPriority="39" w:unhideWhenUsed="1"/>
-    <w:lsdException w:name="toc 2" w:semiHidden="1" w:uiPriority="39" w:unhideWhenUsed="1"/>
-    <w:lsdException w:name="toc 3" w:semiHidden="1" w:uiPriority="39" w:unhideWhenUsed="1"/>
-    <w:lsdException w:name="toc 4" w:semiHidden="1" w:uiPriority="39" w:unhideWhenUsed="1"/>
-    <w:lsdException w:name="toc 5" w:semiHidden="1" w:uiPriority="39" w:unhideWhenUsed="1"/>
-    <w:lsdException w:name="toc 6" w:semiHidden="1" w:uiPriority="39" w:unhideWhenUsed="1"/>
-    <w:lsdException w:name="toc 7" w:semiHidden="1" w:uiPriority="39" w:unhideWhenUsed="1"/>
-    <w:lsdException w:name="toc 8" w:semiHidden="1" w:uiPriority="39" w:unhideWhenUsed="1"/>
-    <w:lsdException w:name="toc 9" w:semiHidden="1" w:uiPriority="39" w:unhideWhenUsed="1"/>
+    <w:lsdException w:name="toc 1" w:uiPriority="39" w:semiHidden="1" w:unhideWhenUsed="1"/>
+    <w:lsdException w:name="toc 2" w:uiPriority="39" w:semiHidden="1" w:unhideWhenUsed="1"/>
+    <w:lsdException w:name="toc 3" w:uiPriority="39" w:semiHidden="1" w:unhideWhenUsed="1"/>
+    <w:lsdException w:name="toc 4" w:uiPriority="39" w:semiHidden="1" w:unhideWhenUsed="1"/>
+    <w:lsdException w:name="toc 5" w:uiPriority="39" w:semiHidden="1" w:unhideWhenUsed="1"/>
+    <w:lsdException w:name="toc 6" w:uiPriority="39" w:semiHidden="1" w:unhideWhenUsed="1"/>
+    <w:lsdException w:name="toc 7" w:uiPriority="39" w:semiHidden="1" w:unhideWhenUsed="1"/>
+    <w:lsdException w:name="toc 8" w:uiPriority="39" w:semiHidden="1" w:unhideWhenUsed="1"/>
+    <w:lsdException w:name="toc 9" w:uiPriority="39" w:semiHidden="1" w:unhideWhenUsed="1"/>
     <w:lsdException w:name="Normal Indent" w:semiHidden="1" w:unhideWhenUsed="1"/>
     <w:lsdException w:name="footnote text" w:semiHidden="1" w:unhideWhenUsed="1"/>
     <w:lsdException w:name="annotation text" w:semiHidden="1" w:unhideWhenUsed="1"/>
     <w:lsdException w:name="header" w:semiHidden="1" w:unhideWhenUsed="1"/>
     <w:lsdException w:name="footer" w:semiHidden="1" w:unhideWhenUsed="1"/>
     <w:lsdException w:name="index heading" w:semiHidden="1" w:unhideWhenUsed="1"/>
-    <w:lsdException w:name="caption" w:semiHidden="1" w:uiPriority="35" w:unhideWhenUsed="1" w:qFormat="1"/>
+    <w:lsdException w:name="caption" w:uiPriority="35" w:semiHidden="1" w:unhideWhenUsed="1" w:qFormat="1"/>
     <w:lsdException w:name="table of figures" w:semiHidden="1" w:unhideWhenUsed="1"/>
     <w:lsdException w:name="envelope address" w:semiHidden="1" w:unhideWhenUsed="1"/>
     <w:lsdException w:name="envelope return" w:semiHidden="1" w:unhideWhenUsed="1"/>
@@ -290,7 +486,7 @@
     <w:lsdException w:name="Title" w:uiPriority="10" w:qFormat="1"/>
     <w:lsdException w:name="Closing" w:semiHidden="1" w:unhideWhenUsed="1"/>
     <w:lsdException w:name="Signature" w:semiHidden="1" w:unhideWhenUsed="1"/>
-    <w:lsdException w:name="Default Paragraph Font" w:semiHidden="1" w:uiPriority="1" w:unhideWhenUsed="1"/>
+    <w:lsdException w:name="Default Paragraph Font" w:uiPriority="1" w:semiHidden="1" w:unhideWhenUsed="1"/>
     <w:lsdException w:name="Body Text" w:semiHidden="1" w:unhideWhenUsed="1"/>
     <w:lsdException w:name="Body Text Indent" w:semiHidden="1" w:unhideWhenUsed="1"/>
     <w:lsdException w:name="List Continue" w:semiHidden="1" w:unhideWhenUsed="1"/>
@@ -490,8 +686,8 @@
     <w:lsdException w:name="Subtle Reference" w:uiPriority="31" w:qFormat="1"/>
     <w:lsdException w:name="Intense Reference" w:uiPriority="32" w:qFormat="1"/>
     <w:lsdException w:name="Book Title" w:uiPriority="33" w:qFormat="1"/>
-    <w:lsdException w:name="Bibliography" w:semiHidden="1" w:uiPriority="37" w:unhideWhenUsed="1"/>
-    <w:lsdException w:name="TOC Heading" w:semiHidden="1" w:uiPriority="39" w:unhideWhenUsed="1" w:qFormat="1"/>
+    <w:lsdException w:name="Bibliography" w:uiPriority="37" w:semiHidden="1" w:unhideWhenUsed="1"/>
+    <w:lsdException w:name="TOC Heading" w:uiPriority="39" w:semiHidden="1" w:unhideWhenUsed="1" w:qFormat="1"/>
     <w:lsdException w:name="Plain Table 1" w:uiPriority="41"/>
     <w:lsdException w:name="Plain Table 2" w:uiPriority="42"/>
     <w:lsdException w:name="Plain Table 3" w:uiPriority="43"/>
@@ -602,17 +798,17 @@
     <w:lsdException w:name="Unresolved Mention" w:semiHidden="1" w:unhideWhenUsed="1"/>
     <w:lsdException w:name="Smart Link" w:semiHidden="1" w:unhideWhenUsed="1"/>
   </w:latentStyles>
-  <w:style w:type="paragraph" w:default="1" w:styleId="Normal">
+  <w:style w:type="paragraph" w:styleId="Normal" w:default="1">
     <w:name w:val="Normal"/>
     <w:qFormat/>
   </w:style>
-  <w:style w:type="character" w:default="1" w:styleId="DefaultParagraphFont">
+  <w:style w:type="character" w:styleId="DefaultParagraphFont" w:default="1">
     <w:name w:val="Default Paragraph Font"/>
     <w:uiPriority w:val="1"/>
     <w:semiHidden/>
     <w:unhideWhenUsed/>
   </w:style>
-  <w:style w:type="table" w:default="1" w:styleId="TableNormal">
+  <w:style w:type="table" w:styleId="TableNormal" w:default="1">
     <w:name w:val="Normal Table"/>
     <w:uiPriority w:val="99"/>
     <w:semiHidden/>
@@ -627,17 +823,83 @@
       </w:tblCellMar>
     </w:tblPr>
   </w:style>
-  <w:style w:type="numbering" w:default="1" w:styleId="NoList">
+  <w:style w:type="numbering" w:styleId="NoList" w:default="1">
     <w:name w:val="No List"/>
     <w:uiPriority w:val="99"/>
     <w:semiHidden/>
     <w:unhideWhenUsed/>
   </w:style>
+  <w:style w:type="paragraph" w:styleId="ListParagraph">
+    <w:uiPriority w:val="34"/>
+    <w:name w:val="List Paragraph"/>
+    <w:basedOn w:val="Normal"/>
+    <w:qFormat/>
+    <w:rsid w:val="5624E32A"/>
+    <w:pPr>
+      <w:spacing/>
+      <w:ind w:left="720"/>
+      <w:contextualSpacing/>
+    </w:pPr>
+  </w:style>
+  <w:style w:type="paragraph" w:styleId="Header">
+    <w:uiPriority w:val="99"/>
+    <w:name w:val="header"/>
+    <w:basedOn w:val="Normal"/>
+    <w:unhideWhenUsed/>
+    <w:rsid w:val="5624E32A"/>
+    <w:pPr>
+      <w:tabs>
+        <w:tab w:val="center" w:leader="none" w:pos="4680"/>
+        <w:tab w:val="right" w:leader="none" w:pos="9360"/>
+      </w:tabs>
+      <w:spacing w:after="0" w:line="240" w:lineRule="auto"/>
+    </w:pPr>
+  </w:style>
+  <w:style w:type="paragraph" w:styleId="Footer">
+    <w:uiPriority w:val="99"/>
+    <w:name w:val="footer"/>
+    <w:basedOn w:val="Normal"/>
+    <w:unhideWhenUsed/>
+    <w:rsid w:val="5624E32A"/>
+    <w:pPr>
+      <w:tabs>
+        <w:tab w:val="center" w:leader="none" w:pos="4680"/>
+        <w:tab w:val="right" w:leader="none" w:pos="9360"/>
+      </w:tabs>
+      <w:spacing w:after="0" w:line="240" w:lineRule="auto"/>
+    </w:pPr>
+  </w:style>
+  <w:style xmlns:w="http://schemas.openxmlformats.org/wordprocessingml/2006/main" w:type="table" w:styleId="TableGrid">
+    <w:name xmlns:w="http://schemas.openxmlformats.org/wordprocessingml/2006/main" w:val="Table Grid"/>
+    <w:basedOn xmlns:w="http://schemas.openxmlformats.org/wordprocessingml/2006/main" w:val="TableNormal"/>
+    <w:uiPriority xmlns:w="http://schemas.openxmlformats.org/wordprocessingml/2006/main" w:val="59"/>
+    <w:rsid xmlns:w="http://schemas.openxmlformats.org/wordprocessingml/2006/main" w:val="00FB4123"/>
+    <w:pPr xmlns:w="http://schemas.openxmlformats.org/wordprocessingml/2006/main">
+      <w:spacing w:after="0" w:line="240" w:lineRule="auto"/>
+    </w:pPr>
+    <w:tblPr xmlns:w="http://schemas.openxmlformats.org/wordprocessingml/2006/main">
+      <w:tblInd w:w="0" w:type="dxa"/>
+      <w:tblBorders>
+        <w:top w:val="single" w:color="000000" w:themeColor="text1" w:sz="4" w:space="0"/>
+        <w:left w:val="single" w:color="000000" w:themeColor="text1" w:sz="4" w:space="0"/>
+        <w:bottom w:val="single" w:color="000000" w:themeColor="text1" w:sz="4" w:space="0"/>
+        <w:right w:val="single" w:color="000000" w:themeColor="text1" w:sz="4" w:space="0"/>
+        <w:insideH w:val="single" w:color="000000" w:themeColor="text1" w:sz="4" w:space="0"/>
+        <w:insideV w:val="single" w:color="000000" w:themeColor="text1" w:sz="4" w:space="0"/>
+      </w:tblBorders>
+      <w:tblCellMar>
+        <w:top w:w="0" w:type="dxa"/>
+        <w:left w:w="108" w:type="dxa"/>
+        <w:bottom w:w="0" w:type="dxa"/>
+        <w:right w:w="108" w:type="dxa"/>
+      </w:tblCellMar>
+    </w:tblPr>
+  </w:style>
 </w:styles>
 </file>
 
 <file path=word/theme/theme1.xml><?xml version="1.0" encoding="utf-8"?>
-<a:theme xmlns:a="http://schemas.openxmlformats.org/drawingml/2006/main" name="Office Theme">
+<a:theme xmlns:a="http://schemas.openxmlformats.org/drawingml/2006/main" xmlns:thm15="http://schemas.microsoft.com/office/thememl/2012/main" name="Office Theme">
   <a:themeElements>
     <a:clrScheme name="Office">
       <a:dk1>

</xml_diff>

<commit_message>
Add inventory update and disaster selection
Implemented the initial runnable console flow in `Relief Supply Distribution System.cpp`: added global state for trucks/supply packs/disaster choice, completed `inventory()` with optional inventory editing, added a `disasters()` prompt, and introduced `main()` to call the workflow. The assignment algorithm document was also updated alongside this implementation.
</commit_message>
<xml_diff>
--- a/Algorithm.docx
+++ b/Algorithm.docx
@@ -157,14 +157,586 @@
           <w:lang w:val="en-US"/>
         </w:rPr>
       </w:pPr>
+      <w:r>
+        <w:rPr>
+          <w:rFonts w:ascii="system-ui" w:hAnsi="system-ui" w:eastAsia="system-ui" w:cs="system-ui"/>
+          <w:b w:val="0"/>
+          <w:bCs w:val="0"/>
+          <w:i w:val="0"/>
+          <w:iCs w:val="0"/>
+          <w:caps w:val="0"/>
+          <w:smallCaps w:val="0"/>
+          <w:noProof w:val="0"/>
+          <w:color w:val="auto"/>
+          <w:sz w:val="22"/>
+          <w:szCs w:val="22"/>
+          <w:lang w:val="en-US"/>
+        </w:rPr>
+        <w:t>Show how many trucks and supply packs are available.</w:t>
+      </w:r>
+    </w:p>
+    <w:p>
+      <w:pPr>
+        <w:pStyle w:val="ListParagraph"/>
+        <w:numPr>
+          <w:ilvl w:val="0"/>
+          <w:numId w:val="1"/>
+        </w:numPr>
+        <w:rPr>
+          <w:rFonts w:ascii="system-ui" w:hAnsi="system-ui" w:eastAsia="system-ui" w:cs="system-ui"/>
+          <w:b w:val="0"/>
+          <w:bCs w:val="0"/>
+          <w:i w:val="0"/>
+          <w:iCs w:val="0"/>
+          <w:caps w:val="0"/>
+          <w:smallCaps w:val="0"/>
+          <w:noProof w:val="0"/>
+          <w:color w:val="auto"/>
+          <w:sz w:val="22"/>
+          <w:szCs w:val="22"/>
+          <w:lang w:val="en-US"/>
+        </w:rPr>
+      </w:pPr>
+      <w:r>
+        <w:rPr>
+          <w:rFonts w:ascii="system-ui" w:hAnsi="system-ui" w:eastAsia="system-ui" w:cs="system-ui"/>
+          <w:b w:val="0"/>
+          <w:bCs w:val="0"/>
+          <w:i w:val="0"/>
+          <w:iCs w:val="0"/>
+          <w:caps w:val="0"/>
+          <w:smallCaps w:val="0"/>
+          <w:noProof w:val="0"/>
+          <w:color w:val="auto"/>
+          <w:sz w:val="22"/>
+          <w:szCs w:val="22"/>
+          <w:lang w:val="en-US"/>
+        </w:rPr>
+        <w:t>Ask the user if they want to change the resources or not.</w:t>
+      </w:r>
+    </w:p>
+    <w:p>
+      <w:pPr>
+        <w:pStyle w:val="ListParagraph"/>
+        <w:numPr>
+          <w:ilvl w:val="0"/>
+          <w:numId w:val="1"/>
+        </w:numPr>
+        <w:rPr>
+          <w:rFonts w:ascii="system-ui" w:hAnsi="system-ui" w:eastAsia="system-ui" w:cs="system-ui"/>
+          <w:b w:val="0"/>
+          <w:bCs w:val="0"/>
+          <w:i w:val="0"/>
+          <w:iCs w:val="0"/>
+          <w:caps w:val="0"/>
+          <w:smallCaps w:val="0"/>
+          <w:noProof w:val="0"/>
+          <w:color w:val="auto"/>
+          <w:sz w:val="22"/>
+          <w:szCs w:val="22"/>
+          <w:lang w:val="en-US"/>
+        </w:rPr>
+      </w:pPr>
+      <w:r>
+        <w:rPr>
+          <w:rFonts w:ascii="system-ui" w:hAnsi="system-ui" w:eastAsia="system-ui" w:cs="system-ui"/>
+          <w:b w:val="0"/>
+          <w:bCs w:val="0"/>
+          <w:i w:val="0"/>
+          <w:iCs w:val="0"/>
+          <w:caps w:val="0"/>
+          <w:smallCaps w:val="0"/>
+          <w:noProof w:val="0"/>
+          <w:color w:val="auto"/>
+          <w:sz w:val="22"/>
+          <w:szCs w:val="22"/>
+          <w:lang w:val="en-US"/>
+        </w:rPr>
+        <w:t>If the user says yes, ask for the new number of trucks and supply packs.</w:t>
+      </w:r>
+    </w:p>
+    <w:p>
+      <w:pPr>
+        <w:pStyle w:val="ListParagraph"/>
+        <w:numPr>
+          <w:ilvl w:val="0"/>
+          <w:numId w:val="1"/>
+        </w:numPr>
+        <w:rPr>
+          <w:rFonts w:ascii="system-ui" w:hAnsi="system-ui" w:eastAsia="system-ui" w:cs="system-ui"/>
+          <w:b w:val="0"/>
+          <w:bCs w:val="0"/>
+          <w:i w:val="0"/>
+          <w:iCs w:val="0"/>
+          <w:caps w:val="0"/>
+          <w:smallCaps w:val="0"/>
+          <w:noProof w:val="0"/>
+          <w:color w:val="auto"/>
+          <w:sz w:val="22"/>
+          <w:szCs w:val="22"/>
+          <w:lang w:val="en-US"/>
+        </w:rPr>
+      </w:pPr>
+      <w:r>
+        <w:rPr>
+          <w:rFonts w:ascii="system-ui" w:hAnsi="system-ui" w:eastAsia="system-ui" w:cs="system-ui"/>
+          <w:b w:val="0"/>
+          <w:bCs w:val="0"/>
+          <w:i w:val="0"/>
+          <w:iCs w:val="0"/>
+          <w:caps w:val="0"/>
+          <w:smallCaps w:val="0"/>
+          <w:noProof w:val="0"/>
+          <w:color w:val="auto"/>
+          <w:sz w:val="22"/>
+          <w:szCs w:val="22"/>
+          <w:lang w:val="en-US"/>
+        </w:rPr>
+        <w:t>Ask the user if there is a new earthquake. If the answer is yes, continue the program. If it is no, show the stock available and end the program.</w:t>
+      </w:r>
+    </w:p>
+    <w:p>
+      <w:pPr>
+        <w:pStyle w:val="ListParagraph"/>
+        <w:numPr>
+          <w:ilvl w:val="0"/>
+          <w:numId w:val="1"/>
+        </w:numPr>
+        <w:rPr>
+          <w:rFonts w:ascii="system-ui" w:hAnsi="system-ui" w:eastAsia="system-ui" w:cs="system-ui"/>
+          <w:b w:val="0"/>
+          <w:bCs w:val="0"/>
+          <w:i w:val="0"/>
+          <w:iCs w:val="0"/>
+          <w:caps w:val="0"/>
+          <w:smallCaps w:val="0"/>
+          <w:noProof w:val="0"/>
+          <w:color w:val="auto"/>
+          <w:sz w:val="22"/>
+          <w:szCs w:val="22"/>
+          <w:lang w:val="en-US"/>
+        </w:rPr>
+      </w:pPr>
+      <w:r>
+        <w:rPr>
+          <w:rFonts w:ascii="system-ui" w:hAnsi="system-ui" w:eastAsia="system-ui" w:cs="system-ui"/>
+          <w:b w:val="0"/>
+          <w:bCs w:val="0"/>
+          <w:i w:val="0"/>
+          <w:iCs w:val="0"/>
+          <w:caps w:val="0"/>
+          <w:smallCaps w:val="0"/>
+          <w:noProof w:val="0"/>
+          <w:color w:val="auto"/>
+          <w:sz w:val="22"/>
+          <w:szCs w:val="22"/>
+          <w:lang w:val="en-US"/>
+        </w:rPr>
+        <w:t>Ask for the place of earthquake and radius of the area which will be show in the final report.</w:t>
+      </w:r>
+    </w:p>
+    <w:p>
+      <w:pPr>
+        <w:pStyle w:val="ListParagraph"/>
+        <w:numPr>
+          <w:ilvl w:val="0"/>
+          <w:numId w:val="1"/>
+        </w:numPr>
+        <w:rPr>
+          <w:rFonts w:ascii="system-ui" w:hAnsi="system-ui" w:eastAsia="system-ui" w:cs="system-ui"/>
+          <w:b w:val="0"/>
+          <w:bCs w:val="0"/>
+          <w:i w:val="0"/>
+          <w:iCs w:val="0"/>
+          <w:caps w:val="0"/>
+          <w:smallCaps w:val="0"/>
+          <w:noProof w:val="0"/>
+          <w:color w:val="auto"/>
+          <w:sz w:val="22"/>
+          <w:szCs w:val="22"/>
+          <w:lang w:val="en-US"/>
+        </w:rPr>
+      </w:pPr>
+      <w:r>
+        <w:rPr>
+          <w:rFonts w:ascii="system-ui" w:hAnsi="system-ui" w:eastAsia="system-ui" w:cs="system-ui"/>
+          <w:b w:val="0"/>
+          <w:bCs w:val="0"/>
+          <w:i w:val="0"/>
+          <w:iCs w:val="0"/>
+          <w:caps w:val="0"/>
+          <w:smallCaps w:val="0"/>
+          <w:noProof w:val="0"/>
+          <w:color w:val="auto"/>
+          <w:sz w:val="22"/>
+          <w:szCs w:val="22"/>
+          <w:lang w:val="en-US"/>
+        </w:rPr>
+        <w:t>Take the relief request and ask these questions. If an answer is not valid, show an error and ask again</w:t>
+      </w:r>
+    </w:p>
+    <w:p>
+      <w:pPr>
+        <w:pStyle w:val="ListParagraph"/>
+        <w:ind w:left="720"/>
+      </w:pPr>
+      <w:r>
+        <w:rPr>
+          <w:rFonts w:ascii="system-ui" w:hAnsi="system-ui" w:eastAsia="system-ui" w:cs="system-ui"/>
+          <w:b w:val="0"/>
+          <w:bCs w:val="0"/>
+          <w:i w:val="0"/>
+          <w:iCs w:val="0"/>
+          <w:caps w:val="0"/>
+          <w:smallCaps w:val="0"/>
+          <w:noProof w:val="0"/>
+          <w:color w:val="auto"/>
+          <w:sz w:val="22"/>
+          <w:szCs w:val="22"/>
+          <w:lang w:val="en-US"/>
+        </w:rPr>
+        <w:t>Whats</w:t>
+      </w:r>
+      <w:r>
+        <w:rPr>
+          <w:rFonts w:ascii="system-ui" w:hAnsi="system-ui" w:eastAsia="system-ui" w:cs="system-ui"/>
+          <w:b w:val="0"/>
+          <w:bCs w:val="0"/>
+          <w:i w:val="0"/>
+          <w:iCs w:val="0"/>
+          <w:caps w:val="0"/>
+          <w:smallCaps w:val="0"/>
+          <w:noProof w:val="0"/>
+          <w:color w:val="auto"/>
+          <w:sz w:val="22"/>
+          <w:szCs w:val="22"/>
+          <w:lang w:val="en-US"/>
+        </w:rPr>
+        <w:t xml:space="preserve"> the area's name?</w:t>
+      </w:r>
+    </w:p>
+    <w:p>
+      <w:pPr>
+        <w:pStyle w:val="ListParagraph"/>
+        <w:ind w:left="720"/>
+      </w:pPr>
+      <w:r>
+        <w:rPr>
+          <w:rFonts w:ascii="system-ui" w:hAnsi="system-ui" w:eastAsia="system-ui" w:cs="system-ui"/>
+          <w:b w:val="0"/>
+          <w:bCs w:val="0"/>
+          <w:i w:val="0"/>
+          <w:iCs w:val="0"/>
+          <w:caps w:val="0"/>
+          <w:smallCaps w:val="0"/>
+          <w:noProof w:val="0"/>
+          <w:color w:val="auto"/>
+          <w:sz w:val="22"/>
+          <w:szCs w:val="22"/>
+          <w:lang w:val="en-US"/>
+        </w:rPr>
+        <w:t>Are people trapped? (Y/N)</w:t>
+      </w:r>
+    </w:p>
+    <w:p>
+      <w:pPr>
+        <w:pStyle w:val="ListParagraph"/>
+        <w:ind w:left="720"/>
+      </w:pPr>
+      <w:r>
+        <w:rPr>
+          <w:rFonts w:ascii="system-ui" w:hAnsi="system-ui" w:eastAsia="system-ui" w:cs="system-ui"/>
+          <w:b w:val="0"/>
+          <w:bCs w:val="0"/>
+          <w:i w:val="0"/>
+          <w:iCs w:val="0"/>
+          <w:caps w:val="0"/>
+          <w:smallCaps w:val="0"/>
+          <w:noProof w:val="0"/>
+          <w:color w:val="auto"/>
+          <w:sz w:val="22"/>
+          <w:szCs w:val="22"/>
+          <w:lang w:val="en-US"/>
+        </w:rPr>
+        <w:t>Do people need medical help? (Y/N)</w:t>
+      </w:r>
+    </w:p>
+    <w:p>
+      <w:pPr>
+        <w:pStyle w:val="ListParagraph"/>
+        <w:ind w:left="720"/>
+      </w:pPr>
+      <w:r>
+        <w:rPr>
+          <w:rFonts w:ascii="system-ui" w:hAnsi="system-ui" w:eastAsia="system-ui" w:cs="system-ui"/>
+          <w:b w:val="0"/>
+          <w:bCs w:val="0"/>
+          <w:i w:val="0"/>
+          <w:iCs w:val="0"/>
+          <w:caps w:val="0"/>
+          <w:smallCaps w:val="0"/>
+          <w:noProof w:val="0"/>
+          <w:color w:val="auto"/>
+          <w:sz w:val="22"/>
+          <w:szCs w:val="22"/>
+          <w:lang w:val="en-US"/>
+        </w:rPr>
+        <w:t>How many families are affected? (10-200)</w:t>
+      </w:r>
+    </w:p>
+    <w:p>
+      <w:pPr>
+        <w:pStyle w:val="ListParagraph"/>
+        <w:ind w:left="720"/>
+      </w:pPr>
+      <w:r>
+        <w:rPr>
+          <w:rFonts w:ascii="system-ui" w:hAnsi="system-ui" w:eastAsia="system-ui" w:cs="system-ui"/>
+          <w:b w:val="0"/>
+          <w:bCs w:val="0"/>
+          <w:i w:val="0"/>
+          <w:iCs w:val="0"/>
+          <w:caps w:val="0"/>
+          <w:smallCaps w:val="0"/>
+          <w:noProof w:val="0"/>
+          <w:color w:val="auto"/>
+          <w:sz w:val="22"/>
+          <w:szCs w:val="22"/>
+          <w:lang w:val="en-US"/>
+        </w:rPr>
+        <w:t>Are there children, elderly or disabled people? (Y/N)</w:t>
+      </w:r>
+    </w:p>
+    <w:p>
+      <w:pPr>
+        <w:pStyle w:val="ListParagraph"/>
+        <w:ind w:left="720"/>
+      </w:pPr>
+      <w:r>
+        <w:rPr>
+          <w:rFonts w:ascii="system-ui" w:hAnsi="system-ui" w:eastAsia="system-ui" w:cs="system-ui"/>
+          <w:b w:val="0"/>
+          <w:bCs w:val="0"/>
+          <w:i w:val="0"/>
+          <w:iCs w:val="0"/>
+          <w:caps w:val="0"/>
+          <w:smallCaps w:val="0"/>
+          <w:noProof w:val="0"/>
+          <w:color w:val="auto"/>
+          <w:sz w:val="22"/>
+          <w:szCs w:val="22"/>
+          <w:lang w:val="en-US"/>
+        </w:rPr>
+        <w:t>Is the local clinic working? (Y/N)</w:t>
+      </w:r>
+    </w:p>
+    <w:p>
+      <w:pPr>
+        <w:pStyle w:val="ListParagraph"/>
+        <w:ind w:left="720"/>
+      </w:pPr>
+      <w:r>
+        <w:rPr>
+          <w:rFonts w:ascii="system-ui" w:hAnsi="system-ui" w:eastAsia="system-ui" w:cs="system-ui"/>
+          <w:b w:val="0"/>
+          <w:bCs w:val="0"/>
+          <w:i w:val="0"/>
+          <w:iCs w:val="0"/>
+          <w:caps w:val="0"/>
+          <w:smallCaps w:val="0"/>
+          <w:noProof w:val="0"/>
+          <w:color w:val="auto"/>
+          <w:sz w:val="22"/>
+          <w:szCs w:val="22"/>
+          <w:lang w:val="en-US"/>
+        </w:rPr>
+        <w:t>Is there an aftershock warning? (Y/N)</w:t>
+      </w:r>
+    </w:p>
+    <w:p>
+      <w:pPr>
+        <w:pStyle w:val="ListParagraph"/>
+        <w:ind w:left="720"/>
+      </w:pPr>
+      <w:r>
+        <w:rPr>
+          <w:rFonts w:ascii="system-ui" w:hAnsi="system-ui" w:eastAsia="system-ui" w:cs="system-ui"/>
+          <w:b w:val="0"/>
+          <w:bCs w:val="0"/>
+          <w:i w:val="0"/>
+          <w:iCs w:val="0"/>
+          <w:caps w:val="0"/>
+          <w:smallCaps w:val="0"/>
+          <w:noProof w:val="0"/>
+          <w:color w:val="auto"/>
+          <w:sz w:val="22"/>
+          <w:szCs w:val="22"/>
+          <w:lang w:val="en-US"/>
+        </w:rPr>
+        <w:t>Is the road open or damaged? (O/D)</w:t>
+      </w:r>
+    </w:p>
+    <w:p>
+      <w:pPr>
+        <w:pStyle w:val="ListParagraph"/>
+        <w:ind w:left="720"/>
+      </w:pPr>
+      <w:r>
+        <w:rPr>
+          <w:rFonts w:ascii="system-ui" w:hAnsi="system-ui" w:eastAsia="system-ui" w:cs="system-ui"/>
+          <w:b w:val="0"/>
+          <w:bCs w:val="0"/>
+          <w:i w:val="0"/>
+          <w:iCs w:val="0"/>
+          <w:caps w:val="0"/>
+          <w:smallCaps w:val="0"/>
+          <w:noProof w:val="0"/>
+          <w:color w:val="auto"/>
+          <w:sz w:val="22"/>
+          <w:szCs w:val="22"/>
+          <w:lang w:val="en-US"/>
+        </w:rPr>
+        <w:t xml:space="preserve">Has the area already </w:t>
+      </w:r>
+      <w:r>
+        <w:rPr>
+          <w:rFonts w:ascii="system-ui" w:hAnsi="system-ui" w:eastAsia="system-ui" w:cs="system-ui"/>
+          <w:b w:val="0"/>
+          <w:bCs w:val="0"/>
+          <w:i w:val="0"/>
+          <w:iCs w:val="0"/>
+          <w:caps w:val="0"/>
+          <w:smallCaps w:val="0"/>
+          <w:noProof w:val="0"/>
+          <w:color w:val="auto"/>
+          <w:sz w:val="22"/>
+          <w:szCs w:val="22"/>
+          <w:lang w:val="en-US"/>
+        </w:rPr>
+        <w:t>recieved</w:t>
+      </w:r>
+      <w:r>
+        <w:rPr>
+          <w:rFonts w:ascii="system-ui" w:hAnsi="system-ui" w:eastAsia="system-ui" w:cs="system-ui"/>
+          <w:b w:val="0"/>
+          <w:bCs w:val="0"/>
+          <w:i w:val="0"/>
+          <w:iCs w:val="0"/>
+          <w:caps w:val="0"/>
+          <w:smallCaps w:val="0"/>
+          <w:noProof w:val="0"/>
+          <w:color w:val="auto"/>
+          <w:sz w:val="22"/>
+          <w:szCs w:val="22"/>
+          <w:lang w:val="en-US"/>
+        </w:rPr>
+        <w:t xml:space="preserve"> aid? (Y/N)</w:t>
+      </w:r>
+    </w:p>
+    <w:p>
+      <w:pPr>
+        <w:pStyle w:val="ListParagraph"/>
+        <w:numPr>
+          <w:ilvl w:val="0"/>
+          <w:numId w:val="1"/>
+        </w:numPr>
+        <w:rPr>
+          <w:rFonts w:ascii="system-ui" w:hAnsi="system-ui" w:eastAsia="system-ui" w:cs="system-ui"/>
+          <w:b w:val="0"/>
+          <w:bCs w:val="0"/>
+          <w:i w:val="0"/>
+          <w:iCs w:val="0"/>
+          <w:caps w:val="0"/>
+          <w:smallCaps w:val="0"/>
+          <w:noProof w:val="0"/>
+          <w:color w:val="auto"/>
+          <w:sz w:val="22"/>
+          <w:szCs w:val="22"/>
+          <w:lang w:val="en-US"/>
+        </w:rPr>
+      </w:pPr>
+      <w:r>
+        <w:rPr>
+          <w:rFonts w:ascii="system-ui" w:hAnsi="system-ui" w:eastAsia="system-ui" w:cs="system-ui"/>
+          <w:b w:val="0"/>
+          <w:bCs w:val="0"/>
+          <w:i w:val="0"/>
+          <w:iCs w:val="0"/>
+          <w:caps w:val="0"/>
+          <w:smallCaps w:val="0"/>
+          <w:noProof w:val="0"/>
+          <w:color w:val="auto"/>
+          <w:sz w:val="22"/>
+          <w:szCs w:val="22"/>
+          <w:lang w:val="en-US"/>
+        </w:rPr>
+        <w:t xml:space="preserve">Work out the need score. </w:t>
+      </w:r>
+    </w:p>
+    <w:p>
+      <w:pPr>
+        <w:pStyle w:val="ListParagraph"/>
+        <w:ind w:left="720"/>
+      </w:pPr>
+      <w:r>
+        <w:rPr>
+          <w:rFonts w:ascii="system-ui" w:hAnsi="system-ui" w:eastAsia="system-ui" w:cs="system-ui"/>
+          <w:b w:val="0"/>
+          <w:bCs w:val="0"/>
+          <w:i w:val="0"/>
+          <w:iCs w:val="0"/>
+          <w:caps w:val="0"/>
+          <w:smallCaps w:val="0"/>
+          <w:noProof w:val="0"/>
+          <w:color w:val="auto"/>
+          <w:sz w:val="22"/>
+          <w:szCs w:val="22"/>
+          <w:lang w:val="en-US"/>
+        </w:rPr>
+        <w:t xml:space="preserve">People </w:t>
+      </w:r>
+      <w:r>
+        <w:rPr>
+          <w:rFonts w:ascii="system-ui" w:hAnsi="system-ui" w:eastAsia="system-ui" w:cs="system-ui"/>
+          <w:b w:val="0"/>
+          <w:bCs w:val="0"/>
+          <w:i w:val="0"/>
+          <w:iCs w:val="0"/>
+          <w:caps w:val="0"/>
+          <w:smallCaps w:val="0"/>
+          <w:noProof w:val="0"/>
+          <w:color w:val="auto"/>
+          <w:sz w:val="22"/>
+          <w:szCs w:val="22"/>
+          <w:lang w:val="en-US"/>
+        </w:rPr>
+        <w:t>points</w:t>
+      </w:r>
+      <w:r>
+        <w:rPr>
+          <w:rFonts w:ascii="system-ui" w:hAnsi="system-ui" w:eastAsia="system-ui" w:cs="system-ui"/>
+          <w:b w:val="0"/>
+          <w:bCs w:val="0"/>
+          <w:i w:val="0"/>
+          <w:iCs w:val="0"/>
+          <w:caps w:val="0"/>
+          <w:smallCaps w:val="0"/>
+          <w:noProof w:val="0"/>
+          <w:color w:val="auto"/>
+          <w:sz w:val="22"/>
+          <w:szCs w:val="22"/>
+          <w:lang w:val="en-US"/>
+        </w:rPr>
+        <w:t xml:space="preserve"> (P): total score 100 out of which 30 if people are trapped, 25 if they need medical help (injured), 15 if there are vulnerable </w:t>
+      </w:r>
     </w:p>
     <w:sectPr>
       <w:pgSz w:w="12240" w:h="15840" w:orient="portrait"/>
       <w:pgMar w:top="1440" w:right="1440" w:bottom="1440" w:left="1440" w:header="720" w:footer="720" w:gutter="0"/>
       <w:cols w:space="720"/>
       <w:docGrid w:linePitch="360"/>
-      <w:headerReference w:type="default" r:id="R59eb02f8f85b4052"/>
-      <w:footerReference w:type="default" r:id="R78e87118ea3244d3"/>
+      <w:headerReference w:type="default" r:id="Rb5d29a54c2a142f4"/>
+      <w:footerReference w:type="default" r:id="Re88e31d0ec2749c2"/>
     </w:sectPr>
   </w:body>
 </w:document>
@@ -834,7 +1406,7 @@
     <w:name w:val="List Paragraph"/>
     <w:basedOn w:val="Normal"/>
     <w:qFormat/>
-    <w:rsid w:val="5624E32A"/>
+    <w:rsid w:val="687D53D4"/>
     <w:pPr>
       <w:spacing/>
       <w:ind w:left="720"/>
@@ -846,7 +1418,7 @@
     <w:name w:val="header"/>
     <w:basedOn w:val="Normal"/>
     <w:unhideWhenUsed/>
-    <w:rsid w:val="5624E32A"/>
+    <w:rsid w:val="687D53D4"/>
     <w:pPr>
       <w:tabs>
         <w:tab w:val="center" w:leader="none" w:pos="4680"/>
@@ -860,7 +1432,7 @@
     <w:name w:val="footer"/>
     <w:basedOn w:val="Normal"/>
     <w:unhideWhenUsed/>
-    <w:rsid w:val="5624E32A"/>
+    <w:rsid w:val="687D53D4"/>
     <w:pPr>
       <w:tabs>
         <w:tab w:val="center" w:leader="none" w:pos="4680"/>

</xml_diff>

<commit_message>
Add earthquake-specific input prompt flow
Introduces a new `earthquake()` function that prints earthquake disaster detail fields, and calls it from `main()` when the selected disaster type is `1`. Also updates the algorithm document to reflect the latest assignment changes.
</commit_message>
<xml_diff>
--- a/Algorithm.docx
+++ b/Algorithm.docx
@@ -727,16 +727,93 @@
           <w:szCs w:val="22"/>
           <w:lang w:val="en-US"/>
         </w:rPr>
-        <w:t xml:space="preserve"> (P): total score 100 out of which 30 if people are trapped, 25 if they need medical help (injured), 15 if there are vulnerable </w:t>
-      </w:r>
+        <w:t xml:space="preserve"> (P): Total score 100. Add 30 if people are trapped, 25 if they need medical help (injured), 15 if there are vulnerable groups present, </w:t>
+      </w:r>
+      <w:r>
+        <w:rPr>
+          <w:rFonts w:ascii="system-ui" w:hAnsi="system-ui" w:eastAsia="system-ui" w:cs="system-ui"/>
+          <w:b w:val="0"/>
+          <w:bCs w:val="0"/>
+          <w:i w:val="0"/>
+          <w:iCs w:val="0"/>
+          <w:caps w:val="0"/>
+          <w:smallCaps w:val="0"/>
+          <w:noProof w:val="0"/>
+          <w:color w:val="auto"/>
+          <w:sz w:val="22"/>
+          <w:szCs w:val="22"/>
+          <w:lang w:val="en-US"/>
+        </w:rPr>
+        <w:t>10  if</w:t>
+      </w:r>
+      <w:r>
+        <w:rPr>
+          <w:rFonts w:ascii="system-ui" w:hAnsi="system-ui" w:eastAsia="system-ui" w:cs="system-ui"/>
+          <w:b w:val="0"/>
+          <w:bCs w:val="0"/>
+          <w:i w:val="0"/>
+          <w:iCs w:val="0"/>
+          <w:caps w:val="0"/>
+          <w:smallCaps w:val="0"/>
+          <w:noProof w:val="0"/>
+          <w:color w:val="auto"/>
+          <w:sz w:val="22"/>
+          <w:szCs w:val="22"/>
+          <w:lang w:val="en-US"/>
+        </w:rPr>
+        <w:t xml:space="preserve"> the local clinic is not working. Add point for families: 5 for 10-50 families, 10 for 51-100 families, 15 for 101-150 families and 20 for 151-200 families.</w:t>
+      </w:r>
+    </w:p>
+    <w:p>
+      <w:pPr>
+        <w:pStyle w:val="ListParagraph"/>
+        <w:ind w:left="720"/>
+      </w:pPr>
+      <w:r>
+        <w:rPr>
+          <w:rFonts w:ascii="system-ui" w:hAnsi="system-ui" w:eastAsia="system-ui" w:cs="system-ui"/>
+          <w:b w:val="0"/>
+          <w:bCs w:val="0"/>
+          <w:i w:val="0"/>
+          <w:iCs w:val="0"/>
+          <w:caps w:val="0"/>
+          <w:smallCaps w:val="0"/>
+          <w:noProof w:val="0"/>
+          <w:color w:val="auto"/>
+          <w:sz w:val="22"/>
+          <w:szCs w:val="22"/>
+          <w:lang w:val="en-US"/>
+        </w:rPr>
+        <w:t>Impact points (I): Total score 100 out of which 40 percent is for Aftershock Warning and 60 percent for Infrastructure Damage (12 for low damage, 36 for medium and 60 for high)</w:t>
+      </w:r>
+    </w:p>
+    <w:p>
+      <w:pPr>
+        <w:pStyle w:val="ListParagraph"/>
+        <w:ind w:left="720"/>
+        <w:rPr>
+          <w:rFonts w:ascii="system-ui" w:hAnsi="system-ui" w:eastAsia="system-ui" w:cs="system-ui"/>
+          <w:b w:val="0"/>
+          <w:bCs w:val="0"/>
+          <w:i w:val="0"/>
+          <w:iCs w:val="0"/>
+          <w:caps w:val="0"/>
+          <w:smallCaps w:val="0"/>
+          <w:noProof w:val="0"/>
+          <w:color w:val="auto"/>
+          <w:sz w:val="22"/>
+          <w:szCs w:val="22"/>
+          <w:lang w:val="en-US"/>
+        </w:rPr>
+      </w:pPr>
     </w:p>
     <w:sectPr>
       <w:pgSz w:w="12240" w:h="15840" w:orient="portrait"/>
       <w:pgMar w:top="1440" w:right="1440" w:bottom="1440" w:left="1440" w:header="720" w:footer="720" w:gutter="0"/>
       <w:cols w:space="720"/>
       <w:docGrid w:linePitch="360"/>
-      <w:headerReference w:type="default" r:id="Rb5d29a54c2a142f4"/>
-      <w:footerReference w:type="default" r:id="Re88e31d0ec2749c2"/>
+      <w:headerReference w:type="default" r:id="R51f666e6be274a04"/>
+      <w:footerReference w:type="default" r:id="R8fcdf26f9a904499"/>
     </w:sectPr>
   </w:body>
 </w:document>
@@ -1406,7 +1483,7 @@
     <w:name w:val="List Paragraph"/>
     <w:basedOn w:val="Normal"/>
     <w:qFormat/>
-    <w:rsid w:val="687D53D4"/>
+    <w:rsid w:val="5DDDC42A"/>
     <w:pPr>
       <w:spacing/>
       <w:ind w:left="720"/>
@@ -1418,7 +1495,7 @@
     <w:name w:val="header"/>
     <w:basedOn w:val="Normal"/>
     <w:unhideWhenUsed/>
-    <w:rsid w:val="687D53D4"/>
+    <w:rsid w:val="5DDDC42A"/>
     <w:pPr>
       <w:tabs>
         <w:tab w:val="center" w:leader="none" w:pos="4680"/>
@@ -1432,7 +1509,7 @@
     <w:name w:val="footer"/>
     <w:basedOn w:val="Normal"/>
     <w:unhideWhenUsed/>
-    <w:rsid w:val="687D53D4"/>
+    <w:rsid w:val="5DDDC42A"/>
     <w:pPr>
       <w:tabs>
         <w:tab w:val="center" w:leader="none" w:pos="4680"/>

</xml_diff>

<commit_message>
Update earthquake data entry and clean artifacts
Expanded the earthquake workflow in `Relief Supply Distribution System.cpp` with clearer prompts and new captured inputs (damage level, affected families, route access, aftershocks, medical need, and previous aid). Also removed a large set of Visual Studio-generated caches/build outputs and project metadata files from the repository to keep tracked files focused on source content.
</commit_message>
<xml_diff>
--- a/Algorithm.docx
+++ b/Algorithm.docx
@@ -4,20 +4,17 @@
   <w:body>
     <w:p>
       <w:pPr>
+        <w:pStyle w:val="Title"/>
         <w:jc w:val="center"/>
         <w:rPr>
           <w:color w:val="auto"/>
-          <w:sz w:val="48"/>
-          <w:szCs w:val="48"/>
-        </w:rPr>
-      </w:pPr>
-      <w:r>
-        <w:rPr>
-          <w:color w:val="auto"/>
-          <w:sz w:val="48"/>
-          <w:szCs w:val="48"/>
-        </w:rPr>
-        <w:t>Algorithm:</w:t>
+          <w:sz w:val="24"/>
+          <w:szCs w:val="24"/>
+        </w:rPr>
+      </w:pPr>
+      <w:r>
+        <w:rPr/>
+        <w:t>Algorithm</w:t>
       </w:r>
     </w:p>
     <w:p>
@@ -28,23 +25,26 @@
           <w:numId w:val="1"/>
         </w:numPr>
         <w:rPr>
-          <w:rFonts w:ascii="system-ui" w:hAnsi="system-ui" w:eastAsia="system-ui" w:cs="system-ui"/>
-          <w:b w:val="0"/>
-          <w:bCs w:val="0"/>
-          <w:i w:val="0"/>
-          <w:iCs w:val="0"/>
-          <w:caps w:val="0"/>
-          <w:smallCaps w:val="0"/>
-          <w:noProof w:val="0"/>
-          <w:color w:val="auto"/>
-          <w:sz w:val="22"/>
-          <w:szCs w:val="22"/>
-          <w:lang w:val="en-US"/>
-        </w:rPr>
-      </w:pPr>
-      <w:r>
-        <w:rPr>
-          <w:color w:val="auto"/>
+          <w:rFonts w:ascii="Calibri" w:hAnsi="Calibri" w:eastAsia="Calibri" w:cs="Calibri" w:asciiTheme="minorAscii" w:hAnsiTheme="minorAscii" w:eastAsiaTheme="minorAscii" w:cstheme="minorAscii"/>
+          <w:b w:val="0"/>
+          <w:bCs w:val="0"/>
+          <w:i w:val="0"/>
+          <w:iCs w:val="0"/>
+          <w:caps w:val="0"/>
+          <w:smallCaps w:val="0"/>
+          <w:noProof w:val="0"/>
+          <w:color w:val="auto"/>
+          <w:sz w:val="24"/>
+          <w:szCs w:val="24"/>
+          <w:lang w:val="en-US"/>
+        </w:rPr>
+      </w:pPr>
+      <w:r>
+        <w:rPr>
+          <w:rFonts w:ascii="Calibri" w:hAnsi="Calibri" w:eastAsia="Calibri" w:cs="Calibri" w:asciiTheme="minorAscii" w:hAnsiTheme="minorAscii" w:eastAsiaTheme="minorAscii" w:cstheme="minorAscii"/>
+          <w:color w:val="auto"/>
+          <w:sz w:val="24"/>
+          <w:szCs w:val="24"/>
         </w:rPr>
         <w:t>Start with 5 trucks and 120 supply packs as the resources available that can be used to provide relief.</w:t>
       </w:r>
@@ -57,82 +57,54 @@
           <w:numId w:val="1"/>
         </w:numPr>
         <w:rPr>
-          <w:rFonts w:ascii="system-ui" w:hAnsi="system-ui" w:eastAsia="system-ui" w:cs="system-ui"/>
-          <w:b w:val="0"/>
-          <w:bCs w:val="0"/>
-          <w:i w:val="0"/>
-          <w:iCs w:val="0"/>
-          <w:caps w:val="0"/>
-          <w:smallCaps w:val="0"/>
-          <w:noProof w:val="0"/>
-          <w:color w:val="auto"/>
-          <w:sz w:val="22"/>
-          <w:szCs w:val="22"/>
-          <w:lang w:val="en-US"/>
-        </w:rPr>
-      </w:pPr>
-      <w:r>
-        <w:rPr>
-          <w:color w:val="auto"/>
+          <w:rFonts w:ascii="Calibri" w:hAnsi="Calibri" w:eastAsia="Calibri" w:cs="Calibri" w:asciiTheme="minorAscii" w:hAnsiTheme="minorAscii" w:eastAsiaTheme="minorAscii" w:cstheme="minorAscii"/>
+          <w:b w:val="0"/>
+          <w:bCs w:val="0"/>
+          <w:i w:val="0"/>
+          <w:iCs w:val="0"/>
+          <w:caps w:val="0"/>
+          <w:smallCaps w:val="0"/>
+          <w:noProof w:val="0"/>
+          <w:color w:val="auto"/>
+          <w:sz w:val="24"/>
+          <w:szCs w:val="24"/>
+          <w:lang w:val="en-US"/>
+        </w:rPr>
+      </w:pPr>
+      <w:r>
+        <w:rPr>
+          <w:rFonts w:ascii="Calibri" w:hAnsi="Calibri" w:eastAsia="Calibri" w:cs="Calibri" w:asciiTheme="minorAscii" w:hAnsiTheme="minorAscii" w:eastAsiaTheme="minorAscii" w:cstheme="minorAscii"/>
+          <w:color w:val="auto"/>
+          <w:sz w:val="24"/>
+          <w:szCs w:val="24"/>
         </w:rPr>
         <w:t xml:space="preserve">Output welcome </w:t>
       </w:r>
       <w:r>
         <w:rPr>
-          <w:color w:val="auto"/>
-        </w:rPr>
-        <w:t xml:space="preserve">message </w:t>
-      </w:r>
-      <w:r>
-        <w:rPr>
-          <w:rFonts w:ascii="system-ui" w:hAnsi="system-ui" w:eastAsia="system-ui" w:cs="system-ui"/>
-          <w:b w:val="0"/>
-          <w:bCs w:val="0"/>
-          <w:i w:val="0"/>
-          <w:iCs w:val="0"/>
-          <w:caps w:val="0"/>
-          <w:smallCaps w:val="0"/>
-          <w:noProof w:val="0"/>
-          <w:color w:val="auto"/>
-          <w:sz w:val="22"/>
-          <w:szCs w:val="22"/>
-          <w:lang w:val="en-US"/>
-        </w:rPr>
-        <w:t xml:space="preserve"> “</w:t>
-      </w:r>
-      <w:r>
-        <w:rPr>
-          <w:rFonts w:ascii="system-ui" w:hAnsi="system-ui" w:eastAsia="system-ui" w:cs="system-ui"/>
-          <w:b w:val="0"/>
-          <w:bCs w:val="0"/>
-          <w:i w:val="0"/>
-          <w:iCs w:val="0"/>
-          <w:caps w:val="0"/>
-          <w:smallCaps w:val="0"/>
-          <w:noProof w:val="0"/>
-          <w:color w:val="auto"/>
-          <w:sz w:val="22"/>
-          <w:szCs w:val="22"/>
-          <w:lang w:val="en-US"/>
-        </w:rPr>
-        <w:t xml:space="preserve">Welcome to Relief Supply Distribution </w:t>
-      </w:r>
-      <w:r>
-        <w:rPr>
-          <w:rFonts w:ascii="system-ui" w:hAnsi="system-ui" w:eastAsia="system-ui" w:cs="system-ui"/>
-          <w:b w:val="0"/>
-          <w:bCs w:val="0"/>
-          <w:i w:val="0"/>
-          <w:iCs w:val="0"/>
-          <w:caps w:val="0"/>
-          <w:smallCaps w:val="0"/>
-          <w:noProof w:val="0"/>
-          <w:color w:val="auto"/>
-          <w:sz w:val="22"/>
-          <w:szCs w:val="22"/>
-          <w:lang w:val="en-US"/>
-        </w:rPr>
-        <w:t>System”</w:t>
+          <w:rFonts w:ascii="Calibri" w:hAnsi="Calibri" w:eastAsia="Calibri" w:cs="Calibri" w:asciiTheme="minorAscii" w:hAnsiTheme="minorAscii" w:eastAsiaTheme="minorAscii" w:cstheme="minorAscii"/>
+          <w:color w:val="auto"/>
+          <w:sz w:val="24"/>
+          <w:szCs w:val="24"/>
+        </w:rPr>
+        <w:t>message “</w:t>
+      </w:r>
+      <w:r>
+        <w:rPr>
+          <w:rFonts w:ascii="Calibri" w:hAnsi="Calibri" w:eastAsia="Calibri" w:cs="Calibri" w:asciiTheme="minorAscii" w:hAnsiTheme="minorAscii" w:eastAsiaTheme="minorAscii" w:cstheme="minorAscii"/>
+          <w:b w:val="0"/>
+          <w:bCs w:val="0"/>
+          <w:i w:val="0"/>
+          <w:iCs w:val="0"/>
+          <w:caps w:val="0"/>
+          <w:smallCaps w:val="0"/>
+          <w:noProof w:val="0"/>
+          <w:color w:val="auto"/>
+          <w:sz w:val="24"/>
+          <w:szCs w:val="24"/>
+          <w:lang w:val="en-US"/>
+        </w:rPr>
+        <w:t>Welcome to Relief Supply Distribution System”</w:t>
       </w:r>
     </w:p>
     <w:p>
@@ -143,33 +115,33 @@
           <w:numId w:val="1"/>
         </w:numPr>
         <w:rPr>
-          <w:rFonts w:ascii="system-ui" w:hAnsi="system-ui" w:eastAsia="system-ui" w:cs="system-ui"/>
-          <w:b w:val="0"/>
-          <w:bCs w:val="0"/>
-          <w:i w:val="0"/>
-          <w:iCs w:val="0"/>
-          <w:caps w:val="0"/>
-          <w:smallCaps w:val="0"/>
-          <w:noProof w:val="0"/>
-          <w:color w:val="auto"/>
-          <w:sz w:val="22"/>
-          <w:szCs w:val="22"/>
-          <w:lang w:val="en-US"/>
-        </w:rPr>
-      </w:pPr>
-      <w:r>
-        <w:rPr>
-          <w:rFonts w:ascii="system-ui" w:hAnsi="system-ui" w:eastAsia="system-ui" w:cs="system-ui"/>
-          <w:b w:val="0"/>
-          <w:bCs w:val="0"/>
-          <w:i w:val="0"/>
-          <w:iCs w:val="0"/>
-          <w:caps w:val="0"/>
-          <w:smallCaps w:val="0"/>
-          <w:noProof w:val="0"/>
-          <w:color w:val="auto"/>
-          <w:sz w:val="22"/>
-          <w:szCs w:val="22"/>
+          <w:rFonts w:ascii="Calibri" w:hAnsi="Calibri" w:eastAsia="Calibri" w:cs="Calibri" w:asciiTheme="minorAscii" w:hAnsiTheme="minorAscii" w:eastAsiaTheme="minorAscii" w:cstheme="minorAscii"/>
+          <w:b w:val="0"/>
+          <w:bCs w:val="0"/>
+          <w:i w:val="0"/>
+          <w:iCs w:val="0"/>
+          <w:caps w:val="0"/>
+          <w:smallCaps w:val="0"/>
+          <w:noProof w:val="0"/>
+          <w:color w:val="auto"/>
+          <w:sz w:val="24"/>
+          <w:szCs w:val="24"/>
+          <w:lang w:val="en-US"/>
+        </w:rPr>
+      </w:pPr>
+      <w:r>
+        <w:rPr>
+          <w:rFonts w:ascii="Calibri" w:hAnsi="Calibri" w:eastAsia="Calibri" w:cs="Calibri" w:asciiTheme="minorAscii" w:hAnsiTheme="minorAscii" w:eastAsiaTheme="minorAscii" w:cstheme="minorAscii"/>
+          <w:b w:val="0"/>
+          <w:bCs w:val="0"/>
+          <w:i w:val="0"/>
+          <w:iCs w:val="0"/>
+          <w:caps w:val="0"/>
+          <w:smallCaps w:val="0"/>
+          <w:noProof w:val="0"/>
+          <w:color w:val="auto"/>
+          <w:sz w:val="24"/>
+          <w:szCs w:val="24"/>
           <w:lang w:val="en-US"/>
         </w:rPr>
         <w:t>Show how many trucks and supply packs are available.</w:t>
@@ -183,33 +155,33 @@
           <w:numId w:val="1"/>
         </w:numPr>
         <w:rPr>
-          <w:rFonts w:ascii="system-ui" w:hAnsi="system-ui" w:eastAsia="system-ui" w:cs="system-ui"/>
-          <w:b w:val="0"/>
-          <w:bCs w:val="0"/>
-          <w:i w:val="0"/>
-          <w:iCs w:val="0"/>
-          <w:caps w:val="0"/>
-          <w:smallCaps w:val="0"/>
-          <w:noProof w:val="0"/>
-          <w:color w:val="auto"/>
-          <w:sz w:val="22"/>
-          <w:szCs w:val="22"/>
-          <w:lang w:val="en-US"/>
-        </w:rPr>
-      </w:pPr>
-      <w:r>
-        <w:rPr>
-          <w:rFonts w:ascii="system-ui" w:hAnsi="system-ui" w:eastAsia="system-ui" w:cs="system-ui"/>
-          <w:b w:val="0"/>
-          <w:bCs w:val="0"/>
-          <w:i w:val="0"/>
-          <w:iCs w:val="0"/>
-          <w:caps w:val="0"/>
-          <w:smallCaps w:val="0"/>
-          <w:noProof w:val="0"/>
-          <w:color w:val="auto"/>
-          <w:sz w:val="22"/>
-          <w:szCs w:val="22"/>
+          <w:rFonts w:ascii="Calibri" w:hAnsi="Calibri" w:eastAsia="Calibri" w:cs="Calibri" w:asciiTheme="minorAscii" w:hAnsiTheme="minorAscii" w:eastAsiaTheme="minorAscii" w:cstheme="minorAscii"/>
+          <w:b w:val="0"/>
+          <w:bCs w:val="0"/>
+          <w:i w:val="0"/>
+          <w:iCs w:val="0"/>
+          <w:caps w:val="0"/>
+          <w:smallCaps w:val="0"/>
+          <w:noProof w:val="0"/>
+          <w:color w:val="auto"/>
+          <w:sz w:val="24"/>
+          <w:szCs w:val="24"/>
+          <w:lang w:val="en-US"/>
+        </w:rPr>
+      </w:pPr>
+      <w:r>
+        <w:rPr>
+          <w:rFonts w:ascii="Calibri" w:hAnsi="Calibri" w:eastAsia="Calibri" w:cs="Calibri" w:asciiTheme="minorAscii" w:hAnsiTheme="minorAscii" w:eastAsiaTheme="minorAscii" w:cstheme="minorAscii"/>
+          <w:b w:val="0"/>
+          <w:bCs w:val="0"/>
+          <w:i w:val="0"/>
+          <w:iCs w:val="0"/>
+          <w:caps w:val="0"/>
+          <w:smallCaps w:val="0"/>
+          <w:noProof w:val="0"/>
+          <w:color w:val="auto"/>
+          <w:sz w:val="24"/>
+          <w:szCs w:val="24"/>
           <w:lang w:val="en-US"/>
         </w:rPr>
         <w:t>Ask the user if they want to change the resources or not.</w:t>
@@ -223,33 +195,33 @@
           <w:numId w:val="1"/>
         </w:numPr>
         <w:rPr>
-          <w:rFonts w:ascii="system-ui" w:hAnsi="system-ui" w:eastAsia="system-ui" w:cs="system-ui"/>
-          <w:b w:val="0"/>
-          <w:bCs w:val="0"/>
-          <w:i w:val="0"/>
-          <w:iCs w:val="0"/>
-          <w:caps w:val="0"/>
-          <w:smallCaps w:val="0"/>
-          <w:noProof w:val="0"/>
-          <w:color w:val="auto"/>
-          <w:sz w:val="22"/>
-          <w:szCs w:val="22"/>
-          <w:lang w:val="en-US"/>
-        </w:rPr>
-      </w:pPr>
-      <w:r>
-        <w:rPr>
-          <w:rFonts w:ascii="system-ui" w:hAnsi="system-ui" w:eastAsia="system-ui" w:cs="system-ui"/>
-          <w:b w:val="0"/>
-          <w:bCs w:val="0"/>
-          <w:i w:val="0"/>
-          <w:iCs w:val="0"/>
-          <w:caps w:val="0"/>
-          <w:smallCaps w:val="0"/>
-          <w:noProof w:val="0"/>
-          <w:color w:val="auto"/>
-          <w:sz w:val="22"/>
-          <w:szCs w:val="22"/>
+          <w:rFonts w:ascii="Calibri" w:hAnsi="Calibri" w:eastAsia="Calibri" w:cs="Calibri" w:asciiTheme="minorAscii" w:hAnsiTheme="minorAscii" w:eastAsiaTheme="minorAscii" w:cstheme="minorAscii"/>
+          <w:b w:val="0"/>
+          <w:bCs w:val="0"/>
+          <w:i w:val="0"/>
+          <w:iCs w:val="0"/>
+          <w:caps w:val="0"/>
+          <w:smallCaps w:val="0"/>
+          <w:noProof w:val="0"/>
+          <w:color w:val="auto"/>
+          <w:sz w:val="24"/>
+          <w:szCs w:val="24"/>
+          <w:lang w:val="en-US"/>
+        </w:rPr>
+      </w:pPr>
+      <w:r>
+        <w:rPr>
+          <w:rFonts w:ascii="Calibri" w:hAnsi="Calibri" w:eastAsia="Calibri" w:cs="Calibri" w:asciiTheme="minorAscii" w:hAnsiTheme="minorAscii" w:eastAsiaTheme="minorAscii" w:cstheme="minorAscii"/>
+          <w:b w:val="0"/>
+          <w:bCs w:val="0"/>
+          <w:i w:val="0"/>
+          <w:iCs w:val="0"/>
+          <w:caps w:val="0"/>
+          <w:smallCaps w:val="0"/>
+          <w:noProof w:val="0"/>
+          <w:color w:val="auto"/>
+          <w:sz w:val="24"/>
+          <w:szCs w:val="24"/>
           <w:lang w:val="en-US"/>
         </w:rPr>
         <w:t>If the user says yes, ask for the new number of trucks and supply packs.</w:t>
@@ -263,33 +235,33 @@
           <w:numId w:val="1"/>
         </w:numPr>
         <w:rPr>
-          <w:rFonts w:ascii="system-ui" w:hAnsi="system-ui" w:eastAsia="system-ui" w:cs="system-ui"/>
-          <w:b w:val="0"/>
-          <w:bCs w:val="0"/>
-          <w:i w:val="0"/>
-          <w:iCs w:val="0"/>
-          <w:caps w:val="0"/>
-          <w:smallCaps w:val="0"/>
-          <w:noProof w:val="0"/>
-          <w:color w:val="auto"/>
-          <w:sz w:val="22"/>
-          <w:szCs w:val="22"/>
-          <w:lang w:val="en-US"/>
-        </w:rPr>
-      </w:pPr>
-      <w:r>
-        <w:rPr>
-          <w:rFonts w:ascii="system-ui" w:hAnsi="system-ui" w:eastAsia="system-ui" w:cs="system-ui"/>
-          <w:b w:val="0"/>
-          <w:bCs w:val="0"/>
-          <w:i w:val="0"/>
-          <w:iCs w:val="0"/>
-          <w:caps w:val="0"/>
-          <w:smallCaps w:val="0"/>
-          <w:noProof w:val="0"/>
-          <w:color w:val="auto"/>
-          <w:sz w:val="22"/>
-          <w:szCs w:val="22"/>
+          <w:rFonts w:ascii="Calibri" w:hAnsi="Calibri" w:eastAsia="Calibri" w:cs="Calibri" w:asciiTheme="minorAscii" w:hAnsiTheme="minorAscii" w:eastAsiaTheme="minorAscii" w:cstheme="minorAscii"/>
+          <w:b w:val="0"/>
+          <w:bCs w:val="0"/>
+          <w:i w:val="0"/>
+          <w:iCs w:val="0"/>
+          <w:caps w:val="0"/>
+          <w:smallCaps w:val="0"/>
+          <w:noProof w:val="0"/>
+          <w:color w:val="auto"/>
+          <w:sz w:val="24"/>
+          <w:szCs w:val="24"/>
+          <w:lang w:val="en-US"/>
+        </w:rPr>
+      </w:pPr>
+      <w:r>
+        <w:rPr>
+          <w:rFonts w:ascii="Calibri" w:hAnsi="Calibri" w:eastAsia="Calibri" w:cs="Calibri" w:asciiTheme="minorAscii" w:hAnsiTheme="minorAscii" w:eastAsiaTheme="minorAscii" w:cstheme="minorAscii"/>
+          <w:b w:val="0"/>
+          <w:bCs w:val="0"/>
+          <w:i w:val="0"/>
+          <w:iCs w:val="0"/>
+          <w:caps w:val="0"/>
+          <w:smallCaps w:val="0"/>
+          <w:noProof w:val="0"/>
+          <w:color w:val="auto"/>
+          <w:sz w:val="24"/>
+          <w:szCs w:val="24"/>
           <w:lang w:val="en-US"/>
         </w:rPr>
         <w:t>Ask the user if there is a new earthquake. If the answer is yes, continue the program. If it is no, show the stock available and end the program.</w:t>
@@ -303,36 +275,70 @@
           <w:numId w:val="1"/>
         </w:numPr>
         <w:rPr>
-          <w:rFonts w:ascii="system-ui" w:hAnsi="system-ui" w:eastAsia="system-ui" w:cs="system-ui"/>
-          <w:b w:val="0"/>
-          <w:bCs w:val="0"/>
-          <w:i w:val="0"/>
-          <w:iCs w:val="0"/>
-          <w:caps w:val="0"/>
-          <w:smallCaps w:val="0"/>
-          <w:noProof w:val="0"/>
-          <w:color w:val="auto"/>
-          <w:sz w:val="22"/>
-          <w:szCs w:val="22"/>
-          <w:lang w:val="en-US"/>
-        </w:rPr>
-      </w:pPr>
-      <w:r>
-        <w:rPr>
-          <w:rFonts w:ascii="system-ui" w:hAnsi="system-ui" w:eastAsia="system-ui" w:cs="system-ui"/>
-          <w:b w:val="0"/>
-          <w:bCs w:val="0"/>
-          <w:i w:val="0"/>
-          <w:iCs w:val="0"/>
-          <w:caps w:val="0"/>
-          <w:smallCaps w:val="0"/>
-          <w:noProof w:val="0"/>
-          <w:color w:val="auto"/>
-          <w:sz w:val="22"/>
-          <w:szCs w:val="22"/>
-          <w:lang w:val="en-US"/>
-        </w:rPr>
-        <w:t>Ask for the place of earthquake and radius of the area which will be show in the final report.</w:t>
+          <w:rFonts w:ascii="Calibri" w:hAnsi="Calibri" w:eastAsia="Calibri" w:cs="Calibri" w:asciiTheme="minorAscii" w:hAnsiTheme="minorAscii" w:eastAsiaTheme="minorAscii" w:cstheme="minorAscii"/>
+          <w:b w:val="0"/>
+          <w:bCs w:val="0"/>
+          <w:i w:val="0"/>
+          <w:iCs w:val="0"/>
+          <w:caps w:val="0"/>
+          <w:smallCaps w:val="0"/>
+          <w:noProof w:val="0"/>
+          <w:color w:val="auto"/>
+          <w:sz w:val="24"/>
+          <w:szCs w:val="24"/>
+          <w:lang w:val="en-US"/>
+        </w:rPr>
+      </w:pPr>
+      <w:r>
+        <w:rPr>
+          <w:rFonts w:ascii="Calibri" w:hAnsi="Calibri" w:eastAsia="Calibri" w:cs="Calibri" w:asciiTheme="minorAscii" w:hAnsiTheme="minorAscii" w:eastAsiaTheme="minorAscii" w:cstheme="minorAscii"/>
+          <w:b w:val="0"/>
+          <w:bCs w:val="0"/>
+          <w:i w:val="0"/>
+          <w:iCs w:val="0"/>
+          <w:caps w:val="0"/>
+          <w:smallCaps w:val="0"/>
+          <w:noProof w:val="0"/>
+          <w:color w:val="auto"/>
+          <w:sz w:val="24"/>
+          <w:szCs w:val="24"/>
+          <w:lang w:val="en-US"/>
+        </w:rPr>
+        <w:t xml:space="preserve">Ask for the place of earthquake and radius of the area which will </w:t>
+      </w:r>
+      <w:r>
+        <w:rPr>
+          <w:rFonts w:ascii="Calibri" w:hAnsi="Calibri" w:eastAsia="Calibri" w:cs="Calibri" w:asciiTheme="minorAscii" w:hAnsiTheme="minorAscii" w:eastAsiaTheme="minorAscii" w:cstheme="minorAscii"/>
+          <w:b w:val="0"/>
+          <w:bCs w:val="0"/>
+          <w:i w:val="0"/>
+          <w:iCs w:val="0"/>
+          <w:caps w:val="0"/>
+          <w:smallCaps w:val="0"/>
+          <w:noProof w:val="0"/>
+          <w:color w:val="auto"/>
+          <w:sz w:val="24"/>
+          <w:szCs w:val="24"/>
+          <w:lang w:val="en-US"/>
+        </w:rPr>
+        <w:t>show</w:t>
+      </w:r>
+      <w:r>
+        <w:rPr>
+          <w:rFonts w:ascii="Calibri" w:hAnsi="Calibri" w:eastAsia="Calibri" w:cs="Calibri" w:asciiTheme="minorAscii" w:hAnsiTheme="minorAscii" w:eastAsiaTheme="minorAscii" w:cstheme="minorAscii"/>
+          <w:b w:val="0"/>
+          <w:bCs w:val="0"/>
+          <w:i w:val="0"/>
+          <w:iCs w:val="0"/>
+          <w:caps w:val="0"/>
+          <w:smallCaps w:val="0"/>
+          <w:noProof w:val="0"/>
+          <w:color w:val="auto"/>
+          <w:sz w:val="24"/>
+          <w:szCs w:val="24"/>
+          <w:lang w:val="en-US"/>
+        </w:rPr>
+        <w:t xml:space="preserve"> in the final report.</w:t>
       </w:r>
     </w:p>
     <w:p>
@@ -343,33 +349,33 @@
           <w:numId w:val="1"/>
         </w:numPr>
         <w:rPr>
-          <w:rFonts w:ascii="system-ui" w:hAnsi="system-ui" w:eastAsia="system-ui" w:cs="system-ui"/>
-          <w:b w:val="0"/>
-          <w:bCs w:val="0"/>
-          <w:i w:val="0"/>
-          <w:iCs w:val="0"/>
-          <w:caps w:val="0"/>
-          <w:smallCaps w:val="0"/>
-          <w:noProof w:val="0"/>
-          <w:color w:val="auto"/>
-          <w:sz w:val="22"/>
-          <w:szCs w:val="22"/>
-          <w:lang w:val="en-US"/>
-        </w:rPr>
-      </w:pPr>
-      <w:r>
-        <w:rPr>
-          <w:rFonts w:ascii="system-ui" w:hAnsi="system-ui" w:eastAsia="system-ui" w:cs="system-ui"/>
-          <w:b w:val="0"/>
-          <w:bCs w:val="0"/>
-          <w:i w:val="0"/>
-          <w:iCs w:val="0"/>
-          <w:caps w:val="0"/>
-          <w:smallCaps w:val="0"/>
-          <w:noProof w:val="0"/>
-          <w:color w:val="auto"/>
-          <w:sz w:val="22"/>
-          <w:szCs w:val="22"/>
+          <w:rFonts w:ascii="Calibri" w:hAnsi="Calibri" w:eastAsia="Calibri" w:cs="Calibri" w:asciiTheme="minorAscii" w:hAnsiTheme="minorAscii" w:eastAsiaTheme="minorAscii" w:cstheme="minorAscii"/>
+          <w:b w:val="0"/>
+          <w:bCs w:val="0"/>
+          <w:i w:val="0"/>
+          <w:iCs w:val="0"/>
+          <w:caps w:val="0"/>
+          <w:smallCaps w:val="0"/>
+          <w:noProof w:val="0"/>
+          <w:color w:val="auto"/>
+          <w:sz w:val="24"/>
+          <w:szCs w:val="24"/>
+          <w:lang w:val="en-US"/>
+        </w:rPr>
+      </w:pPr>
+      <w:r>
+        <w:rPr>
+          <w:rFonts w:ascii="Calibri" w:hAnsi="Calibri" w:eastAsia="Calibri" w:cs="Calibri" w:asciiTheme="minorAscii" w:hAnsiTheme="minorAscii" w:eastAsiaTheme="minorAscii" w:cstheme="minorAscii"/>
+          <w:b w:val="0"/>
+          <w:bCs w:val="0"/>
+          <w:i w:val="0"/>
+          <w:iCs w:val="0"/>
+          <w:caps w:val="0"/>
+          <w:smallCaps w:val="0"/>
+          <w:noProof w:val="0"/>
+          <w:color w:val="auto"/>
+          <w:sz w:val="24"/>
+          <w:szCs w:val="24"/>
           <w:lang w:val="en-US"/>
         </w:rPr>
         <w:t>Take the relief request and ask these questions. If an answer is not valid, show an error and ask again</w:t>
@@ -379,37 +385,51 @@
       <w:pPr>
         <w:pStyle w:val="ListParagraph"/>
         <w:ind w:left="720"/>
-      </w:pPr>
-      <w:r>
-        <w:rPr>
-          <w:rFonts w:ascii="system-ui" w:hAnsi="system-ui" w:eastAsia="system-ui" w:cs="system-ui"/>
-          <w:b w:val="0"/>
-          <w:bCs w:val="0"/>
-          <w:i w:val="0"/>
-          <w:iCs w:val="0"/>
-          <w:caps w:val="0"/>
-          <w:smallCaps w:val="0"/>
-          <w:noProof w:val="0"/>
-          <w:color w:val="auto"/>
-          <w:sz w:val="22"/>
-          <w:szCs w:val="22"/>
-          <w:lang w:val="en-US"/>
-        </w:rPr>
-        <w:t>Whats</w:t>
-      </w:r>
-      <w:r>
-        <w:rPr>
-          <w:rFonts w:ascii="system-ui" w:hAnsi="system-ui" w:eastAsia="system-ui" w:cs="system-ui"/>
-          <w:b w:val="0"/>
-          <w:bCs w:val="0"/>
-          <w:i w:val="0"/>
-          <w:iCs w:val="0"/>
-          <w:caps w:val="0"/>
-          <w:smallCaps w:val="0"/>
-          <w:noProof w:val="0"/>
-          <w:color w:val="auto"/>
-          <w:sz w:val="22"/>
-          <w:szCs w:val="22"/>
+        <w:rPr>
+          <w:rFonts w:ascii="Calibri" w:hAnsi="Calibri" w:eastAsia="Calibri" w:cs="Calibri" w:asciiTheme="minorAscii" w:hAnsiTheme="minorAscii" w:eastAsiaTheme="minorAscii" w:cstheme="minorAscii"/>
+          <w:b w:val="0"/>
+          <w:bCs w:val="0"/>
+          <w:i w:val="0"/>
+          <w:iCs w:val="0"/>
+          <w:caps w:val="0"/>
+          <w:smallCaps w:val="0"/>
+          <w:noProof w:val="0"/>
+          <w:color w:val="auto"/>
+          <w:sz w:val="24"/>
+          <w:szCs w:val="24"/>
+          <w:lang w:val="en-US"/>
+        </w:rPr>
+      </w:pPr>
+      <w:r>
+        <w:rPr>
+          <w:rFonts w:ascii="Calibri" w:hAnsi="Calibri" w:eastAsia="Calibri" w:cs="Calibri" w:asciiTheme="minorAscii" w:hAnsiTheme="minorAscii" w:eastAsiaTheme="minorAscii" w:cstheme="minorAscii"/>
+          <w:b w:val="0"/>
+          <w:bCs w:val="0"/>
+          <w:i w:val="0"/>
+          <w:iCs w:val="0"/>
+          <w:caps w:val="0"/>
+          <w:smallCaps w:val="0"/>
+          <w:noProof w:val="0"/>
+          <w:color w:val="auto"/>
+          <w:sz w:val="24"/>
+          <w:szCs w:val="24"/>
+          <w:lang w:val="en-US"/>
+        </w:rPr>
+        <w:t>What's</w:t>
+      </w:r>
+      <w:r>
+        <w:rPr>
+          <w:rFonts w:ascii="Calibri" w:hAnsi="Calibri" w:eastAsia="Calibri" w:cs="Calibri" w:asciiTheme="minorAscii" w:hAnsiTheme="minorAscii" w:eastAsiaTheme="minorAscii" w:cstheme="minorAscii"/>
+          <w:b w:val="0"/>
+          <w:bCs w:val="0"/>
+          <w:i w:val="0"/>
+          <w:iCs w:val="0"/>
+          <w:caps w:val="0"/>
+          <w:smallCaps w:val="0"/>
+          <w:noProof w:val="0"/>
+          <w:color w:val="auto"/>
+          <w:sz w:val="24"/>
+          <w:szCs w:val="24"/>
           <w:lang w:val="en-US"/>
         </w:rPr>
         <w:t xml:space="preserve"> the area's name?</w:t>
@@ -419,20 +439,34 @@
       <w:pPr>
         <w:pStyle w:val="ListParagraph"/>
         <w:ind w:left="720"/>
-      </w:pPr>
-      <w:r>
-        <w:rPr>
-          <w:rFonts w:ascii="system-ui" w:hAnsi="system-ui" w:eastAsia="system-ui" w:cs="system-ui"/>
-          <w:b w:val="0"/>
-          <w:bCs w:val="0"/>
-          <w:i w:val="0"/>
-          <w:iCs w:val="0"/>
-          <w:caps w:val="0"/>
-          <w:smallCaps w:val="0"/>
-          <w:noProof w:val="0"/>
-          <w:color w:val="auto"/>
-          <w:sz w:val="22"/>
-          <w:szCs w:val="22"/>
+        <w:rPr>
+          <w:rFonts w:ascii="Calibri" w:hAnsi="Calibri" w:eastAsia="Calibri" w:cs="Calibri" w:asciiTheme="minorAscii" w:hAnsiTheme="minorAscii" w:eastAsiaTheme="minorAscii" w:cstheme="minorAscii"/>
+          <w:b w:val="0"/>
+          <w:bCs w:val="0"/>
+          <w:i w:val="0"/>
+          <w:iCs w:val="0"/>
+          <w:caps w:val="0"/>
+          <w:smallCaps w:val="0"/>
+          <w:noProof w:val="0"/>
+          <w:color w:val="auto"/>
+          <w:sz w:val="24"/>
+          <w:szCs w:val="24"/>
+          <w:lang w:val="en-US"/>
+        </w:rPr>
+      </w:pPr>
+      <w:r>
+        <w:rPr>
+          <w:rFonts w:ascii="Calibri" w:hAnsi="Calibri" w:eastAsia="Calibri" w:cs="Calibri" w:asciiTheme="minorAscii" w:hAnsiTheme="minorAscii" w:eastAsiaTheme="minorAscii" w:cstheme="minorAscii"/>
+          <w:b w:val="0"/>
+          <w:bCs w:val="0"/>
+          <w:i w:val="0"/>
+          <w:iCs w:val="0"/>
+          <w:caps w:val="0"/>
+          <w:smallCaps w:val="0"/>
+          <w:noProof w:val="0"/>
+          <w:color w:val="auto"/>
+          <w:sz w:val="24"/>
+          <w:szCs w:val="24"/>
           <w:lang w:val="en-US"/>
         </w:rPr>
         <w:t>Are people trapped? (Y/N)</w:t>
@@ -442,20 +476,34 @@
       <w:pPr>
         <w:pStyle w:val="ListParagraph"/>
         <w:ind w:left="720"/>
-      </w:pPr>
-      <w:r>
-        <w:rPr>
-          <w:rFonts w:ascii="system-ui" w:hAnsi="system-ui" w:eastAsia="system-ui" w:cs="system-ui"/>
-          <w:b w:val="0"/>
-          <w:bCs w:val="0"/>
-          <w:i w:val="0"/>
-          <w:iCs w:val="0"/>
-          <w:caps w:val="0"/>
-          <w:smallCaps w:val="0"/>
-          <w:noProof w:val="0"/>
-          <w:color w:val="auto"/>
-          <w:sz w:val="22"/>
-          <w:szCs w:val="22"/>
+        <w:rPr>
+          <w:rFonts w:ascii="Calibri" w:hAnsi="Calibri" w:eastAsia="Calibri" w:cs="Calibri" w:asciiTheme="minorAscii" w:hAnsiTheme="minorAscii" w:eastAsiaTheme="minorAscii" w:cstheme="minorAscii"/>
+          <w:b w:val="0"/>
+          <w:bCs w:val="0"/>
+          <w:i w:val="0"/>
+          <w:iCs w:val="0"/>
+          <w:caps w:val="0"/>
+          <w:smallCaps w:val="0"/>
+          <w:noProof w:val="0"/>
+          <w:color w:val="auto"/>
+          <w:sz w:val="24"/>
+          <w:szCs w:val="24"/>
+          <w:lang w:val="en-US"/>
+        </w:rPr>
+      </w:pPr>
+      <w:r>
+        <w:rPr>
+          <w:rFonts w:ascii="Calibri" w:hAnsi="Calibri" w:eastAsia="Calibri" w:cs="Calibri" w:asciiTheme="minorAscii" w:hAnsiTheme="minorAscii" w:eastAsiaTheme="minorAscii" w:cstheme="minorAscii"/>
+          <w:b w:val="0"/>
+          <w:bCs w:val="0"/>
+          <w:i w:val="0"/>
+          <w:iCs w:val="0"/>
+          <w:caps w:val="0"/>
+          <w:smallCaps w:val="0"/>
+          <w:noProof w:val="0"/>
+          <w:color w:val="auto"/>
+          <w:sz w:val="24"/>
+          <w:szCs w:val="24"/>
           <w:lang w:val="en-US"/>
         </w:rPr>
         <w:t>Do people need medical help? (Y/N)</w:t>
@@ -465,20 +513,34 @@
       <w:pPr>
         <w:pStyle w:val="ListParagraph"/>
         <w:ind w:left="720"/>
-      </w:pPr>
-      <w:r>
-        <w:rPr>
-          <w:rFonts w:ascii="system-ui" w:hAnsi="system-ui" w:eastAsia="system-ui" w:cs="system-ui"/>
-          <w:b w:val="0"/>
-          <w:bCs w:val="0"/>
-          <w:i w:val="0"/>
-          <w:iCs w:val="0"/>
-          <w:caps w:val="0"/>
-          <w:smallCaps w:val="0"/>
-          <w:noProof w:val="0"/>
-          <w:color w:val="auto"/>
-          <w:sz w:val="22"/>
-          <w:szCs w:val="22"/>
+        <w:rPr>
+          <w:rFonts w:ascii="Calibri" w:hAnsi="Calibri" w:eastAsia="Calibri" w:cs="Calibri" w:asciiTheme="minorAscii" w:hAnsiTheme="minorAscii" w:eastAsiaTheme="minorAscii" w:cstheme="minorAscii"/>
+          <w:b w:val="0"/>
+          <w:bCs w:val="0"/>
+          <w:i w:val="0"/>
+          <w:iCs w:val="0"/>
+          <w:caps w:val="0"/>
+          <w:smallCaps w:val="0"/>
+          <w:noProof w:val="0"/>
+          <w:color w:val="auto"/>
+          <w:sz w:val="24"/>
+          <w:szCs w:val="24"/>
+          <w:lang w:val="en-US"/>
+        </w:rPr>
+      </w:pPr>
+      <w:r>
+        <w:rPr>
+          <w:rFonts w:ascii="Calibri" w:hAnsi="Calibri" w:eastAsia="Calibri" w:cs="Calibri" w:asciiTheme="minorAscii" w:hAnsiTheme="minorAscii" w:eastAsiaTheme="minorAscii" w:cstheme="minorAscii"/>
+          <w:b w:val="0"/>
+          <w:bCs w:val="0"/>
+          <w:i w:val="0"/>
+          <w:iCs w:val="0"/>
+          <w:caps w:val="0"/>
+          <w:smallCaps w:val="0"/>
+          <w:noProof w:val="0"/>
+          <w:color w:val="auto"/>
+          <w:sz w:val="24"/>
+          <w:szCs w:val="24"/>
           <w:lang w:val="en-US"/>
         </w:rPr>
         <w:t>How many families are affected? (10-200)</w:t>
@@ -488,20 +550,34 @@
       <w:pPr>
         <w:pStyle w:val="ListParagraph"/>
         <w:ind w:left="720"/>
-      </w:pPr>
-      <w:r>
-        <w:rPr>
-          <w:rFonts w:ascii="system-ui" w:hAnsi="system-ui" w:eastAsia="system-ui" w:cs="system-ui"/>
-          <w:b w:val="0"/>
-          <w:bCs w:val="0"/>
-          <w:i w:val="0"/>
-          <w:iCs w:val="0"/>
-          <w:caps w:val="0"/>
-          <w:smallCaps w:val="0"/>
-          <w:noProof w:val="0"/>
-          <w:color w:val="auto"/>
-          <w:sz w:val="22"/>
-          <w:szCs w:val="22"/>
+        <w:rPr>
+          <w:rFonts w:ascii="Calibri" w:hAnsi="Calibri" w:eastAsia="Calibri" w:cs="Calibri" w:asciiTheme="minorAscii" w:hAnsiTheme="minorAscii" w:eastAsiaTheme="minorAscii" w:cstheme="minorAscii"/>
+          <w:b w:val="0"/>
+          <w:bCs w:val="0"/>
+          <w:i w:val="0"/>
+          <w:iCs w:val="0"/>
+          <w:caps w:val="0"/>
+          <w:smallCaps w:val="0"/>
+          <w:noProof w:val="0"/>
+          <w:color w:val="auto"/>
+          <w:sz w:val="24"/>
+          <w:szCs w:val="24"/>
+          <w:lang w:val="en-US"/>
+        </w:rPr>
+      </w:pPr>
+      <w:r>
+        <w:rPr>
+          <w:rFonts w:ascii="Calibri" w:hAnsi="Calibri" w:eastAsia="Calibri" w:cs="Calibri" w:asciiTheme="minorAscii" w:hAnsiTheme="minorAscii" w:eastAsiaTheme="minorAscii" w:cstheme="minorAscii"/>
+          <w:b w:val="0"/>
+          <w:bCs w:val="0"/>
+          <w:i w:val="0"/>
+          <w:iCs w:val="0"/>
+          <w:caps w:val="0"/>
+          <w:smallCaps w:val="0"/>
+          <w:noProof w:val="0"/>
+          <w:color w:val="auto"/>
+          <w:sz w:val="24"/>
+          <w:szCs w:val="24"/>
           <w:lang w:val="en-US"/>
         </w:rPr>
         <w:t>Are there children, elderly or disabled people? (Y/N)</w:t>
@@ -511,20 +587,34 @@
       <w:pPr>
         <w:pStyle w:val="ListParagraph"/>
         <w:ind w:left="720"/>
-      </w:pPr>
-      <w:r>
-        <w:rPr>
-          <w:rFonts w:ascii="system-ui" w:hAnsi="system-ui" w:eastAsia="system-ui" w:cs="system-ui"/>
-          <w:b w:val="0"/>
-          <w:bCs w:val="0"/>
-          <w:i w:val="0"/>
-          <w:iCs w:val="0"/>
-          <w:caps w:val="0"/>
-          <w:smallCaps w:val="0"/>
-          <w:noProof w:val="0"/>
-          <w:color w:val="auto"/>
-          <w:sz w:val="22"/>
-          <w:szCs w:val="22"/>
+        <w:rPr>
+          <w:rFonts w:ascii="Calibri" w:hAnsi="Calibri" w:eastAsia="Calibri" w:cs="Calibri" w:asciiTheme="minorAscii" w:hAnsiTheme="minorAscii" w:eastAsiaTheme="minorAscii" w:cstheme="minorAscii"/>
+          <w:b w:val="0"/>
+          <w:bCs w:val="0"/>
+          <w:i w:val="0"/>
+          <w:iCs w:val="0"/>
+          <w:caps w:val="0"/>
+          <w:smallCaps w:val="0"/>
+          <w:noProof w:val="0"/>
+          <w:color w:val="auto"/>
+          <w:sz w:val="24"/>
+          <w:szCs w:val="24"/>
+          <w:lang w:val="en-US"/>
+        </w:rPr>
+      </w:pPr>
+      <w:r>
+        <w:rPr>
+          <w:rFonts w:ascii="Calibri" w:hAnsi="Calibri" w:eastAsia="Calibri" w:cs="Calibri" w:asciiTheme="minorAscii" w:hAnsiTheme="minorAscii" w:eastAsiaTheme="minorAscii" w:cstheme="minorAscii"/>
+          <w:b w:val="0"/>
+          <w:bCs w:val="0"/>
+          <w:i w:val="0"/>
+          <w:iCs w:val="0"/>
+          <w:caps w:val="0"/>
+          <w:smallCaps w:val="0"/>
+          <w:noProof w:val="0"/>
+          <w:color w:val="auto"/>
+          <w:sz w:val="24"/>
+          <w:szCs w:val="24"/>
           <w:lang w:val="en-US"/>
         </w:rPr>
         <w:t>Is the local clinic working? (Y/N)</w:t>
@@ -534,20 +624,34 @@
       <w:pPr>
         <w:pStyle w:val="ListParagraph"/>
         <w:ind w:left="720"/>
-      </w:pPr>
-      <w:r>
-        <w:rPr>
-          <w:rFonts w:ascii="system-ui" w:hAnsi="system-ui" w:eastAsia="system-ui" w:cs="system-ui"/>
-          <w:b w:val="0"/>
-          <w:bCs w:val="0"/>
-          <w:i w:val="0"/>
-          <w:iCs w:val="0"/>
-          <w:caps w:val="0"/>
-          <w:smallCaps w:val="0"/>
-          <w:noProof w:val="0"/>
-          <w:color w:val="auto"/>
-          <w:sz w:val="22"/>
-          <w:szCs w:val="22"/>
+        <w:rPr>
+          <w:rFonts w:ascii="Calibri" w:hAnsi="Calibri" w:eastAsia="Calibri" w:cs="Calibri" w:asciiTheme="minorAscii" w:hAnsiTheme="minorAscii" w:eastAsiaTheme="minorAscii" w:cstheme="minorAscii"/>
+          <w:b w:val="0"/>
+          <w:bCs w:val="0"/>
+          <w:i w:val="0"/>
+          <w:iCs w:val="0"/>
+          <w:caps w:val="0"/>
+          <w:smallCaps w:val="0"/>
+          <w:noProof w:val="0"/>
+          <w:color w:val="auto"/>
+          <w:sz w:val="24"/>
+          <w:szCs w:val="24"/>
+          <w:lang w:val="en-US"/>
+        </w:rPr>
+      </w:pPr>
+      <w:r>
+        <w:rPr>
+          <w:rFonts w:ascii="Calibri" w:hAnsi="Calibri" w:eastAsia="Calibri" w:cs="Calibri" w:asciiTheme="minorAscii" w:hAnsiTheme="minorAscii" w:eastAsiaTheme="minorAscii" w:cstheme="minorAscii"/>
+          <w:b w:val="0"/>
+          <w:bCs w:val="0"/>
+          <w:i w:val="0"/>
+          <w:iCs w:val="0"/>
+          <w:caps w:val="0"/>
+          <w:smallCaps w:val="0"/>
+          <w:noProof w:val="0"/>
+          <w:color w:val="auto"/>
+          <w:sz w:val="24"/>
+          <w:szCs w:val="24"/>
           <w:lang w:val="en-US"/>
         </w:rPr>
         <w:t>Is there an aftershock warning? (Y/N)</w:t>
@@ -557,20 +661,34 @@
       <w:pPr>
         <w:pStyle w:val="ListParagraph"/>
         <w:ind w:left="720"/>
-      </w:pPr>
-      <w:r>
-        <w:rPr>
-          <w:rFonts w:ascii="system-ui" w:hAnsi="system-ui" w:eastAsia="system-ui" w:cs="system-ui"/>
-          <w:b w:val="0"/>
-          <w:bCs w:val="0"/>
-          <w:i w:val="0"/>
-          <w:iCs w:val="0"/>
-          <w:caps w:val="0"/>
-          <w:smallCaps w:val="0"/>
-          <w:noProof w:val="0"/>
-          <w:color w:val="auto"/>
-          <w:sz w:val="22"/>
-          <w:szCs w:val="22"/>
+        <w:rPr>
+          <w:rFonts w:ascii="Calibri" w:hAnsi="Calibri" w:eastAsia="Calibri" w:cs="Calibri" w:asciiTheme="minorAscii" w:hAnsiTheme="minorAscii" w:eastAsiaTheme="minorAscii" w:cstheme="minorAscii"/>
+          <w:b w:val="0"/>
+          <w:bCs w:val="0"/>
+          <w:i w:val="0"/>
+          <w:iCs w:val="0"/>
+          <w:caps w:val="0"/>
+          <w:smallCaps w:val="0"/>
+          <w:noProof w:val="0"/>
+          <w:color w:val="auto"/>
+          <w:sz w:val="24"/>
+          <w:szCs w:val="24"/>
+          <w:lang w:val="en-US"/>
+        </w:rPr>
+      </w:pPr>
+      <w:r>
+        <w:rPr>
+          <w:rFonts w:ascii="Calibri" w:hAnsi="Calibri" w:eastAsia="Calibri" w:cs="Calibri" w:asciiTheme="minorAscii" w:hAnsiTheme="minorAscii" w:eastAsiaTheme="minorAscii" w:cstheme="minorAscii"/>
+          <w:b w:val="0"/>
+          <w:bCs w:val="0"/>
+          <w:i w:val="0"/>
+          <w:iCs w:val="0"/>
+          <w:caps w:val="0"/>
+          <w:smallCaps w:val="0"/>
+          <w:noProof w:val="0"/>
+          <w:color w:val="auto"/>
+          <w:sz w:val="24"/>
+          <w:szCs w:val="24"/>
           <w:lang w:val="en-US"/>
         </w:rPr>
         <w:t>Is the road open or damaged? (O/D)</w:t>
@@ -580,54 +698,68 @@
       <w:pPr>
         <w:pStyle w:val="ListParagraph"/>
         <w:ind w:left="720"/>
-      </w:pPr>
-      <w:r>
-        <w:rPr>
-          <w:rFonts w:ascii="system-ui" w:hAnsi="system-ui" w:eastAsia="system-ui" w:cs="system-ui"/>
-          <w:b w:val="0"/>
-          <w:bCs w:val="0"/>
-          <w:i w:val="0"/>
-          <w:iCs w:val="0"/>
-          <w:caps w:val="0"/>
-          <w:smallCaps w:val="0"/>
-          <w:noProof w:val="0"/>
-          <w:color w:val="auto"/>
-          <w:sz w:val="22"/>
-          <w:szCs w:val="22"/>
+        <w:rPr>
+          <w:rFonts w:ascii="Calibri" w:hAnsi="Calibri" w:eastAsia="Calibri" w:cs="Calibri" w:asciiTheme="minorAscii" w:hAnsiTheme="minorAscii" w:eastAsiaTheme="minorAscii" w:cstheme="minorAscii"/>
+          <w:b w:val="0"/>
+          <w:bCs w:val="0"/>
+          <w:i w:val="0"/>
+          <w:iCs w:val="0"/>
+          <w:caps w:val="0"/>
+          <w:smallCaps w:val="0"/>
+          <w:noProof w:val="0"/>
+          <w:color w:val="auto"/>
+          <w:sz w:val="24"/>
+          <w:szCs w:val="24"/>
+          <w:lang w:val="en-US"/>
+        </w:rPr>
+      </w:pPr>
+      <w:r>
+        <w:rPr>
+          <w:rFonts w:ascii="Calibri" w:hAnsi="Calibri" w:eastAsia="Calibri" w:cs="Calibri" w:asciiTheme="minorAscii" w:hAnsiTheme="minorAscii" w:eastAsiaTheme="minorAscii" w:cstheme="minorAscii"/>
+          <w:b w:val="0"/>
+          <w:bCs w:val="0"/>
+          <w:i w:val="0"/>
+          <w:iCs w:val="0"/>
+          <w:caps w:val="0"/>
+          <w:smallCaps w:val="0"/>
+          <w:noProof w:val="0"/>
+          <w:color w:val="auto"/>
+          <w:sz w:val="24"/>
+          <w:szCs w:val="24"/>
           <w:lang w:val="en-US"/>
         </w:rPr>
         <w:t xml:space="preserve">Has the area already </w:t>
       </w:r>
       <w:r>
         <w:rPr>
-          <w:rFonts w:ascii="system-ui" w:hAnsi="system-ui" w:eastAsia="system-ui" w:cs="system-ui"/>
-          <w:b w:val="0"/>
-          <w:bCs w:val="0"/>
-          <w:i w:val="0"/>
-          <w:iCs w:val="0"/>
-          <w:caps w:val="0"/>
-          <w:smallCaps w:val="0"/>
-          <w:noProof w:val="0"/>
-          <w:color w:val="auto"/>
-          <w:sz w:val="22"/>
-          <w:szCs w:val="22"/>
-          <w:lang w:val="en-US"/>
-        </w:rPr>
-        <w:t>recieved</w:t>
-      </w:r>
-      <w:r>
-        <w:rPr>
-          <w:rFonts w:ascii="system-ui" w:hAnsi="system-ui" w:eastAsia="system-ui" w:cs="system-ui"/>
-          <w:b w:val="0"/>
-          <w:bCs w:val="0"/>
-          <w:i w:val="0"/>
-          <w:iCs w:val="0"/>
-          <w:caps w:val="0"/>
-          <w:smallCaps w:val="0"/>
-          <w:noProof w:val="0"/>
-          <w:color w:val="auto"/>
-          <w:sz w:val="22"/>
-          <w:szCs w:val="22"/>
+          <w:rFonts w:ascii="Calibri" w:hAnsi="Calibri" w:eastAsia="Calibri" w:cs="Calibri" w:asciiTheme="minorAscii" w:hAnsiTheme="minorAscii" w:eastAsiaTheme="minorAscii" w:cstheme="minorAscii"/>
+          <w:b w:val="0"/>
+          <w:bCs w:val="0"/>
+          <w:i w:val="0"/>
+          <w:iCs w:val="0"/>
+          <w:caps w:val="0"/>
+          <w:smallCaps w:val="0"/>
+          <w:noProof w:val="0"/>
+          <w:color w:val="auto"/>
+          <w:sz w:val="24"/>
+          <w:szCs w:val="24"/>
+          <w:lang w:val="en-US"/>
+        </w:rPr>
+        <w:t>received</w:t>
+      </w:r>
+      <w:r>
+        <w:rPr>
+          <w:rFonts w:ascii="Calibri" w:hAnsi="Calibri" w:eastAsia="Calibri" w:cs="Calibri" w:asciiTheme="minorAscii" w:hAnsiTheme="minorAscii" w:eastAsiaTheme="minorAscii" w:cstheme="minorAscii"/>
+          <w:b w:val="0"/>
+          <w:bCs w:val="0"/>
+          <w:i w:val="0"/>
+          <w:iCs w:val="0"/>
+          <w:caps w:val="0"/>
+          <w:smallCaps w:val="0"/>
+          <w:noProof w:val="0"/>
+          <w:color w:val="auto"/>
+          <w:sz w:val="24"/>
+          <w:szCs w:val="24"/>
           <w:lang w:val="en-US"/>
         </w:rPr>
         <w:t xml:space="preserve"> aid? (Y/N)</w:t>
@@ -641,33 +773,33 @@
           <w:numId w:val="1"/>
         </w:numPr>
         <w:rPr>
-          <w:rFonts w:ascii="system-ui" w:hAnsi="system-ui" w:eastAsia="system-ui" w:cs="system-ui"/>
-          <w:b w:val="0"/>
-          <w:bCs w:val="0"/>
-          <w:i w:val="0"/>
-          <w:iCs w:val="0"/>
-          <w:caps w:val="0"/>
-          <w:smallCaps w:val="0"/>
-          <w:noProof w:val="0"/>
-          <w:color w:val="auto"/>
-          <w:sz w:val="22"/>
-          <w:szCs w:val="22"/>
-          <w:lang w:val="en-US"/>
-        </w:rPr>
-      </w:pPr>
-      <w:r>
-        <w:rPr>
-          <w:rFonts w:ascii="system-ui" w:hAnsi="system-ui" w:eastAsia="system-ui" w:cs="system-ui"/>
-          <w:b w:val="0"/>
-          <w:bCs w:val="0"/>
-          <w:i w:val="0"/>
-          <w:iCs w:val="0"/>
-          <w:caps w:val="0"/>
-          <w:smallCaps w:val="0"/>
-          <w:noProof w:val="0"/>
-          <w:color w:val="auto"/>
-          <w:sz w:val="22"/>
-          <w:szCs w:val="22"/>
+          <w:rFonts w:ascii="Calibri" w:hAnsi="Calibri" w:eastAsia="Calibri" w:cs="Calibri" w:asciiTheme="minorAscii" w:hAnsiTheme="minorAscii" w:eastAsiaTheme="minorAscii" w:cstheme="minorAscii"/>
+          <w:b w:val="0"/>
+          <w:bCs w:val="0"/>
+          <w:i w:val="0"/>
+          <w:iCs w:val="0"/>
+          <w:caps w:val="0"/>
+          <w:smallCaps w:val="0"/>
+          <w:noProof w:val="0"/>
+          <w:color w:val="auto"/>
+          <w:sz w:val="24"/>
+          <w:szCs w:val="24"/>
+          <w:lang w:val="en-US"/>
+        </w:rPr>
+      </w:pPr>
+      <w:r>
+        <w:rPr>
+          <w:rFonts w:ascii="Calibri" w:hAnsi="Calibri" w:eastAsia="Calibri" w:cs="Calibri" w:asciiTheme="minorAscii" w:hAnsiTheme="minorAscii" w:eastAsiaTheme="minorAscii" w:cstheme="minorAscii"/>
+          <w:b w:val="0"/>
+          <w:bCs w:val="0"/>
+          <w:i w:val="0"/>
+          <w:iCs w:val="0"/>
+          <w:caps w:val="0"/>
+          <w:smallCaps w:val="0"/>
+          <w:noProof w:val="0"/>
+          <w:color w:val="auto"/>
+          <w:sz w:val="24"/>
+          <w:szCs w:val="24"/>
           <w:lang w:val="en-US"/>
         </w:rPr>
         <w:t xml:space="preserve">Work out the need score. </w:t>
@@ -676,144 +808,923 @@
     <w:p>
       <w:pPr>
         <w:pStyle w:val="ListParagraph"/>
+        <w:numPr>
+          <w:ilvl w:val="0"/>
+          <w:numId w:val="3"/>
+        </w:numPr>
+        <w:rPr>
+          <w:rFonts w:ascii="Calibri" w:hAnsi="Calibri" w:eastAsia="Calibri" w:cs="Calibri" w:asciiTheme="minorAscii" w:hAnsiTheme="minorAscii" w:eastAsiaTheme="minorAscii" w:cstheme="minorAscii"/>
+          <w:b w:val="0"/>
+          <w:bCs w:val="0"/>
+          <w:i w:val="0"/>
+          <w:iCs w:val="0"/>
+          <w:caps w:val="0"/>
+          <w:smallCaps w:val="0"/>
+          <w:noProof w:val="0"/>
+          <w:color w:val="auto"/>
+          <w:sz w:val="24"/>
+          <w:szCs w:val="24"/>
+          <w:lang w:val="en-US"/>
+        </w:rPr>
+      </w:pPr>
+      <w:r>
+        <w:rPr>
+          <w:rFonts w:ascii="Calibri" w:hAnsi="Calibri" w:eastAsia="Calibri" w:cs="Calibri" w:asciiTheme="minorAscii" w:hAnsiTheme="minorAscii" w:eastAsiaTheme="minorAscii" w:cstheme="minorAscii"/>
+          <w:b w:val="0"/>
+          <w:bCs w:val="0"/>
+          <w:i w:val="0"/>
+          <w:iCs w:val="0"/>
+          <w:caps w:val="0"/>
+          <w:smallCaps w:val="0"/>
+          <w:noProof w:val="0"/>
+          <w:color w:val="auto"/>
+          <w:sz w:val="24"/>
+          <w:szCs w:val="24"/>
+          <w:lang w:val="en-US"/>
+        </w:rPr>
+        <w:t xml:space="preserve">People </w:t>
+      </w:r>
+      <w:r>
+        <w:rPr>
+          <w:rFonts w:ascii="Calibri" w:hAnsi="Calibri" w:eastAsia="Calibri" w:cs="Calibri" w:asciiTheme="minorAscii" w:hAnsiTheme="minorAscii" w:eastAsiaTheme="minorAscii" w:cstheme="minorAscii"/>
+          <w:b w:val="0"/>
+          <w:bCs w:val="0"/>
+          <w:i w:val="0"/>
+          <w:iCs w:val="0"/>
+          <w:caps w:val="0"/>
+          <w:smallCaps w:val="0"/>
+          <w:noProof w:val="0"/>
+          <w:color w:val="auto"/>
+          <w:sz w:val="24"/>
+          <w:szCs w:val="24"/>
+          <w:lang w:val="en-US"/>
+        </w:rPr>
+        <w:t>points</w:t>
+      </w:r>
+      <w:r>
+        <w:rPr>
+          <w:rFonts w:ascii="Calibri" w:hAnsi="Calibri" w:eastAsia="Calibri" w:cs="Calibri" w:asciiTheme="minorAscii" w:hAnsiTheme="minorAscii" w:eastAsiaTheme="minorAscii" w:cstheme="minorAscii"/>
+          <w:b w:val="0"/>
+          <w:bCs w:val="0"/>
+          <w:i w:val="0"/>
+          <w:iCs w:val="0"/>
+          <w:caps w:val="0"/>
+          <w:smallCaps w:val="0"/>
+          <w:noProof w:val="0"/>
+          <w:color w:val="auto"/>
+          <w:sz w:val="24"/>
+          <w:szCs w:val="24"/>
+          <w:lang w:val="en-US"/>
+        </w:rPr>
+        <w:t xml:space="preserve"> (P): Total score 100. Add 30 if people are trapped, 25 if they need medical help (injured), 15 if there are vulnerable groups present, </w:t>
+      </w:r>
+      <w:r>
+        <w:rPr>
+          <w:rFonts w:ascii="Calibri" w:hAnsi="Calibri" w:eastAsia="Calibri" w:cs="Calibri" w:asciiTheme="minorAscii" w:hAnsiTheme="minorAscii" w:eastAsiaTheme="minorAscii" w:cstheme="minorAscii"/>
+          <w:b w:val="0"/>
+          <w:bCs w:val="0"/>
+          <w:i w:val="0"/>
+          <w:iCs w:val="0"/>
+          <w:caps w:val="0"/>
+          <w:smallCaps w:val="0"/>
+          <w:noProof w:val="0"/>
+          <w:color w:val="auto"/>
+          <w:sz w:val="24"/>
+          <w:szCs w:val="24"/>
+          <w:lang w:val="en-US"/>
+        </w:rPr>
+        <w:t>10  if</w:t>
+      </w:r>
+      <w:r>
+        <w:rPr>
+          <w:rFonts w:ascii="Calibri" w:hAnsi="Calibri" w:eastAsia="Calibri" w:cs="Calibri" w:asciiTheme="minorAscii" w:hAnsiTheme="minorAscii" w:eastAsiaTheme="minorAscii" w:cstheme="minorAscii"/>
+          <w:b w:val="0"/>
+          <w:bCs w:val="0"/>
+          <w:i w:val="0"/>
+          <w:iCs w:val="0"/>
+          <w:caps w:val="0"/>
+          <w:smallCaps w:val="0"/>
+          <w:noProof w:val="0"/>
+          <w:color w:val="auto"/>
+          <w:sz w:val="24"/>
+          <w:szCs w:val="24"/>
+          <w:lang w:val="en-US"/>
+        </w:rPr>
+        <w:t xml:space="preserve"> the local clinic is not working. Add point for families: 5 for 10-50 families, 10 for 51-100 families, 15 for 101-150 </w:t>
+      </w:r>
+      <w:r>
+        <w:rPr>
+          <w:rFonts w:ascii="Calibri" w:hAnsi="Calibri" w:eastAsia="Calibri" w:cs="Calibri" w:asciiTheme="minorAscii" w:hAnsiTheme="minorAscii" w:eastAsiaTheme="minorAscii" w:cstheme="minorAscii"/>
+          <w:b w:val="0"/>
+          <w:bCs w:val="0"/>
+          <w:i w:val="0"/>
+          <w:iCs w:val="0"/>
+          <w:caps w:val="0"/>
+          <w:smallCaps w:val="0"/>
+          <w:noProof w:val="0"/>
+          <w:color w:val="auto"/>
+          <w:sz w:val="24"/>
+          <w:szCs w:val="24"/>
+          <w:lang w:val="en-US"/>
+        </w:rPr>
+        <w:t>families,</w:t>
+      </w:r>
+      <w:r>
+        <w:rPr>
+          <w:rFonts w:ascii="Calibri" w:hAnsi="Calibri" w:eastAsia="Calibri" w:cs="Calibri" w:asciiTheme="minorAscii" w:hAnsiTheme="minorAscii" w:eastAsiaTheme="minorAscii" w:cstheme="minorAscii"/>
+          <w:b w:val="0"/>
+          <w:bCs w:val="0"/>
+          <w:i w:val="0"/>
+          <w:iCs w:val="0"/>
+          <w:caps w:val="0"/>
+          <w:smallCaps w:val="0"/>
+          <w:noProof w:val="0"/>
+          <w:color w:val="auto"/>
+          <w:sz w:val="24"/>
+          <w:szCs w:val="24"/>
+          <w:lang w:val="en-US"/>
+        </w:rPr>
+        <w:t xml:space="preserve"> and 20 for 151-200 families.</w:t>
+      </w:r>
+    </w:p>
+    <w:p>
+      <w:pPr>
+        <w:pStyle w:val="ListParagraph"/>
+        <w:numPr>
+          <w:ilvl w:val="0"/>
+          <w:numId w:val="3"/>
+        </w:numPr>
+        <w:rPr>
+          <w:rFonts w:ascii="Calibri" w:hAnsi="Calibri" w:eastAsia="Calibri" w:cs="Calibri" w:asciiTheme="minorAscii" w:hAnsiTheme="minorAscii" w:eastAsiaTheme="minorAscii" w:cstheme="minorAscii"/>
+          <w:b w:val="0"/>
+          <w:bCs w:val="0"/>
+          <w:i w:val="0"/>
+          <w:iCs w:val="0"/>
+          <w:caps w:val="0"/>
+          <w:smallCaps w:val="0"/>
+          <w:noProof w:val="0"/>
+          <w:color w:val="auto"/>
+          <w:sz w:val="24"/>
+          <w:szCs w:val="24"/>
+          <w:lang w:val="en-US"/>
+        </w:rPr>
+      </w:pPr>
+      <w:r>
+        <w:rPr>
+          <w:rFonts w:ascii="Calibri" w:hAnsi="Calibri" w:eastAsia="Calibri" w:cs="Calibri" w:asciiTheme="minorAscii" w:hAnsiTheme="minorAscii" w:eastAsiaTheme="minorAscii" w:cstheme="minorAscii"/>
+          <w:b w:val="0"/>
+          <w:bCs w:val="0"/>
+          <w:i w:val="0"/>
+          <w:iCs w:val="0"/>
+          <w:caps w:val="0"/>
+          <w:smallCaps w:val="0"/>
+          <w:noProof w:val="0"/>
+          <w:color w:val="auto"/>
+          <w:sz w:val="24"/>
+          <w:szCs w:val="24"/>
+          <w:lang w:val="en-US"/>
+        </w:rPr>
+        <w:t>Impact points (I): Total score 100 out of which 40 percent is for Aftershock Warning and 60 percent for Infrastructure Damage (12 for low damage, 36 for medium and 60 for high)</w:t>
+      </w:r>
+    </w:p>
+    <w:p>
+      <w:pPr>
+        <w:pStyle w:val="ListParagraph"/>
+        <w:numPr>
+          <w:ilvl w:val="0"/>
+          <w:numId w:val="3"/>
+        </w:numPr>
+        <w:rPr>
+          <w:rFonts w:ascii="Calibri" w:hAnsi="Calibri" w:eastAsia="Calibri" w:cs="Calibri" w:asciiTheme="minorAscii" w:hAnsiTheme="minorAscii" w:eastAsiaTheme="minorAscii" w:cstheme="minorAscii"/>
+          <w:b w:val="0"/>
+          <w:bCs w:val="0"/>
+          <w:i w:val="0"/>
+          <w:iCs w:val="0"/>
+          <w:caps w:val="0"/>
+          <w:smallCaps w:val="0"/>
+          <w:noProof w:val="0"/>
+          <w:color w:val="auto"/>
+          <w:sz w:val="24"/>
+          <w:szCs w:val="24"/>
+          <w:lang w:val="en-US"/>
+        </w:rPr>
+      </w:pPr>
+      <w:r>
+        <w:rPr>
+          <w:rFonts w:ascii="Calibri" w:hAnsi="Calibri" w:eastAsia="Calibri" w:cs="Calibri" w:asciiTheme="minorAscii" w:hAnsiTheme="minorAscii" w:eastAsiaTheme="minorAscii" w:cstheme="minorAscii"/>
+          <w:b w:val="0"/>
+          <w:bCs w:val="0"/>
+          <w:i w:val="0"/>
+          <w:iCs w:val="0"/>
+          <w:caps w:val="0"/>
+          <w:smallCaps w:val="0"/>
+          <w:noProof w:val="0"/>
+          <w:color w:val="auto"/>
+          <w:sz w:val="24"/>
+          <w:szCs w:val="24"/>
+          <w:lang w:val="en-US"/>
+        </w:rPr>
+        <w:t xml:space="preserve">Access points (A): 100 if </w:t>
+      </w:r>
+      <w:r>
+        <w:rPr>
+          <w:rFonts w:ascii="Calibri" w:hAnsi="Calibri" w:eastAsia="Calibri" w:cs="Calibri" w:asciiTheme="minorAscii" w:hAnsiTheme="minorAscii" w:eastAsiaTheme="minorAscii" w:cstheme="minorAscii"/>
+          <w:b w:val="0"/>
+          <w:bCs w:val="0"/>
+          <w:i w:val="0"/>
+          <w:iCs w:val="0"/>
+          <w:caps w:val="0"/>
+          <w:smallCaps w:val="0"/>
+          <w:noProof w:val="0"/>
+          <w:color w:val="auto"/>
+          <w:sz w:val="24"/>
+          <w:szCs w:val="24"/>
+          <w:lang w:val="en-US"/>
+        </w:rPr>
+        <w:t>the road</w:t>
+      </w:r>
+      <w:r>
+        <w:rPr>
+          <w:rFonts w:ascii="Calibri" w:hAnsi="Calibri" w:eastAsia="Calibri" w:cs="Calibri" w:asciiTheme="minorAscii" w:hAnsiTheme="minorAscii" w:eastAsiaTheme="minorAscii" w:cstheme="minorAscii"/>
+          <w:b w:val="0"/>
+          <w:bCs w:val="0"/>
+          <w:i w:val="0"/>
+          <w:iCs w:val="0"/>
+          <w:caps w:val="0"/>
+          <w:smallCaps w:val="0"/>
+          <w:noProof w:val="0"/>
+          <w:color w:val="auto"/>
+          <w:sz w:val="24"/>
+          <w:szCs w:val="24"/>
+          <w:lang w:val="en-US"/>
+        </w:rPr>
+        <w:t xml:space="preserve"> is damaged. 0 if it is open.</w:t>
+      </w:r>
+    </w:p>
+    <w:p>
+      <w:pPr>
+        <w:pStyle w:val="ListParagraph"/>
+        <w:numPr>
+          <w:ilvl w:val="0"/>
+          <w:numId w:val="3"/>
+        </w:numPr>
+        <w:rPr>
+          <w:rFonts w:ascii="Calibri" w:hAnsi="Calibri" w:eastAsia="Calibri" w:cs="Calibri" w:asciiTheme="minorAscii" w:hAnsiTheme="minorAscii" w:eastAsiaTheme="minorAscii" w:cstheme="minorAscii"/>
+          <w:b w:val="0"/>
+          <w:bCs w:val="0"/>
+          <w:i w:val="0"/>
+          <w:iCs w:val="0"/>
+          <w:caps w:val="0"/>
+          <w:smallCaps w:val="0"/>
+          <w:noProof w:val="0"/>
+          <w:color w:val="auto"/>
+          <w:sz w:val="24"/>
+          <w:szCs w:val="24"/>
+          <w:lang w:val="en-US"/>
+        </w:rPr>
+      </w:pPr>
+      <w:r>
+        <w:rPr>
+          <w:rFonts w:ascii="Calibri" w:hAnsi="Calibri" w:eastAsia="Calibri" w:cs="Calibri" w:asciiTheme="minorAscii" w:hAnsiTheme="minorAscii" w:eastAsiaTheme="minorAscii" w:cstheme="minorAscii"/>
+          <w:b w:val="0"/>
+          <w:bCs w:val="0"/>
+          <w:i w:val="0"/>
+          <w:iCs w:val="0"/>
+          <w:caps w:val="0"/>
+          <w:smallCaps w:val="0"/>
+          <w:noProof w:val="0"/>
+          <w:color w:val="auto"/>
+          <w:sz w:val="24"/>
+          <w:szCs w:val="24"/>
+          <w:lang w:val="en-US"/>
+        </w:rPr>
+        <w:t>Total Need Score = 50% P + 40% I + 10% A</w:t>
+      </w:r>
+    </w:p>
+    <w:p>
+      <w:pPr>
+        <w:pStyle w:val="ListParagraph"/>
+        <w:numPr>
+          <w:ilvl w:val="0"/>
+          <w:numId w:val="3"/>
+        </w:numPr>
+        <w:rPr>
+          <w:rFonts w:ascii="Calibri" w:hAnsi="Calibri" w:eastAsia="Calibri" w:cs="Calibri" w:asciiTheme="minorAscii" w:hAnsiTheme="minorAscii" w:eastAsiaTheme="minorAscii" w:cstheme="minorAscii"/>
+          <w:b w:val="0"/>
+          <w:bCs w:val="0"/>
+          <w:i w:val="0"/>
+          <w:iCs w:val="0"/>
+          <w:caps w:val="0"/>
+          <w:smallCaps w:val="0"/>
+          <w:noProof w:val="0"/>
+          <w:color w:val="auto"/>
+          <w:sz w:val="24"/>
+          <w:szCs w:val="24"/>
+          <w:lang w:val="en-US"/>
+        </w:rPr>
+      </w:pPr>
+      <w:r>
+        <w:rPr>
+          <w:rFonts w:ascii="Calibri" w:hAnsi="Calibri" w:eastAsia="Calibri" w:cs="Calibri" w:asciiTheme="minorAscii" w:hAnsiTheme="minorAscii" w:eastAsiaTheme="minorAscii" w:cstheme="minorAscii"/>
+          <w:b w:val="0"/>
+          <w:bCs w:val="0"/>
+          <w:i w:val="0"/>
+          <w:iCs w:val="0"/>
+          <w:caps w:val="0"/>
+          <w:smallCaps w:val="0"/>
+          <w:noProof w:val="0"/>
+          <w:color w:val="auto"/>
+          <w:sz w:val="24"/>
+          <w:szCs w:val="24"/>
+          <w:lang w:val="en-US"/>
+        </w:rPr>
+        <w:t xml:space="preserve">If the area has already </w:t>
+      </w:r>
+      <w:r>
+        <w:rPr>
+          <w:rFonts w:ascii="Calibri" w:hAnsi="Calibri" w:eastAsia="Calibri" w:cs="Calibri" w:asciiTheme="minorAscii" w:hAnsiTheme="minorAscii" w:eastAsiaTheme="minorAscii" w:cstheme="minorAscii"/>
+          <w:b w:val="0"/>
+          <w:bCs w:val="0"/>
+          <w:i w:val="0"/>
+          <w:iCs w:val="0"/>
+          <w:caps w:val="0"/>
+          <w:smallCaps w:val="0"/>
+          <w:noProof w:val="0"/>
+          <w:color w:val="auto"/>
+          <w:sz w:val="24"/>
+          <w:szCs w:val="24"/>
+          <w:lang w:val="en-US"/>
+        </w:rPr>
+        <w:t>received</w:t>
+      </w:r>
+      <w:r>
+        <w:rPr>
+          <w:rFonts w:ascii="Calibri" w:hAnsi="Calibri" w:eastAsia="Calibri" w:cs="Calibri" w:asciiTheme="minorAscii" w:hAnsiTheme="minorAscii" w:eastAsiaTheme="minorAscii" w:cstheme="minorAscii"/>
+          <w:b w:val="0"/>
+          <w:bCs w:val="0"/>
+          <w:i w:val="0"/>
+          <w:iCs w:val="0"/>
+          <w:caps w:val="0"/>
+          <w:smallCaps w:val="0"/>
+          <w:noProof w:val="0"/>
+          <w:color w:val="auto"/>
+          <w:sz w:val="24"/>
+          <w:szCs w:val="24"/>
+          <w:lang w:val="en-US"/>
+        </w:rPr>
+        <w:t xml:space="preserve"> aid, subtract 10.</w:t>
+      </w:r>
+    </w:p>
+    <w:p>
+      <w:pPr>
+        <w:pStyle w:val="ListParagraph"/>
+        <w:numPr>
+          <w:ilvl w:val="0"/>
+          <w:numId w:val="3"/>
+        </w:numPr>
+        <w:rPr>
+          <w:rFonts w:ascii="Calibri" w:hAnsi="Calibri" w:eastAsia="Calibri" w:cs="Calibri" w:asciiTheme="minorAscii" w:hAnsiTheme="minorAscii" w:eastAsiaTheme="minorAscii" w:cstheme="minorAscii"/>
+          <w:b w:val="0"/>
+          <w:bCs w:val="0"/>
+          <w:i w:val="0"/>
+          <w:iCs w:val="0"/>
+          <w:caps w:val="0"/>
+          <w:smallCaps w:val="0"/>
+          <w:noProof w:val="0"/>
+          <w:color w:val="auto"/>
+          <w:sz w:val="24"/>
+          <w:szCs w:val="24"/>
+          <w:lang w:val="en-US"/>
+        </w:rPr>
+      </w:pPr>
+      <w:r>
+        <w:rPr>
+          <w:rFonts w:ascii="Calibri" w:hAnsi="Calibri" w:eastAsia="Calibri" w:cs="Calibri" w:asciiTheme="minorAscii" w:hAnsiTheme="minorAscii" w:eastAsiaTheme="minorAscii" w:cstheme="minorAscii"/>
+          <w:b w:val="0"/>
+          <w:bCs w:val="0"/>
+          <w:i w:val="0"/>
+          <w:iCs w:val="0"/>
+          <w:caps w:val="0"/>
+          <w:smallCaps w:val="0"/>
+          <w:noProof w:val="0"/>
+          <w:color w:val="auto"/>
+          <w:sz w:val="24"/>
+          <w:szCs w:val="24"/>
+          <w:lang w:val="en-US"/>
+        </w:rPr>
+        <w:t>Keep the score between 0 and 100, round off to 1 decimal place.</w:t>
+      </w:r>
+    </w:p>
+    <w:p>
+      <w:pPr>
+        <w:pStyle w:val="ListParagraph"/>
+        <w:numPr>
+          <w:ilvl w:val="0"/>
+          <w:numId w:val="1"/>
+        </w:numPr>
+        <w:rPr>
+          <w:rFonts w:ascii="Calibri" w:hAnsi="Calibri" w:eastAsia="Calibri" w:cs="Calibri" w:asciiTheme="minorAscii" w:hAnsiTheme="minorAscii" w:eastAsiaTheme="minorAscii" w:cstheme="minorAscii"/>
+          <w:b w:val="0"/>
+          <w:bCs w:val="0"/>
+          <w:i w:val="0"/>
+          <w:iCs w:val="0"/>
+          <w:caps w:val="0"/>
+          <w:smallCaps w:val="0"/>
+          <w:noProof w:val="0"/>
+          <w:color w:val="auto"/>
+          <w:sz w:val="24"/>
+          <w:szCs w:val="24"/>
+          <w:lang w:val="en-US"/>
+        </w:rPr>
+      </w:pPr>
+      <w:r>
+        <w:rPr>
+          <w:rFonts w:ascii="Calibri" w:hAnsi="Calibri" w:eastAsia="Calibri" w:cs="Calibri" w:asciiTheme="minorAscii" w:hAnsiTheme="minorAscii" w:eastAsiaTheme="minorAscii" w:cstheme="minorAscii"/>
+          <w:b w:val="0"/>
+          <w:bCs w:val="0"/>
+          <w:i w:val="0"/>
+          <w:iCs w:val="0"/>
+          <w:caps w:val="0"/>
+          <w:smallCaps w:val="0"/>
+          <w:noProof w:val="0"/>
+          <w:color w:val="auto"/>
+          <w:sz w:val="24"/>
+          <w:szCs w:val="24"/>
+          <w:lang w:val="en-US"/>
+        </w:rPr>
+        <w:t>Choose the package the score has earned.</w:t>
+      </w:r>
+    </w:p>
+    <w:p>
+      <w:pPr>
+        <w:pStyle w:val="ListParagraph"/>
+        <w:numPr>
+          <w:ilvl w:val="0"/>
+          <w:numId w:val="4"/>
+        </w:numPr>
+        <w:spacing w:before="0" w:beforeAutospacing="off" w:after="0" w:afterAutospacing="off"/>
+        <w:rPr>
+          <w:rFonts w:ascii="Calibri" w:hAnsi="Calibri" w:eastAsia="Calibri" w:cs="Calibri" w:asciiTheme="minorAscii" w:hAnsiTheme="minorAscii" w:eastAsiaTheme="minorAscii" w:cstheme="minorAscii"/>
+          <w:noProof w:val="0"/>
+          <w:sz w:val="24"/>
+          <w:szCs w:val="24"/>
+          <w:lang w:val="en-US"/>
+        </w:rPr>
+      </w:pPr>
+      <w:r>
+        <w:rPr>
+          <w:rFonts w:ascii="Calibri" w:hAnsi="Calibri" w:eastAsia="Calibri" w:cs="Calibri" w:asciiTheme="minorAscii" w:hAnsiTheme="minorAscii" w:eastAsiaTheme="minorAscii" w:cstheme="minorAscii"/>
+          <w:noProof w:val="0"/>
+          <w:sz w:val="24"/>
+          <w:szCs w:val="24"/>
+          <w:lang w:val="en-US"/>
+        </w:rPr>
+        <w:t>65 or more: Full Relief (2 trucks, 50 packs)</w:t>
+      </w:r>
+    </w:p>
+    <w:p>
+      <w:pPr>
+        <w:pStyle w:val="ListParagraph"/>
+        <w:numPr>
+          <w:ilvl w:val="0"/>
+          <w:numId w:val="4"/>
+        </w:numPr>
+        <w:spacing w:before="0" w:beforeAutospacing="off" w:after="0" w:afterAutospacing="off"/>
+        <w:rPr>
+          <w:rFonts w:ascii="Calibri" w:hAnsi="Calibri" w:eastAsia="Calibri" w:cs="Calibri" w:asciiTheme="minorAscii" w:hAnsiTheme="minorAscii" w:eastAsiaTheme="minorAscii" w:cstheme="minorAscii"/>
+          <w:noProof w:val="0"/>
+          <w:sz w:val="24"/>
+          <w:szCs w:val="24"/>
+          <w:lang w:val="en-US"/>
+        </w:rPr>
+      </w:pPr>
+      <w:r>
+        <w:rPr>
+          <w:rFonts w:ascii="Calibri" w:hAnsi="Calibri" w:eastAsia="Calibri" w:cs="Calibri" w:asciiTheme="minorAscii" w:hAnsiTheme="minorAscii" w:eastAsiaTheme="minorAscii" w:cstheme="minorAscii"/>
+          <w:noProof w:val="0"/>
+          <w:sz w:val="24"/>
+          <w:szCs w:val="24"/>
+          <w:lang w:val="en-US"/>
+        </w:rPr>
+        <w:t>40 to 64.9: Standard Relief (1 truck, 30 packs)</w:t>
+      </w:r>
+    </w:p>
+    <w:p>
+      <w:pPr>
+        <w:pStyle w:val="ListParagraph"/>
+        <w:numPr>
+          <w:ilvl w:val="0"/>
+          <w:numId w:val="4"/>
+        </w:numPr>
+        <w:spacing w:before="0" w:beforeAutospacing="off" w:after="0" w:afterAutospacing="off"/>
+        <w:rPr>
+          <w:rFonts w:ascii="Calibri" w:hAnsi="Calibri" w:eastAsia="Calibri" w:cs="Calibri" w:asciiTheme="minorAscii" w:hAnsiTheme="minorAscii" w:eastAsiaTheme="minorAscii" w:cstheme="minorAscii"/>
+          <w:noProof w:val="0"/>
+          <w:sz w:val="24"/>
+          <w:szCs w:val="24"/>
+          <w:lang w:val="en-US"/>
+        </w:rPr>
+      </w:pPr>
+      <w:r>
+        <w:rPr>
+          <w:rFonts w:ascii="Calibri" w:hAnsi="Calibri" w:eastAsia="Calibri" w:cs="Calibri" w:asciiTheme="minorAscii" w:hAnsiTheme="minorAscii" w:eastAsiaTheme="minorAscii" w:cstheme="minorAscii"/>
+          <w:noProof w:val="0"/>
+          <w:sz w:val="24"/>
+          <w:szCs w:val="24"/>
+          <w:lang w:val="en-US"/>
+        </w:rPr>
+        <w:t>20 to 39.9: Emergency Kit (1 truck, 10 packs)</w:t>
+      </w:r>
+    </w:p>
+    <w:p>
+      <w:pPr>
+        <w:pStyle w:val="ListParagraph"/>
+        <w:numPr>
+          <w:ilvl w:val="0"/>
+          <w:numId w:val="4"/>
+        </w:numPr>
+        <w:spacing w:before="0" w:beforeAutospacing="off" w:after="0" w:afterAutospacing="off"/>
+        <w:rPr>
+          <w:rFonts w:ascii="Calibri" w:hAnsi="Calibri" w:eastAsia="Calibri" w:cs="Calibri" w:asciiTheme="minorAscii" w:hAnsiTheme="minorAscii" w:eastAsiaTheme="minorAscii" w:cstheme="minorAscii"/>
+          <w:noProof w:val="0"/>
+          <w:sz w:val="24"/>
+          <w:szCs w:val="24"/>
+          <w:lang w:val="en-US"/>
+        </w:rPr>
+      </w:pPr>
+      <w:r>
+        <w:rPr>
+          <w:rFonts w:ascii="Calibri" w:hAnsi="Calibri" w:eastAsia="Calibri" w:cs="Calibri" w:asciiTheme="minorAscii" w:hAnsiTheme="minorAscii" w:eastAsiaTheme="minorAscii" w:cstheme="minorAscii"/>
+          <w:noProof w:val="0"/>
+          <w:sz w:val="24"/>
+          <w:szCs w:val="24"/>
+          <w:lang w:val="en-US"/>
+        </w:rPr>
+        <w:t>Below 20: Defer / Monitor (nothing is sent)</w:t>
+      </w:r>
+    </w:p>
+    <w:p>
+      <w:pPr>
+        <w:pStyle w:val="ListParagraph"/>
+        <w:numPr>
+          <w:ilvl w:val="0"/>
+          <w:numId w:val="1"/>
+        </w:numPr>
+        <w:spacing w:before="0" w:beforeAutospacing="off" w:after="0" w:afterAutospacing="off"/>
+        <w:rPr>
+          <w:rFonts w:ascii="Calibri" w:hAnsi="Calibri" w:eastAsia="Calibri" w:cs="Calibri" w:asciiTheme="minorAscii" w:hAnsiTheme="minorAscii" w:eastAsiaTheme="minorAscii" w:cstheme="minorAscii"/>
+          <w:noProof w:val="0"/>
+          <w:sz w:val="24"/>
+          <w:szCs w:val="24"/>
+          <w:lang w:val="en-US"/>
+        </w:rPr>
+      </w:pPr>
+      <w:r>
+        <w:rPr>
+          <w:rFonts w:ascii="Calibri" w:hAnsi="Calibri" w:eastAsia="Calibri" w:cs="Calibri" w:asciiTheme="minorAscii" w:hAnsiTheme="minorAscii" w:eastAsiaTheme="minorAscii" w:cstheme="minorAscii"/>
+          <w:noProof w:val="0"/>
+          <w:sz w:val="24"/>
+          <w:szCs w:val="24"/>
+          <w:lang w:val="en-US"/>
+        </w:rPr>
+        <w:t xml:space="preserve">Send </w:t>
+      </w:r>
+      <w:r>
+        <w:rPr>
+          <w:rFonts w:ascii="Calibri" w:hAnsi="Calibri" w:eastAsia="Calibri" w:cs="Calibri" w:asciiTheme="minorAscii" w:hAnsiTheme="minorAscii" w:eastAsiaTheme="minorAscii" w:cstheme="minorAscii"/>
+          <w:noProof w:val="0"/>
+          <w:sz w:val="24"/>
+          <w:szCs w:val="24"/>
+          <w:lang w:val="en-US"/>
+        </w:rPr>
+        <w:t>the relief:</w:t>
+      </w:r>
+    </w:p>
+    <w:p>
+      <w:pPr>
+        <w:pStyle w:val="ListParagraph"/>
+        <w:spacing w:before="0" w:beforeAutospacing="off" w:after="0" w:afterAutospacing="off"/>
         <w:ind w:left="720"/>
-      </w:pPr>
-      <w:r>
-        <w:rPr>
-          <w:rFonts w:ascii="system-ui" w:hAnsi="system-ui" w:eastAsia="system-ui" w:cs="system-ui"/>
-          <w:b w:val="0"/>
-          <w:bCs w:val="0"/>
-          <w:i w:val="0"/>
-          <w:iCs w:val="0"/>
-          <w:caps w:val="0"/>
-          <w:smallCaps w:val="0"/>
-          <w:noProof w:val="0"/>
-          <w:color w:val="auto"/>
-          <w:sz w:val="22"/>
-          <w:szCs w:val="22"/>
-          <w:lang w:val="en-US"/>
-        </w:rPr>
-        <w:t xml:space="preserve">People </w:t>
-      </w:r>
-      <w:r>
-        <w:rPr>
-          <w:rFonts w:ascii="system-ui" w:hAnsi="system-ui" w:eastAsia="system-ui" w:cs="system-ui"/>
-          <w:b w:val="0"/>
-          <w:bCs w:val="0"/>
-          <w:i w:val="0"/>
-          <w:iCs w:val="0"/>
-          <w:caps w:val="0"/>
-          <w:smallCaps w:val="0"/>
-          <w:noProof w:val="0"/>
-          <w:color w:val="auto"/>
-          <w:sz w:val="22"/>
-          <w:szCs w:val="22"/>
-          <w:lang w:val="en-US"/>
-        </w:rPr>
-        <w:t>points</w:t>
-      </w:r>
-      <w:r>
-        <w:rPr>
-          <w:rFonts w:ascii="system-ui" w:hAnsi="system-ui" w:eastAsia="system-ui" w:cs="system-ui"/>
-          <w:b w:val="0"/>
-          <w:bCs w:val="0"/>
-          <w:i w:val="0"/>
-          <w:iCs w:val="0"/>
-          <w:caps w:val="0"/>
-          <w:smallCaps w:val="0"/>
-          <w:noProof w:val="0"/>
-          <w:color w:val="auto"/>
-          <w:sz w:val="22"/>
-          <w:szCs w:val="22"/>
-          <w:lang w:val="en-US"/>
-        </w:rPr>
-        <w:t xml:space="preserve"> (P): Total score 100. Add 30 if people are trapped, 25 if they need medical help (injured), 15 if there are vulnerable groups present, </w:t>
-      </w:r>
-      <w:r>
-        <w:rPr>
-          <w:rFonts w:ascii="system-ui" w:hAnsi="system-ui" w:eastAsia="system-ui" w:cs="system-ui"/>
-          <w:b w:val="0"/>
-          <w:bCs w:val="0"/>
-          <w:i w:val="0"/>
-          <w:iCs w:val="0"/>
-          <w:caps w:val="0"/>
-          <w:smallCaps w:val="0"/>
-          <w:noProof w:val="0"/>
-          <w:color w:val="auto"/>
-          <w:sz w:val="22"/>
-          <w:szCs w:val="22"/>
-          <w:lang w:val="en-US"/>
-        </w:rPr>
-        <w:t>10  if</w:t>
-      </w:r>
-      <w:r>
-        <w:rPr>
-          <w:rFonts w:ascii="system-ui" w:hAnsi="system-ui" w:eastAsia="system-ui" w:cs="system-ui"/>
-          <w:b w:val="0"/>
-          <w:bCs w:val="0"/>
-          <w:i w:val="0"/>
-          <w:iCs w:val="0"/>
-          <w:caps w:val="0"/>
-          <w:smallCaps w:val="0"/>
-          <w:noProof w:val="0"/>
-          <w:color w:val="auto"/>
-          <w:sz w:val="22"/>
-          <w:szCs w:val="22"/>
-          <w:lang w:val="en-US"/>
-        </w:rPr>
-        <w:t xml:space="preserve"> the local clinic is not working. Add point for families: 5 for 10-50 families, 10 for 51-100 families, 15 for 101-150 families and 20 for 151-200 families.</w:t>
-      </w:r>
-    </w:p>
-    <w:p>
-      <w:pPr>
-        <w:pStyle w:val="ListParagraph"/>
+        <w:rPr>
+          <w:rFonts w:ascii="Calibri" w:hAnsi="Calibri" w:eastAsia="Calibri" w:cs="Calibri" w:asciiTheme="minorAscii" w:hAnsiTheme="minorAscii" w:eastAsiaTheme="minorAscii" w:cstheme="minorAscii"/>
+          <w:noProof w:val="0"/>
+          <w:sz w:val="24"/>
+          <w:szCs w:val="24"/>
+          <w:lang w:val="en-US"/>
+        </w:rPr>
+      </w:pPr>
+      <w:r>
+        <w:rPr>
+          <w:rFonts w:ascii="Calibri" w:hAnsi="Calibri" w:eastAsia="Calibri" w:cs="Calibri" w:asciiTheme="minorAscii" w:hAnsiTheme="minorAscii" w:eastAsiaTheme="minorAscii" w:cstheme="minorAscii"/>
+          <w:noProof w:val="0"/>
+          <w:sz w:val="24"/>
+          <w:szCs w:val="24"/>
+          <w:lang w:val="en-US"/>
+        </w:rPr>
+        <w:t>If the score is below 20, mark the request as Defer/Monitor and send nothing.</w:t>
+      </w:r>
+    </w:p>
+    <w:p>
+      <w:pPr>
+        <w:pStyle w:val="ListParagraph"/>
+        <w:spacing w:before="0" w:beforeAutospacing="off" w:after="0" w:afterAutospacing="off"/>
         <w:ind w:left="720"/>
-      </w:pPr>
-      <w:r>
-        <w:rPr>
-          <w:rFonts w:ascii="system-ui" w:hAnsi="system-ui" w:eastAsia="system-ui" w:cs="system-ui"/>
-          <w:b w:val="0"/>
-          <w:bCs w:val="0"/>
-          <w:i w:val="0"/>
-          <w:iCs w:val="0"/>
-          <w:caps w:val="0"/>
-          <w:smallCaps w:val="0"/>
-          <w:noProof w:val="0"/>
-          <w:color w:val="auto"/>
-          <w:sz w:val="22"/>
-          <w:szCs w:val="22"/>
-          <w:lang w:val="en-US"/>
-        </w:rPr>
-        <w:t>Impact points (I): Total score 100 out of which 40 percent is for Aftershock Warning and 60 percent for Infrastructure Damage (12 for low damage, 36 for medium and 60 for high)</w:t>
-      </w:r>
-    </w:p>
-    <w:p>
-      <w:pPr>
-        <w:pStyle w:val="ListParagraph"/>
+        <w:rPr>
+          <w:rFonts w:ascii="Calibri" w:hAnsi="Calibri" w:eastAsia="Calibri" w:cs="Calibri" w:asciiTheme="minorAscii" w:hAnsiTheme="minorAscii" w:eastAsiaTheme="minorAscii" w:cstheme="minorAscii"/>
+          <w:noProof w:val="0"/>
+          <w:sz w:val="24"/>
+          <w:szCs w:val="24"/>
+          <w:lang w:val="en-US"/>
+        </w:rPr>
+      </w:pPr>
+      <w:r>
+        <w:rPr>
+          <w:rFonts w:ascii="Calibri" w:hAnsi="Calibri" w:eastAsia="Calibri" w:cs="Calibri" w:asciiTheme="minorAscii" w:hAnsiTheme="minorAscii" w:eastAsiaTheme="minorAscii" w:cstheme="minorAscii"/>
+          <w:noProof w:val="0"/>
+          <w:sz w:val="24"/>
+          <w:szCs w:val="24"/>
+          <w:lang w:val="en-US"/>
+        </w:rPr>
+        <w:t xml:space="preserve">Otherwise, check whether enough resources are available for selected </w:t>
+      </w:r>
+      <w:r>
+        <w:rPr>
+          <w:rFonts w:ascii="Calibri" w:hAnsi="Calibri" w:eastAsia="Calibri" w:cs="Calibri" w:asciiTheme="minorAscii" w:hAnsiTheme="minorAscii" w:eastAsiaTheme="minorAscii" w:cstheme="minorAscii"/>
+          <w:noProof w:val="0"/>
+          <w:sz w:val="24"/>
+          <w:szCs w:val="24"/>
+          <w:lang w:val="en-US"/>
+        </w:rPr>
+        <w:t>packages</w:t>
+      </w:r>
+      <w:r>
+        <w:rPr>
+          <w:rFonts w:ascii="Calibri" w:hAnsi="Calibri" w:eastAsia="Calibri" w:cs="Calibri" w:asciiTheme="minorAscii" w:hAnsiTheme="minorAscii" w:eastAsiaTheme="minorAscii" w:cstheme="minorAscii"/>
+          <w:noProof w:val="0"/>
+          <w:sz w:val="24"/>
+          <w:szCs w:val="24"/>
+          <w:lang w:val="en-US"/>
+        </w:rPr>
+        <w:t>.</w:t>
+      </w:r>
+    </w:p>
+    <w:p>
+      <w:pPr>
+        <w:pStyle w:val="ListParagraph"/>
+        <w:spacing w:before="0" w:beforeAutospacing="off" w:after="0" w:afterAutospacing="off"/>
         <w:ind w:left="720"/>
         <w:rPr>
-          <w:rFonts w:ascii="system-ui" w:hAnsi="system-ui" w:eastAsia="system-ui" w:cs="system-ui"/>
-          <w:b w:val="0"/>
-          <w:bCs w:val="0"/>
-          <w:i w:val="0"/>
-          <w:iCs w:val="0"/>
-          <w:caps w:val="0"/>
-          <w:smallCaps w:val="0"/>
-          <w:noProof w:val="0"/>
-          <w:color w:val="auto"/>
-          <w:sz w:val="22"/>
-          <w:szCs w:val="22"/>
-          <w:lang w:val="en-US"/>
-        </w:rPr>
-      </w:pPr>
+          <w:rFonts w:ascii="Calibri" w:hAnsi="Calibri" w:eastAsia="Calibri" w:cs="Calibri" w:asciiTheme="minorAscii" w:hAnsiTheme="minorAscii" w:eastAsiaTheme="minorAscii" w:cstheme="minorAscii"/>
+          <w:noProof w:val="0"/>
+          <w:sz w:val="24"/>
+          <w:szCs w:val="24"/>
+          <w:lang w:val="en-US"/>
+        </w:rPr>
+      </w:pPr>
+      <w:r>
+        <w:rPr>
+          <w:rFonts w:ascii="Calibri" w:hAnsi="Calibri" w:eastAsia="Calibri" w:cs="Calibri" w:asciiTheme="minorAscii" w:hAnsiTheme="minorAscii" w:eastAsiaTheme="minorAscii" w:cstheme="minorAscii"/>
+          <w:noProof w:val="0"/>
+          <w:sz w:val="24"/>
+          <w:szCs w:val="24"/>
+          <w:lang w:val="en-US"/>
+        </w:rPr>
+        <w:t>If enough resources are available, send the package and minus the resources used from the stock.</w:t>
+      </w:r>
+    </w:p>
+    <w:p>
+      <w:pPr>
+        <w:pStyle w:val="ListParagraph"/>
+        <w:spacing w:before="0" w:beforeAutospacing="off" w:after="0" w:afterAutospacing="off"/>
+        <w:ind w:left="720"/>
+        <w:rPr>
+          <w:rFonts w:ascii="Calibri" w:hAnsi="Calibri" w:eastAsia="Calibri" w:cs="Calibri" w:asciiTheme="minorAscii" w:hAnsiTheme="minorAscii" w:eastAsiaTheme="minorAscii" w:cstheme="minorAscii"/>
+          <w:noProof w:val="0"/>
+          <w:sz w:val="24"/>
+          <w:szCs w:val="24"/>
+          <w:lang w:val="en-US"/>
+        </w:rPr>
+      </w:pPr>
+      <w:r>
+        <w:rPr>
+          <w:rFonts w:ascii="Calibri" w:hAnsi="Calibri" w:eastAsia="Calibri" w:cs="Calibri" w:asciiTheme="minorAscii" w:hAnsiTheme="minorAscii" w:eastAsiaTheme="minorAscii" w:cstheme="minorAscii"/>
+          <w:noProof w:val="0"/>
+          <w:sz w:val="24"/>
+          <w:szCs w:val="24"/>
+          <w:lang w:val="en-US"/>
+        </w:rPr>
+        <w:t>If there are not enough resources, try the next smaller package and check again.</w:t>
+      </w:r>
+    </w:p>
+    <w:p>
+      <w:pPr>
+        <w:pStyle w:val="ListParagraph"/>
+        <w:spacing w:before="0" w:beforeAutospacing="off" w:after="0" w:afterAutospacing="off"/>
+        <w:ind w:left="720"/>
+        <w:rPr>
+          <w:rFonts w:ascii="Calibri" w:hAnsi="Calibri" w:eastAsia="Calibri" w:cs="Calibri" w:asciiTheme="minorAscii" w:hAnsiTheme="minorAscii" w:eastAsiaTheme="minorAscii" w:cstheme="minorAscii"/>
+          <w:noProof w:val="0"/>
+          <w:sz w:val="24"/>
+          <w:szCs w:val="24"/>
+          <w:lang w:val="en-US"/>
+        </w:rPr>
+      </w:pPr>
+      <w:r>
+        <w:rPr>
+          <w:rFonts w:ascii="Calibri" w:hAnsi="Calibri" w:eastAsia="Calibri" w:cs="Calibri" w:asciiTheme="minorAscii" w:hAnsiTheme="minorAscii" w:eastAsiaTheme="minorAscii" w:cstheme="minorAscii"/>
+          <w:noProof w:val="0"/>
+          <w:sz w:val="24"/>
+          <w:szCs w:val="24"/>
+          <w:lang w:val="en-US"/>
+        </w:rPr>
+        <w:t xml:space="preserve">If even the even the emergency kit cannot be </w:t>
+      </w:r>
+      <w:r>
+        <w:rPr>
+          <w:rFonts w:ascii="Calibri" w:hAnsi="Calibri" w:eastAsia="Calibri" w:cs="Calibri" w:asciiTheme="minorAscii" w:hAnsiTheme="minorAscii" w:eastAsiaTheme="minorAscii" w:cstheme="minorAscii"/>
+          <w:noProof w:val="0"/>
+          <w:sz w:val="24"/>
+          <w:szCs w:val="24"/>
+          <w:lang w:val="en-US"/>
+        </w:rPr>
+        <w:t>send</w:t>
+      </w:r>
+      <w:r>
+        <w:rPr>
+          <w:rFonts w:ascii="Calibri" w:hAnsi="Calibri" w:eastAsia="Calibri" w:cs="Calibri" w:asciiTheme="minorAscii" w:hAnsiTheme="minorAscii" w:eastAsiaTheme="minorAscii" w:cstheme="minorAscii"/>
+          <w:noProof w:val="0"/>
+          <w:sz w:val="24"/>
+          <w:szCs w:val="24"/>
+          <w:lang w:val="en-US"/>
+        </w:rPr>
+        <w:t>, mark the request as "deferred: not enough stock".</w:t>
+      </w:r>
+    </w:p>
+    <w:p>
+      <w:pPr>
+        <w:pStyle w:val="ListParagraph"/>
+        <w:numPr>
+          <w:ilvl w:val="0"/>
+          <w:numId w:val="1"/>
+        </w:numPr>
+        <w:spacing w:before="0" w:beforeAutospacing="off" w:after="0" w:afterAutospacing="off"/>
+        <w:rPr>
+          <w:rFonts w:ascii="Calibri" w:hAnsi="Calibri" w:eastAsia="Calibri" w:cs="Calibri" w:asciiTheme="minorAscii" w:hAnsiTheme="minorAscii" w:eastAsiaTheme="minorAscii" w:cstheme="minorAscii"/>
+          <w:noProof w:val="0"/>
+          <w:sz w:val="24"/>
+          <w:szCs w:val="24"/>
+          <w:lang w:val="en-US"/>
+        </w:rPr>
+      </w:pPr>
+      <w:r>
+        <w:rPr>
+          <w:rFonts w:ascii="Calibri" w:hAnsi="Calibri" w:eastAsia="Calibri" w:cs="Calibri" w:asciiTheme="minorAscii" w:hAnsiTheme="minorAscii" w:eastAsiaTheme="minorAscii" w:cstheme="minorAscii"/>
+          <w:noProof w:val="0"/>
+          <w:sz w:val="24"/>
+          <w:szCs w:val="24"/>
+          <w:lang w:val="en-US"/>
+        </w:rPr>
+        <w:t>Show the result of this request and the remaining stock.</w:t>
+      </w:r>
+    </w:p>
+    <w:p>
+      <w:pPr>
+        <w:pStyle w:val="ListParagraph"/>
+        <w:numPr>
+          <w:ilvl w:val="0"/>
+          <w:numId w:val="1"/>
+        </w:numPr>
+        <w:spacing w:before="0" w:beforeAutospacing="off" w:after="0" w:afterAutospacing="off"/>
+        <w:rPr>
+          <w:rFonts w:ascii="Calibri" w:hAnsi="Calibri" w:eastAsia="Calibri" w:cs="Calibri" w:asciiTheme="minorAscii" w:hAnsiTheme="minorAscii" w:eastAsiaTheme="minorAscii" w:cstheme="minorAscii"/>
+          <w:noProof w:val="0"/>
+          <w:sz w:val="24"/>
+          <w:szCs w:val="24"/>
+          <w:lang w:val="en-US"/>
+        </w:rPr>
+      </w:pPr>
+      <w:r>
+        <w:rPr>
+          <w:rFonts w:ascii="Calibri" w:hAnsi="Calibri" w:eastAsia="Calibri" w:cs="Calibri" w:asciiTheme="minorAscii" w:hAnsiTheme="minorAscii" w:eastAsiaTheme="minorAscii" w:cstheme="minorAscii"/>
+          <w:noProof w:val="0"/>
+          <w:sz w:val="24"/>
+          <w:szCs w:val="24"/>
+          <w:lang w:val="en-US"/>
+        </w:rPr>
+        <w:t>Ask if there is another request. If yes, go back to step 8.</w:t>
+      </w:r>
+    </w:p>
+    <w:p>
+      <w:pPr>
+        <w:pStyle w:val="ListParagraph"/>
+        <w:numPr>
+          <w:ilvl w:val="0"/>
+          <w:numId w:val="1"/>
+        </w:numPr>
+        <w:spacing w:before="0" w:beforeAutospacing="off" w:after="0" w:afterAutospacing="off"/>
+        <w:rPr>
+          <w:rFonts w:ascii="Calibri" w:hAnsi="Calibri" w:eastAsia="Calibri" w:cs="Calibri" w:asciiTheme="minorAscii" w:hAnsiTheme="minorAscii" w:eastAsiaTheme="minorAscii" w:cstheme="minorAscii"/>
+          <w:noProof w:val="0"/>
+          <w:sz w:val="24"/>
+          <w:szCs w:val="24"/>
+          <w:lang w:val="en-US"/>
+        </w:rPr>
+      </w:pPr>
+      <w:r>
+        <w:rPr>
+          <w:rFonts w:ascii="Calibri" w:hAnsi="Calibri" w:eastAsia="Calibri" w:cs="Calibri" w:asciiTheme="minorAscii" w:hAnsiTheme="minorAscii" w:eastAsiaTheme="minorAscii" w:cstheme="minorAscii"/>
+          <w:noProof w:val="0"/>
+          <w:sz w:val="24"/>
+          <w:szCs w:val="24"/>
+          <w:lang w:val="en-US"/>
+        </w:rPr>
+        <w:t xml:space="preserve">Show the summary of this earthquake: how many requests </w:t>
+      </w:r>
+      <w:r>
+        <w:rPr>
+          <w:rFonts w:ascii="Calibri" w:hAnsi="Calibri" w:eastAsia="Calibri" w:cs="Calibri" w:asciiTheme="minorAscii" w:hAnsiTheme="minorAscii" w:eastAsiaTheme="minorAscii" w:cstheme="minorAscii"/>
+          <w:noProof w:val="0"/>
+          <w:sz w:val="24"/>
+          <w:szCs w:val="24"/>
+          <w:lang w:val="en-US"/>
+        </w:rPr>
+        <w:t>were received</w:t>
+      </w:r>
+      <w:r>
+        <w:rPr>
+          <w:rFonts w:ascii="Calibri" w:hAnsi="Calibri" w:eastAsia="Calibri" w:cs="Calibri" w:asciiTheme="minorAscii" w:hAnsiTheme="minorAscii" w:eastAsiaTheme="minorAscii" w:cstheme="minorAscii"/>
+          <w:noProof w:val="0"/>
+          <w:sz w:val="24"/>
+          <w:szCs w:val="24"/>
+          <w:lang w:val="en-US"/>
+        </w:rPr>
+        <w:t xml:space="preserve"> for</w:t>
+      </w:r>
+      <w:r>
+        <w:rPr>
+          <w:rFonts w:ascii="Calibri" w:hAnsi="Calibri" w:eastAsia="Calibri" w:cs="Calibri" w:asciiTheme="minorAscii" w:hAnsiTheme="minorAscii" w:eastAsiaTheme="minorAscii" w:cstheme="minorAscii"/>
+          <w:noProof w:val="0"/>
+          <w:sz w:val="24"/>
+          <w:szCs w:val="24"/>
+          <w:lang w:val="en-US"/>
+        </w:rPr>
+        <w:t xml:space="preserve"> each package, how many were deferred, and the stock used and </w:t>
+      </w:r>
+      <w:r>
+        <w:rPr>
+          <w:rFonts w:ascii="Calibri" w:hAnsi="Calibri" w:eastAsia="Calibri" w:cs="Calibri" w:asciiTheme="minorAscii" w:hAnsiTheme="minorAscii" w:eastAsiaTheme="minorAscii" w:cstheme="minorAscii"/>
+          <w:noProof w:val="0"/>
+          <w:sz w:val="24"/>
+          <w:szCs w:val="24"/>
+          <w:lang w:val="en-US"/>
+        </w:rPr>
+        <w:t>remaining</w:t>
+      </w:r>
+      <w:r>
+        <w:rPr>
+          <w:rFonts w:ascii="Calibri" w:hAnsi="Calibri" w:eastAsia="Calibri" w:cs="Calibri" w:asciiTheme="minorAscii" w:hAnsiTheme="minorAscii" w:eastAsiaTheme="minorAscii" w:cstheme="minorAscii"/>
+          <w:noProof w:val="0"/>
+          <w:sz w:val="24"/>
+          <w:szCs w:val="24"/>
+          <w:lang w:val="en-US"/>
+        </w:rPr>
+        <w:t>.</w:t>
+      </w:r>
+    </w:p>
+    <w:p>
+      <w:pPr>
+        <w:pStyle w:val="ListParagraph"/>
+        <w:numPr>
+          <w:ilvl w:val="0"/>
+          <w:numId w:val="1"/>
+        </w:numPr>
+        <w:spacing w:before="0" w:beforeAutospacing="off" w:after="0" w:afterAutospacing="off"/>
+        <w:rPr>
+          <w:rFonts w:ascii="Calibri" w:hAnsi="Calibri" w:eastAsia="Calibri" w:cs="Calibri" w:asciiTheme="minorAscii" w:hAnsiTheme="minorAscii" w:eastAsiaTheme="minorAscii" w:cstheme="minorAscii"/>
+          <w:noProof w:val="0"/>
+          <w:sz w:val="24"/>
+          <w:szCs w:val="24"/>
+          <w:lang w:val="en-US"/>
+        </w:rPr>
+      </w:pPr>
+      <w:r>
+        <w:rPr>
+          <w:rFonts w:ascii="Calibri" w:hAnsi="Calibri" w:eastAsia="Calibri" w:cs="Calibri" w:asciiTheme="minorAscii" w:hAnsiTheme="minorAscii" w:eastAsiaTheme="minorAscii" w:cstheme="minorAscii"/>
+          <w:noProof w:val="0"/>
+          <w:sz w:val="24"/>
+          <w:szCs w:val="24"/>
+          <w:lang w:val="en-US"/>
+        </w:rPr>
+        <w:t xml:space="preserve">Go back to step 4. </w:t>
+      </w:r>
     </w:p>
     <w:sectPr>
       <w:pgSz w:w="12240" w:h="15840" w:orient="portrait"/>
       <w:pgMar w:top="1440" w:right="1440" w:bottom="1440" w:left="1440" w:header="720" w:footer="720" w:gutter="0"/>
       <w:cols w:space="720"/>
       <w:docGrid w:linePitch="360"/>
-      <w:headerReference w:type="default" r:id="R51f666e6be274a04"/>
-      <w:footerReference w:type="default" r:id="R8fcdf26f9a904499"/>
+      <w:headerReference w:type="default" r:id="R83b3a3c94a5d427e"/>
+      <w:footerReference w:type="default" r:id="Rf8aee95656c5420a"/>
     </w:sectPr>
   </w:body>
 </w:document>
@@ -961,6 +1872,315 @@
 
 <file path=word/numbering.xml><?xml version="1.0" encoding="utf-8"?>
 <w:numbering xmlns:w="http://schemas.openxmlformats.org/wordprocessingml/2006/main">
+  <w:abstractNum xmlns:w="http://schemas.openxmlformats.org/wordprocessingml/2006/main" w:abstractNumId="4">
+    <w:nsid w:val="2dd1ca4c"/>
+    <w:multiLevelType xmlns:w="http://schemas.openxmlformats.org/wordprocessingml/2006/main" w:val="hybridMultilevel"/>
+    <w:lvl xmlns:w="http://schemas.openxmlformats.org/wordprocessingml/2006/main" w:ilvl="0">
+      <w:start w:val="1"/>
+      <w:numFmt w:val="bullet"/>
+      <w:lvlText w:val=""/>
+      <w:lvlJc w:val="left"/>
+      <w:pPr>
+        <w:ind w:left="1080" w:hanging="360"/>
+      </w:pPr>
+      <w:rPr>
+        <w:rFonts w:hint="default" w:ascii="Symbol" w:hAnsi="Symbol"/>
+      </w:rPr>
+    </w:lvl>
+    <w:lvl xmlns:w="http://schemas.openxmlformats.org/wordprocessingml/2006/main" w:ilvl="1">
+      <w:start w:val="1"/>
+      <w:numFmt w:val="bullet"/>
+      <w:lvlText w:val="o"/>
+      <w:lvlJc w:val="left"/>
+      <w:pPr>
+        <w:ind w:left="1800" w:hanging="360"/>
+      </w:pPr>
+      <w:rPr>
+        <w:rFonts w:hint="default" w:ascii="Courier New" w:hAnsi="Courier New"/>
+      </w:rPr>
+    </w:lvl>
+    <w:lvl xmlns:w="http://schemas.openxmlformats.org/wordprocessingml/2006/main" w:ilvl="2">
+      <w:start w:val="1"/>
+      <w:numFmt w:val="bullet"/>
+      <w:lvlText w:val=""/>
+      <w:lvlJc w:val="left"/>
+      <w:pPr>
+        <w:ind w:left="2520" w:hanging="360"/>
+      </w:pPr>
+      <w:rPr>
+        <w:rFonts w:hint="default" w:ascii="Wingdings" w:hAnsi="Wingdings"/>
+      </w:rPr>
+    </w:lvl>
+    <w:lvl xmlns:w="http://schemas.openxmlformats.org/wordprocessingml/2006/main" w:ilvl="3">
+      <w:start w:val="1"/>
+      <w:numFmt w:val="bullet"/>
+      <w:lvlText w:val=""/>
+      <w:lvlJc w:val="left"/>
+      <w:pPr>
+        <w:ind w:left="3240" w:hanging="360"/>
+      </w:pPr>
+      <w:rPr>
+        <w:rFonts w:hint="default" w:ascii="Symbol" w:hAnsi="Symbol"/>
+      </w:rPr>
+    </w:lvl>
+    <w:lvl xmlns:w="http://schemas.openxmlformats.org/wordprocessingml/2006/main" w:ilvl="4">
+      <w:start w:val="1"/>
+      <w:numFmt w:val="bullet"/>
+      <w:lvlText w:val="o"/>
+      <w:lvlJc w:val="left"/>
+      <w:pPr>
+        <w:ind w:left="3960" w:hanging="360"/>
+      </w:pPr>
+      <w:rPr>
+        <w:rFonts w:hint="default" w:ascii="Courier New" w:hAnsi="Courier New"/>
+      </w:rPr>
+    </w:lvl>
+    <w:lvl xmlns:w="http://schemas.openxmlformats.org/wordprocessingml/2006/main" w:ilvl="5">
+      <w:start w:val="1"/>
+      <w:numFmt w:val="bullet"/>
+      <w:lvlText w:val=""/>
+      <w:lvlJc w:val="left"/>
+      <w:pPr>
+        <w:ind w:left="4680" w:hanging="360"/>
+      </w:pPr>
+      <w:rPr>
+        <w:rFonts w:hint="default" w:ascii="Wingdings" w:hAnsi="Wingdings"/>
+      </w:rPr>
+    </w:lvl>
+    <w:lvl xmlns:w="http://schemas.openxmlformats.org/wordprocessingml/2006/main" w:ilvl="6">
+      <w:start w:val="1"/>
+      <w:numFmt w:val="bullet"/>
+      <w:lvlText w:val=""/>
+      <w:lvlJc w:val="left"/>
+      <w:pPr>
+        <w:ind w:left="5400" w:hanging="360"/>
+      </w:pPr>
+      <w:rPr>
+        <w:rFonts w:hint="default" w:ascii="Symbol" w:hAnsi="Symbol"/>
+      </w:rPr>
+    </w:lvl>
+    <w:lvl xmlns:w="http://schemas.openxmlformats.org/wordprocessingml/2006/main" w:ilvl="7">
+      <w:start w:val="1"/>
+      <w:numFmt w:val="bullet"/>
+      <w:lvlText w:val="o"/>
+      <w:lvlJc w:val="left"/>
+      <w:pPr>
+        <w:ind w:left="6120" w:hanging="360"/>
+      </w:pPr>
+      <w:rPr>
+        <w:rFonts w:hint="default" w:ascii="Courier New" w:hAnsi="Courier New"/>
+      </w:rPr>
+    </w:lvl>
+    <w:lvl xmlns:w="http://schemas.openxmlformats.org/wordprocessingml/2006/main" w:ilvl="8">
+      <w:start w:val="1"/>
+      <w:numFmt w:val="bullet"/>
+      <w:lvlText w:val=""/>
+      <w:lvlJc w:val="left"/>
+      <w:pPr>
+        <w:ind w:left="6840" w:hanging="360"/>
+      </w:pPr>
+      <w:rPr>
+        <w:rFonts w:hint="default" w:ascii="Wingdings" w:hAnsi="Wingdings"/>
+      </w:rPr>
+    </w:lvl>
+  </w:abstractNum>
+  <w:abstractNum xmlns:w="http://schemas.openxmlformats.org/wordprocessingml/2006/main" w:abstractNumId="3">
+    <w:nsid w:val="661c6507"/>
+    <w:multiLevelType xmlns:w="http://schemas.openxmlformats.org/wordprocessingml/2006/main" w:val="hybridMultilevel"/>
+    <w:lvl xmlns:w="http://schemas.openxmlformats.org/wordprocessingml/2006/main" w:ilvl="0">
+      <w:start w:val="1"/>
+      <w:numFmt w:val="bullet"/>
+      <w:lvlText w:val=""/>
+      <w:lvlJc w:val="left"/>
+      <w:pPr>
+        <w:ind w:left="720" w:hanging="360"/>
+      </w:pPr>
+      <w:rPr>
+        <w:rFonts w:hint="default" w:ascii="Symbol" w:hAnsi="Symbol"/>
+      </w:rPr>
+    </w:lvl>
+    <w:lvl xmlns:w="http://schemas.openxmlformats.org/wordprocessingml/2006/main" w:ilvl="1">
+      <w:start w:val="1"/>
+      <w:numFmt w:val="bullet"/>
+      <w:lvlText w:val="o"/>
+      <w:lvlJc w:val="left"/>
+      <w:pPr>
+        <w:ind w:left="1440" w:hanging="360"/>
+      </w:pPr>
+      <w:rPr>
+        <w:rFonts w:hint="default" w:ascii="Courier New" w:hAnsi="Courier New"/>
+      </w:rPr>
+    </w:lvl>
+    <w:lvl xmlns:w="http://schemas.openxmlformats.org/wordprocessingml/2006/main" w:ilvl="2">
+      <w:start w:val="1"/>
+      <w:numFmt w:val="bullet"/>
+      <w:lvlText w:val=""/>
+      <w:lvlJc w:val="left"/>
+      <w:pPr>
+        <w:ind w:left="2160" w:hanging="360"/>
+      </w:pPr>
+      <w:rPr>
+        <w:rFonts w:hint="default" w:ascii="Wingdings" w:hAnsi="Wingdings"/>
+      </w:rPr>
+    </w:lvl>
+    <w:lvl xmlns:w="http://schemas.openxmlformats.org/wordprocessingml/2006/main" w:ilvl="3">
+      <w:start w:val="1"/>
+      <w:numFmt w:val="bullet"/>
+      <w:lvlText w:val=""/>
+      <w:lvlJc w:val="left"/>
+      <w:pPr>
+        <w:ind w:left="2880" w:hanging="360"/>
+      </w:pPr>
+      <w:rPr>
+        <w:rFonts w:hint="default" w:ascii="Symbol" w:hAnsi="Symbol"/>
+      </w:rPr>
+    </w:lvl>
+    <w:lvl xmlns:w="http://schemas.openxmlformats.org/wordprocessingml/2006/main" w:ilvl="4">
+      <w:start w:val="1"/>
+      <w:numFmt w:val="bullet"/>
+      <w:lvlText w:val="o"/>
+      <w:lvlJc w:val="left"/>
+      <w:pPr>
+        <w:ind w:left="3600" w:hanging="360"/>
+      </w:pPr>
+      <w:rPr>
+        <w:rFonts w:hint="default" w:ascii="Courier New" w:hAnsi="Courier New"/>
+      </w:rPr>
+    </w:lvl>
+    <w:lvl xmlns:w="http://schemas.openxmlformats.org/wordprocessingml/2006/main" w:ilvl="5">
+      <w:start w:val="1"/>
+      <w:numFmt w:val="bullet"/>
+      <w:lvlText w:val=""/>
+      <w:lvlJc w:val="left"/>
+      <w:pPr>
+        <w:ind w:left="4320" w:hanging="360"/>
+      </w:pPr>
+      <w:rPr>
+        <w:rFonts w:hint="default" w:ascii="Wingdings" w:hAnsi="Wingdings"/>
+      </w:rPr>
+    </w:lvl>
+    <w:lvl xmlns:w="http://schemas.openxmlformats.org/wordprocessingml/2006/main" w:ilvl="6">
+      <w:start w:val="1"/>
+      <w:numFmt w:val="bullet"/>
+      <w:lvlText w:val=""/>
+      <w:lvlJc w:val="left"/>
+      <w:pPr>
+        <w:ind w:left="5040" w:hanging="360"/>
+      </w:pPr>
+      <w:rPr>
+        <w:rFonts w:hint="default" w:ascii="Symbol" w:hAnsi="Symbol"/>
+      </w:rPr>
+    </w:lvl>
+    <w:lvl xmlns:w="http://schemas.openxmlformats.org/wordprocessingml/2006/main" w:ilvl="7">
+      <w:start w:val="1"/>
+      <w:numFmt w:val="bullet"/>
+      <w:lvlText w:val="o"/>
+      <w:lvlJc w:val="left"/>
+      <w:pPr>
+        <w:ind w:left="5760" w:hanging="360"/>
+      </w:pPr>
+      <w:rPr>
+        <w:rFonts w:hint="default" w:ascii="Courier New" w:hAnsi="Courier New"/>
+      </w:rPr>
+    </w:lvl>
+    <w:lvl xmlns:w="http://schemas.openxmlformats.org/wordprocessingml/2006/main" w:ilvl="8">
+      <w:start w:val="1"/>
+      <w:numFmt w:val="bullet"/>
+      <w:lvlText w:val=""/>
+      <w:lvlJc w:val="left"/>
+      <w:pPr>
+        <w:ind w:left="6480" w:hanging="360"/>
+      </w:pPr>
+      <w:rPr>
+        <w:rFonts w:hint="default" w:ascii="Wingdings" w:hAnsi="Wingdings"/>
+      </w:rPr>
+    </w:lvl>
+  </w:abstractNum>
+  <w:abstractNum xmlns:w="http://schemas.openxmlformats.org/wordprocessingml/2006/main" w:abstractNumId="2">
+    <w:nsid w:val="6cfd8221"/>
+    <w:multiLevelType xmlns:w="http://schemas.openxmlformats.org/wordprocessingml/2006/main" w:val="hybridMultilevel"/>
+    <w:lvl xmlns:w="http://schemas.openxmlformats.org/wordprocessingml/2006/main" w:ilvl="0">
+      <w:start w:val="1"/>
+      <w:numFmt w:val="lowerRoman"/>
+      <w:lvlText w:val="%1."/>
+      <w:lvlJc w:val="right"/>
+      <w:pPr>
+        <w:ind w:left="1080" w:hanging="360"/>
+      </w:pPr>
+    </w:lvl>
+    <w:lvl xmlns:w="http://schemas.openxmlformats.org/wordprocessingml/2006/main" w:ilvl="1">
+      <w:start w:val="1"/>
+      <w:numFmt w:val="lowerLetter"/>
+      <w:lvlText w:val="%2."/>
+      <w:lvlJc w:val="left"/>
+      <w:pPr>
+        <w:ind w:left="1800" w:hanging="360"/>
+      </w:pPr>
+    </w:lvl>
+    <w:lvl xmlns:w="http://schemas.openxmlformats.org/wordprocessingml/2006/main" w:ilvl="2">
+      <w:start w:val="1"/>
+      <w:numFmt w:val="lowerRoman"/>
+      <w:lvlText w:val="%3."/>
+      <w:lvlJc w:val="right"/>
+      <w:pPr>
+        <w:ind w:left="2520" w:hanging="180"/>
+      </w:pPr>
+    </w:lvl>
+    <w:lvl xmlns:w="http://schemas.openxmlformats.org/wordprocessingml/2006/main" w:ilvl="3">
+      <w:start w:val="1"/>
+      <w:numFmt w:val="decimal"/>
+      <w:lvlText w:val="%4."/>
+      <w:lvlJc w:val="left"/>
+      <w:pPr>
+        <w:ind w:left="3240" w:hanging="360"/>
+      </w:pPr>
+    </w:lvl>
+    <w:lvl xmlns:w="http://schemas.openxmlformats.org/wordprocessingml/2006/main" w:ilvl="4">
+      <w:start w:val="1"/>
+      <w:numFmt w:val="lowerLetter"/>
+      <w:lvlText w:val="%5."/>
+      <w:lvlJc w:val="left"/>
+      <w:pPr>
+        <w:ind w:left="3960" w:hanging="360"/>
+      </w:pPr>
+    </w:lvl>
+    <w:lvl xmlns:w="http://schemas.openxmlformats.org/wordprocessingml/2006/main" w:ilvl="5">
+      <w:start w:val="1"/>
+      <w:numFmt w:val="lowerRoman"/>
+      <w:lvlText w:val="%6."/>
+      <w:lvlJc w:val="right"/>
+      <w:pPr>
+        <w:ind w:left="4680" w:hanging="180"/>
+      </w:pPr>
+    </w:lvl>
+    <w:lvl xmlns:w="http://schemas.openxmlformats.org/wordprocessingml/2006/main" w:ilvl="6">
+      <w:start w:val="1"/>
+      <w:numFmt w:val="decimal"/>
+      <w:lvlText w:val="%7."/>
+      <w:lvlJc w:val="left"/>
+      <w:pPr>
+        <w:ind w:left="5400" w:hanging="360"/>
+      </w:pPr>
+    </w:lvl>
+    <w:lvl xmlns:w="http://schemas.openxmlformats.org/wordprocessingml/2006/main" w:ilvl="7">
+      <w:start w:val="1"/>
+      <w:numFmt w:val="lowerLetter"/>
+      <w:lvlText w:val="%8."/>
+      <w:lvlJc w:val="left"/>
+      <w:pPr>
+        <w:ind w:left="6120" w:hanging="360"/>
+      </w:pPr>
+    </w:lvl>
+    <w:lvl xmlns:w="http://schemas.openxmlformats.org/wordprocessingml/2006/main" w:ilvl="8">
+      <w:start w:val="1"/>
+      <w:numFmt w:val="lowerRoman"/>
+      <w:lvlText w:val="%9."/>
+      <w:lvlJc w:val="right"/>
+      <w:pPr>
+        <w:ind w:left="6840" w:hanging="180"/>
+      </w:pPr>
+    </w:lvl>
+  </w:abstractNum>
   <w:abstractNum xmlns:w="http://schemas.openxmlformats.org/wordprocessingml/2006/main" w:abstractNumId="1">
     <w:nsid w:val="6defc954"/>
     <w:multiLevelType xmlns:w="http://schemas.openxmlformats.org/wordprocessingml/2006/main" w:val="hybridMultilevel"/>
@@ -1046,6 +2266,15 @@
       </w:pPr>
     </w:lvl>
   </w:abstractNum>
+  <w:num w:numId="4">
+    <w:abstractNumId w:val="4"/>
+  </w:num>
+  <w:num w:numId="3">
+    <w:abstractNumId w:val="3"/>
+  </w:num>
+  <w:num w:numId="2">
+    <w:abstractNumId w:val="2"/>
+  </w:num>
   <w:num w:numId="1">
     <w:abstractNumId w:val="1"/>
   </w:num>
@@ -1483,7 +2712,7 @@
     <w:name w:val="List Paragraph"/>
     <w:basedOn w:val="Normal"/>
     <w:qFormat/>
-    <w:rsid w:val="5DDDC42A"/>
+    <w:rsid w:val="58B6CBFC"/>
     <w:pPr>
       <w:spacing/>
       <w:ind w:left="720"/>
@@ -1495,7 +2724,7 @@
     <w:name w:val="header"/>
     <w:basedOn w:val="Normal"/>
     <w:unhideWhenUsed/>
-    <w:rsid w:val="5DDDC42A"/>
+    <w:rsid w:val="58B6CBFC"/>
     <w:pPr>
       <w:tabs>
         <w:tab w:val="center" w:leader="none" w:pos="4680"/>
@@ -1509,13 +2738,30 @@
     <w:name w:val="footer"/>
     <w:basedOn w:val="Normal"/>
     <w:unhideWhenUsed/>
-    <w:rsid w:val="5DDDC42A"/>
+    <w:rsid w:val="58B6CBFC"/>
     <w:pPr>
       <w:tabs>
         <w:tab w:val="center" w:leader="none" w:pos="4680"/>
         <w:tab w:val="right" w:leader="none" w:pos="9360"/>
       </w:tabs>
       <w:spacing w:after="0" w:line="240" w:lineRule="auto"/>
+    </w:pPr>
+  </w:style>
+  <w:style w:type="paragraph" w:styleId="Title">
+    <w:uiPriority w:val="10"/>
+    <w:name w:val="Title"/>
+    <w:basedOn w:val="Normal"/>
+    <w:next w:val="Normal"/>
+    <w:qFormat/>
+    <w:rsid w:val="58B6CBFC"/>
+    <w:rPr>
+      <w:rFonts w:ascii="Calibri Light" w:hAnsi="Calibri Light" w:eastAsia="" w:cs="" w:asciiTheme="majorAscii" w:hAnsiTheme="majorAscii" w:eastAsiaTheme="majorEastAsia" w:cstheme="majorBidi"/>
+      <w:sz w:val="56"/>
+      <w:szCs w:val="56"/>
+    </w:rPr>
+    <w:pPr>
+      <w:spacing w:after="80" w:line="240" w:lineRule="auto"/>
+      <w:contextualSpacing/>
     </w:pPr>
   </w:style>
   <w:style xmlns:w="http://schemas.openxmlformats.org/wordprocessingml/2006/main" w:type="table" w:styleId="TableGrid">

</xml_diff>